<commit_message>
docs(anchor): add accessibility copy review
</commit_message>
<xml_diff>
--- a/projects/awp/copy/Anchor_Copy_Review_Side_by_Side.docx
+++ b/projects/awp/copy/Anchor_Copy_Review_Side_by_Side.docx
@@ -2517,6 +2517,457 @@
                 <w:color w:val="0F2038"/>
                 <w:sz w:val="21"/>
               </w:rPr>
+              <w:t>Accessibility and interface text</w:t>
+            </w:r>
+          </w:p>
+          <w:p>
+            <w:pPr>
+              <w:spacing w:after="80"/>
+            </w:pPr>
+            <w:r>
+              <w:rPr>
+                <w:rFonts w:ascii="Calibri" w:hAnsi="Calibri"/>
+                <w:color w:val="425B72"/>
+                <w:sz w:val="19"/>
+              </w:rPr>
+              <w:t>IMAGE ALT: Pumpjack operating in a Texas oil field</w:t>
+            </w:r>
+          </w:p>
+          <w:p>
+            <w:pPr>
+              <w:spacing w:after="80"/>
+            </w:pPr>
+            <w:r>
+              <w:rPr>
+                <w:rFonts w:ascii="Calibri" w:hAnsi="Calibri"/>
+                <w:color w:val="425B72"/>
+                <w:sz w:val="19"/>
+              </w:rPr>
+              <w:t>IMAGE ALT: Business owner working calmly at his desk</w:t>
+            </w:r>
+          </w:p>
+          <w:p>
+            <w:pPr>
+              <w:spacing w:after="80"/>
+            </w:pPr>
+            <w:r>
+              <w:rPr>
+                <w:rFonts w:ascii="Calibri" w:hAnsi="Calibri"/>
+                <w:color w:val="425B72"/>
+                <w:sz w:val="19"/>
+              </w:rPr>
+              <w:t>IMAGE ALT: A modern multigenerational family spending time together at home</w:t>
+            </w:r>
+          </w:p>
+          <w:p>
+            <w:pPr>
+              <w:spacing w:after="80"/>
+            </w:pPr>
+            <w:r>
+              <w:rPr>
+                <w:rFonts w:ascii="Calibri" w:hAnsi="Calibri"/>
+                <w:color w:val="425B72"/>
+                <w:sz w:val="19"/>
+              </w:rPr>
+              <w:t>FORM PLACEHOLDER: Email address</w:t>
+            </w:r>
+          </w:p>
+          <w:p>
+            <w:pPr>
+              <w:spacing w:after="80"/>
+            </w:pPr>
+            <w:r>
+              <w:rPr>
+                <w:rFonts w:ascii="Calibri" w:hAnsi="Calibri"/>
+                <w:color w:val="425B72"/>
+                <w:sz w:val="19"/>
+              </w:rPr>
+              <w:t>SCREEN-READER LABEL: Email address</w:t>
+            </w:r>
+          </w:p>
+          <w:p>
+            <w:pPr>
+              <w:spacing w:after="80"/>
+            </w:pPr>
+            <w:r>
+              <w:rPr>
+                <w:rFonts w:ascii="Calibri" w:hAnsi="Calibri"/>
+                <w:color w:val="425B72"/>
+                <w:sz w:val="19"/>
+              </w:rPr>
+              <w:t>INTERFACE LABEL: Primary navigation</w:t>
+            </w:r>
+          </w:p>
+          <w:p>
+            <w:pPr>
+              <w:spacing w:after="80"/>
+            </w:pPr>
+            <w:r>
+              <w:rPr>
+                <w:rFonts w:ascii="Calibri" w:hAnsi="Calibri"/>
+                <w:color w:val="425B72"/>
+                <w:sz w:val="19"/>
+              </w:rPr>
+              <w:t>INTERFACE LABEL: Anchor Wealth Planning home</w:t>
+            </w:r>
+          </w:p>
+          <w:p>
+            <w:pPr>
+              <w:spacing w:after="80"/>
+            </w:pPr>
+            <w:r>
+              <w:rPr>
+                <w:rFonts w:ascii="Calibri" w:hAnsi="Calibri"/>
+                <w:color w:val="425B72"/>
+                <w:sz w:val="19"/>
+              </w:rPr>
+              <w:t>INTERFACE LABEL: Open navigation</w:t>
+            </w:r>
+          </w:p>
+          <w:p>
+            <w:pPr>
+              <w:spacing w:after="80"/>
+            </w:pPr>
+            <w:r>
+              <w:rPr>
+                <w:rFonts w:ascii="Calibri" w:hAnsi="Calibri"/>
+                <w:color w:val="425B72"/>
+                <w:sz w:val="19"/>
+              </w:rPr>
+              <w:t>INTERFACE LABEL: Anchor Wealth Planning introduction</w:t>
+            </w:r>
+          </w:p>
+          <w:p>
+            <w:pPr>
+              <w:spacing w:after="80"/>
+            </w:pPr>
+            <w:r>
+              <w:rPr>
+                <w:rFonts w:ascii="Calibri" w:hAnsi="Calibri"/>
+                <w:color w:val="425B72"/>
+                <w:sz w:val="19"/>
+              </w:rPr>
+              <w:t>INTERFACE LABEL: Oil and gas executives</w:t>
+            </w:r>
+          </w:p>
+          <w:p>
+            <w:pPr>
+              <w:spacing w:after="80"/>
+            </w:pPr>
+            <w:r>
+              <w:rPr>
+                <w:rFonts w:ascii="Calibri" w:hAnsi="Calibri"/>
+                <w:color w:val="425B72"/>
+                <w:sz w:val="19"/>
+              </w:rPr>
+              <w:t>INTERFACE LABEL: Business owners</w:t>
+            </w:r>
+          </w:p>
+          <w:p>
+            <w:pPr>
+              <w:spacing w:after="80"/>
+            </w:pPr>
+            <w:r>
+              <w:rPr>
+                <w:rFonts w:ascii="Calibri" w:hAnsi="Calibri"/>
+                <w:color w:val="425B72"/>
+                <w:sz w:val="19"/>
+              </w:rPr>
+              <w:t>INTERFACE LABEL: High-net-worth families</w:t>
+            </w:r>
+          </w:p>
+          <w:p>
+            <w:pPr>
+              <w:spacing w:after="80"/>
+            </w:pPr>
+            <w:r>
+              <w:rPr>
+                <w:rFonts w:ascii="Calibri" w:hAnsi="Calibri"/>
+                <w:color w:val="425B72"/>
+                <w:sz w:val="19"/>
+              </w:rPr>
+              <w:t>INTERFACE LABEL: Who Anchor serves</w:t>
+            </w:r>
+          </w:p>
+          <w:p>
+            <w:pPr>
+              <w:spacing w:after="80"/>
+            </w:pPr>
+            <w:r>
+              <w:rPr>
+                <w:rFonts w:ascii="Calibri" w:hAnsi="Calibri"/>
+                <w:color w:val="425B72"/>
+                <w:sz w:val="19"/>
+              </w:rPr>
+              <w:t>INTERFACE LABEL: Pause hero rotation</w:t>
+            </w:r>
+          </w:p>
+          <w:p>
+            <w:pPr>
+              <w:spacing w:after="80"/>
+            </w:pPr>
+            <w:r>
+              <w:rPr>
+                <w:rFonts w:ascii="Calibri" w:hAnsi="Calibri"/>
+                <w:color w:val="425B72"/>
+                <w:sz w:val="19"/>
+              </w:rPr>
+              <w:t>INTERFACE LABEL: Play Alex's story preview</w:t>
+            </w:r>
+          </w:p>
+          <w:p>
+            <w:pPr>
+              <w:spacing w:after="80"/>
+            </w:pPr>
+            <w:r>
+              <w:rPr>
+                <w:rFonts w:ascii="Calibri" w:hAnsi="Calibri"/>
+                <w:color w:val="425B72"/>
+                <w:sz w:val="19"/>
+              </w:rPr>
+              <w:t>INTERFACE LABEL: Video carousel controls</w:t>
+            </w:r>
+          </w:p>
+          <w:p>
+            <w:pPr>
+              <w:spacing w:after="80"/>
+            </w:pPr>
+            <w:r>
+              <w:rPr>
+                <w:rFonts w:ascii="Calibri" w:hAnsi="Calibri"/>
+                <w:color w:val="425B72"/>
+                <w:sz w:val="19"/>
+              </w:rPr>
+              <w:t>INTERFACE LABEL: Previous videos</w:t>
+            </w:r>
+          </w:p>
+          <w:p>
+            <w:pPr>
+              <w:spacing w:after="80"/>
+            </w:pPr>
+            <w:r>
+              <w:rPr>
+                <w:rFonts w:ascii="Calibri" w:hAnsi="Calibri"/>
+                <w:color w:val="425B72"/>
+                <w:sz w:val="19"/>
+              </w:rPr>
+              <w:t>INTERFACE LABEL: Next videos</w:t>
+            </w:r>
+          </w:p>
+          <w:p>
+            <w:pPr>
+              <w:spacing w:after="80"/>
+            </w:pPr>
+            <w:r>
+              <w:rPr>
+                <w:rFonts w:ascii="Calibri" w:hAnsi="Calibri"/>
+                <w:color w:val="425B72"/>
+                <w:sz w:val="19"/>
+              </w:rPr>
+              <w:t>INTERFACE LABEL: Play or pause Oil and Gas preview</w:t>
+            </w:r>
+          </w:p>
+          <w:p>
+            <w:pPr>
+              <w:spacing w:after="80"/>
+            </w:pPr>
+            <w:r>
+              <w:rPr>
+                <w:rFonts w:ascii="Calibri" w:hAnsi="Calibri"/>
+                <w:color w:val="425B72"/>
+                <w:sz w:val="19"/>
+              </w:rPr>
+              <w:t>INTERFACE LABEL: Play or pause Business Owners preview</w:t>
+            </w:r>
+          </w:p>
+          <w:p>
+            <w:pPr>
+              <w:spacing w:after="80"/>
+            </w:pPr>
+            <w:r>
+              <w:rPr>
+                <w:rFonts w:ascii="Calibri" w:hAnsi="Calibri"/>
+                <w:color w:val="425B72"/>
+                <w:sz w:val="19"/>
+              </w:rPr>
+              <w:t>INTERFACE LABEL: Play or pause Families preview</w:t>
+            </w:r>
+          </w:p>
+          <w:p>
+            <w:pPr>
+              <w:spacing w:after="80"/>
+            </w:pPr>
+            <w:r>
+              <w:rPr>
+                <w:rFonts w:ascii="Calibri" w:hAnsi="Calibri"/>
+                <w:color w:val="425B72"/>
+                <w:sz w:val="19"/>
+              </w:rPr>
+              <w:t>INTERFACE LABEL: Play or pause Concentrated Wealth preview</w:t>
+            </w:r>
+          </w:p>
+          <w:p>
+            <w:pPr>
+              <w:spacing w:after="80"/>
+            </w:pPr>
+            <w:r>
+              <w:rPr>
+                <w:rFonts w:ascii="Calibri" w:hAnsi="Calibri"/>
+                <w:color w:val="425B72"/>
+                <w:sz w:val="19"/>
+              </w:rPr>
+              <w:t>INTERFACE LABEL: Play or pause Estate and Legacy preview</w:t>
+            </w:r>
+          </w:p>
+        </w:tc>
+        <w:tc>
+          <w:tcPr>
+            <w:tcW w:type="dxa" w:w="6986"/>
+            <w:shd w:fill="FFF9ED"/>
+          </w:tcPr>
+          <w:p>
+            <w:pPr>
+              <w:spacing w:after="60"/>
+            </w:pPr>
+            <w:r/>
+          </w:p>
+          <w:p>
+            <w:pPr>
+              <w:spacing w:before="0" w:after="80"/>
+            </w:pPr>
+            <w:r>
+              <w:rPr>
+                <w:rFonts w:ascii="Calibri" w:hAnsi="Calibri"/>
+                <w:b/>
+                <w:color w:val="2D5474"/>
+                <w:sz w:val="15"/>
+              </w:rPr>
+              <w:t>DECISION</w:t>
+            </w:r>
+          </w:p>
+          <w:p>
+            <w:pPr>
+              <w:spacing w:after="100"/>
+            </w:pPr>
+            <w:r>
+              <w:rPr>
+                <w:rFonts w:ascii="Calibri" w:hAnsi="Calibri"/>
+                <w:b/>
+                <w:color w:val="0F2038"/>
+                <w:sz w:val="19"/>
+              </w:rPr>
+              <w:t>Keep  /  Edit  /  Replace</w:t>
+            </w:r>
+          </w:p>
+          <w:p>
+            <w:pPr>
+              <w:spacing w:after="160"/>
+            </w:pPr>
+            <w:r>
+              <w:rPr>
+                <w:rFonts w:ascii="Calibri" w:hAnsi="Calibri"/>
+                <w:i/>
+                <w:color w:val="425B72"/>
+                <w:sz w:val="17"/>
+              </w:rPr>
+              <w:t>Confirm image descriptions and page-specific labels; standard navigation/control labels can remain unless inaccurate.</w:t>
+            </w:r>
+          </w:p>
+          <w:p>
+            <w:pPr>
+              <w:spacing w:after="80"/>
+            </w:pPr>
+            <w:r>
+              <w:rPr>
+                <w:rFonts w:ascii="Calibri" w:hAnsi="Calibri"/>
+                <w:b/>
+                <w:color w:val="2D5474"/>
+                <w:sz w:val="17"/>
+              </w:rPr>
+              <w:t>Alex's replacement copy or notes:</w:t>
+            </w:r>
+          </w:p>
+          <w:p>
+            <w:pPr>
+              <w:spacing w:after="180"/>
+            </w:pPr>
+            <w:r>
+              <w:rPr>
+                <w:rFonts w:ascii="Calibri" w:hAnsi="Calibri"/>
+                <w:color w:val="425B72"/>
+                <w:sz w:val="19"/>
+              </w:rPr>
+              <w:t xml:space="preserve"> </w:t>
+            </w:r>
+          </w:p>
+          <w:p>
+            <w:pPr>
+              <w:spacing w:after="180"/>
+            </w:pPr>
+            <w:r>
+              <w:rPr>
+                <w:rFonts w:ascii="Calibri" w:hAnsi="Calibri"/>
+                <w:color w:val="425B72"/>
+                <w:sz w:val="19"/>
+              </w:rPr>
+              <w:t xml:space="preserve"> </w:t>
+            </w:r>
+          </w:p>
+          <w:p>
+            <w:pPr>
+              <w:spacing w:after="180"/>
+            </w:pPr>
+            <w:r>
+              <w:rPr>
+                <w:rFonts w:ascii="Calibri" w:hAnsi="Calibri"/>
+                <w:color w:val="425B72"/>
+                <w:sz w:val="19"/>
+              </w:rPr>
+              <w:t xml:space="preserve"> </w:t>
+            </w:r>
+          </w:p>
+        </w:tc>
+      </w:tr>
+      <w:tr>
+        <w:trPr>
+          <w:cantSplit w:val="true"/>
+        </w:trPr>
+        <w:tc>
+          <w:tcPr>
+            <w:tcW w:type="dxa" w:w="6986"/>
+            <w:shd w:fill="FFFFFF"/>
+          </w:tcPr>
+          <w:p>
+            <w:pPr>
+              <w:spacing w:after="60"/>
+            </w:pPr>
+            <w:r/>
+          </w:p>
+          <w:p>
+            <w:pPr>
+              <w:spacing w:before="0" w:after="80"/>
+            </w:pPr>
+            <w:r>
+              <w:rPr>
+                <w:rFonts w:ascii="Calibri" w:hAnsi="Calibri"/>
+                <w:b/>
+                <w:color w:val="B18F4D"/>
+                <w:sz w:val="15"/>
+              </w:rPr>
+              <w:t>SECTION / COPY BLOCK</w:t>
+            </w:r>
+          </w:p>
+          <w:p>
+            <w:pPr>
+              <w:spacing w:after="100"/>
+            </w:pPr>
+            <w:r>
+              <w:rPr>
+                <w:rFonts w:ascii="Calibri" w:hAnsi="Calibri"/>
+                <w:b/>
+                <w:color w:val="0F2038"/>
+                <w:sz w:val="21"/>
+              </w:rPr>
               <w:t>Hero positioning label</w:t>
             </w:r>
           </w:p>
@@ -13322,6 +13773,171 @@
                 <w:color w:val="0F2038"/>
                 <w:sz w:val="21"/>
               </w:rPr>
+              <w:t>Accessibility and interface text</w:t>
+            </w:r>
+          </w:p>
+          <w:p>
+            <w:pPr>
+              <w:spacing w:after="80"/>
+            </w:pPr>
+            <w:r>
+              <w:rPr>
+                <w:rFonts w:ascii="Calibri" w:hAnsi="Calibri"/>
+                <w:color w:val="425B72"/>
+                <w:sz w:val="19"/>
+              </w:rPr>
+              <w:t>INTERFACE LABEL: Toggle navigation</w:t>
+            </w:r>
+          </w:p>
+        </w:tc>
+        <w:tc>
+          <w:tcPr>
+            <w:tcW w:type="dxa" w:w="6986"/>
+            <w:shd w:fill="FFF9ED"/>
+          </w:tcPr>
+          <w:p>
+            <w:pPr>
+              <w:spacing w:after="60"/>
+            </w:pPr>
+            <w:r/>
+          </w:p>
+          <w:p>
+            <w:pPr>
+              <w:spacing w:before="0" w:after="80"/>
+            </w:pPr>
+            <w:r>
+              <w:rPr>
+                <w:rFonts w:ascii="Calibri" w:hAnsi="Calibri"/>
+                <w:b/>
+                <w:color w:val="2D5474"/>
+                <w:sz w:val="15"/>
+              </w:rPr>
+              <w:t>DECISION</w:t>
+            </w:r>
+          </w:p>
+          <w:p>
+            <w:pPr>
+              <w:spacing w:after="100"/>
+            </w:pPr>
+            <w:r>
+              <w:rPr>
+                <w:rFonts w:ascii="Calibri" w:hAnsi="Calibri"/>
+                <w:b/>
+                <w:color w:val="0F2038"/>
+                <w:sz w:val="19"/>
+              </w:rPr>
+              <w:t>Keep  /  Edit  /  Replace</w:t>
+            </w:r>
+          </w:p>
+          <w:p>
+            <w:pPr>
+              <w:spacing w:after="160"/>
+            </w:pPr>
+            <w:r>
+              <w:rPr>
+                <w:rFonts w:ascii="Calibri" w:hAnsi="Calibri"/>
+                <w:i/>
+                <w:color w:val="425B72"/>
+                <w:sz w:val="17"/>
+              </w:rPr>
+              <w:t>Confirm image descriptions and page-specific labels; standard navigation/control labels can remain unless inaccurate.</w:t>
+            </w:r>
+          </w:p>
+          <w:p>
+            <w:pPr>
+              <w:spacing w:after="80"/>
+            </w:pPr>
+            <w:r>
+              <w:rPr>
+                <w:rFonts w:ascii="Calibri" w:hAnsi="Calibri"/>
+                <w:b/>
+                <w:color w:val="2D5474"/>
+                <w:sz w:val="17"/>
+              </w:rPr>
+              <w:t>Alex's replacement copy or notes:</w:t>
+            </w:r>
+          </w:p>
+          <w:p>
+            <w:pPr>
+              <w:spacing w:after="180"/>
+            </w:pPr>
+            <w:r>
+              <w:rPr>
+                <w:rFonts w:ascii="Calibri" w:hAnsi="Calibri"/>
+                <w:color w:val="425B72"/>
+                <w:sz w:val="19"/>
+              </w:rPr>
+              <w:t xml:space="preserve"> </w:t>
+            </w:r>
+          </w:p>
+          <w:p>
+            <w:pPr>
+              <w:spacing w:after="180"/>
+            </w:pPr>
+            <w:r>
+              <w:rPr>
+                <w:rFonts w:ascii="Calibri" w:hAnsi="Calibri"/>
+                <w:color w:val="425B72"/>
+                <w:sz w:val="19"/>
+              </w:rPr>
+              <w:t xml:space="preserve"> </w:t>
+            </w:r>
+          </w:p>
+          <w:p>
+            <w:pPr>
+              <w:spacing w:after="180"/>
+            </w:pPr>
+            <w:r>
+              <w:rPr>
+                <w:rFonts w:ascii="Calibri" w:hAnsi="Calibri"/>
+                <w:color w:val="425B72"/>
+                <w:sz w:val="19"/>
+              </w:rPr>
+              <w:t xml:space="preserve"> </w:t>
+            </w:r>
+          </w:p>
+        </w:tc>
+      </w:tr>
+      <w:tr>
+        <w:trPr>
+          <w:cantSplit w:val="true"/>
+        </w:trPr>
+        <w:tc>
+          <w:tcPr>
+            <w:tcW w:type="dxa" w:w="6986"/>
+            <w:shd w:fill="FFFFFF"/>
+          </w:tcPr>
+          <w:p>
+            <w:pPr>
+              <w:spacing w:after="60"/>
+            </w:pPr>
+            <w:r/>
+          </w:p>
+          <w:p>
+            <w:pPr>
+              <w:spacing w:before="0" w:after="80"/>
+            </w:pPr>
+            <w:r>
+              <w:rPr>
+                <w:rFonts w:ascii="Calibri" w:hAnsi="Calibri"/>
+                <w:b/>
+                <w:color w:val="B18F4D"/>
+                <w:sz w:val="15"/>
+              </w:rPr>
+              <w:t>SECTION / COPY BLOCK</w:t>
+            </w:r>
+          </w:p>
+          <w:p>
+            <w:pPr>
+              <w:spacing w:after="100"/>
+            </w:pPr>
+            <w:r>
+              <w:rPr>
+                <w:rFonts w:ascii="Calibri" w:hAnsi="Calibri"/>
+                <w:b/>
+                <w:color w:val="0F2038"/>
+                <w:sz w:val="21"/>
+              </w:rPr>
               <w:t>One plan. One accountable lead.</w:t>
             </w:r>
           </w:p>
@@ -15527,6 +16143,197 @@
                 <w:color w:val="0F2038"/>
                 <w:sz w:val="21"/>
               </w:rPr>
+              <w:t>Accessibility and interface text</w:t>
+            </w:r>
+          </w:p>
+          <w:p>
+            <w:pPr>
+              <w:spacing w:after="80"/>
+            </w:pPr>
+            <w:r>
+              <w:rPr>
+                <w:rFonts w:ascii="Calibri" w:hAnsi="Calibri"/>
+                <w:color w:val="425B72"/>
+                <w:sz w:val="19"/>
+              </w:rPr>
+              <w:t>INTERFACE LABEL: Toggle navigation</w:t>
+            </w:r>
+          </w:p>
+          <w:p>
+            <w:pPr>
+              <w:spacing w:after="80"/>
+            </w:pPr>
+            <w:r>
+              <w:rPr>
+                <w:rFonts w:ascii="Calibri" w:hAnsi="Calibri"/>
+                <w:color w:val="425B72"/>
+                <w:sz w:val="19"/>
+              </w:rPr>
+              <w:t>INTERFACE LABEL: Alex Miller portrait placeholder</w:t>
+            </w:r>
+          </w:p>
+          <w:p>
+            <w:pPr>
+              <w:spacing w:after="80"/>
+            </w:pPr>
+            <w:r>
+              <w:rPr>
+                <w:rFonts w:ascii="Calibri" w:hAnsi="Calibri"/>
+                <w:color w:val="425B72"/>
+                <w:sz w:val="19"/>
+              </w:rPr>
+              <w:t>INTERFACE LABEL: Future team portrait placeholder</w:t>
+            </w:r>
+          </w:p>
+        </w:tc>
+        <w:tc>
+          <w:tcPr>
+            <w:tcW w:type="dxa" w:w="6986"/>
+            <w:shd w:fill="FFF9ED"/>
+          </w:tcPr>
+          <w:p>
+            <w:pPr>
+              <w:spacing w:after="60"/>
+            </w:pPr>
+            <w:r/>
+          </w:p>
+          <w:p>
+            <w:pPr>
+              <w:spacing w:before="0" w:after="80"/>
+            </w:pPr>
+            <w:r>
+              <w:rPr>
+                <w:rFonts w:ascii="Calibri" w:hAnsi="Calibri"/>
+                <w:b/>
+                <w:color w:val="2D5474"/>
+                <w:sz w:val="15"/>
+              </w:rPr>
+              <w:t>DECISION</w:t>
+            </w:r>
+          </w:p>
+          <w:p>
+            <w:pPr>
+              <w:spacing w:after="100"/>
+            </w:pPr>
+            <w:r>
+              <w:rPr>
+                <w:rFonts w:ascii="Calibri" w:hAnsi="Calibri"/>
+                <w:b/>
+                <w:color w:val="0F2038"/>
+                <w:sz w:val="19"/>
+              </w:rPr>
+              <w:t>Keep  /  Edit  /  Replace</w:t>
+            </w:r>
+          </w:p>
+          <w:p>
+            <w:pPr>
+              <w:spacing w:after="160"/>
+            </w:pPr>
+            <w:r>
+              <w:rPr>
+                <w:rFonts w:ascii="Calibri" w:hAnsi="Calibri"/>
+                <w:i/>
+                <w:color w:val="425B72"/>
+                <w:sz w:val="17"/>
+              </w:rPr>
+              <w:t>Confirm image descriptions and page-specific labels; standard navigation/control labels can remain unless inaccurate.</w:t>
+            </w:r>
+          </w:p>
+          <w:p>
+            <w:pPr>
+              <w:spacing w:after="80"/>
+            </w:pPr>
+            <w:r>
+              <w:rPr>
+                <w:rFonts w:ascii="Calibri" w:hAnsi="Calibri"/>
+                <w:b/>
+                <w:color w:val="2D5474"/>
+                <w:sz w:val="17"/>
+              </w:rPr>
+              <w:t>Alex's replacement copy or notes:</w:t>
+            </w:r>
+          </w:p>
+          <w:p>
+            <w:pPr>
+              <w:spacing w:after="180"/>
+            </w:pPr>
+            <w:r>
+              <w:rPr>
+                <w:rFonts w:ascii="Calibri" w:hAnsi="Calibri"/>
+                <w:color w:val="425B72"/>
+                <w:sz w:val="19"/>
+              </w:rPr>
+              <w:t xml:space="preserve"> </w:t>
+            </w:r>
+          </w:p>
+          <w:p>
+            <w:pPr>
+              <w:spacing w:after="180"/>
+            </w:pPr>
+            <w:r>
+              <w:rPr>
+                <w:rFonts w:ascii="Calibri" w:hAnsi="Calibri"/>
+                <w:color w:val="425B72"/>
+                <w:sz w:val="19"/>
+              </w:rPr>
+              <w:t xml:space="preserve"> </w:t>
+            </w:r>
+          </w:p>
+          <w:p>
+            <w:pPr>
+              <w:spacing w:after="180"/>
+            </w:pPr>
+            <w:r>
+              <w:rPr>
+                <w:rFonts w:ascii="Calibri" w:hAnsi="Calibri"/>
+                <w:color w:val="425B72"/>
+                <w:sz w:val="19"/>
+              </w:rPr>
+              <w:t xml:space="preserve"> </w:t>
+            </w:r>
+          </w:p>
+        </w:tc>
+      </w:tr>
+      <w:tr>
+        <w:trPr>
+          <w:cantSplit w:val="true"/>
+        </w:trPr>
+        <w:tc>
+          <w:tcPr>
+            <w:tcW w:type="dxa" w:w="6986"/>
+            <w:shd w:fill="FFFFFF"/>
+          </w:tcPr>
+          <w:p>
+            <w:pPr>
+              <w:spacing w:after="60"/>
+            </w:pPr>
+            <w:r/>
+          </w:p>
+          <w:p>
+            <w:pPr>
+              <w:spacing w:before="0" w:after="80"/>
+            </w:pPr>
+            <w:r>
+              <w:rPr>
+                <w:rFonts w:ascii="Calibri" w:hAnsi="Calibri"/>
+                <w:b/>
+                <w:color w:val="B18F4D"/>
+                <w:sz w:val="15"/>
+              </w:rPr>
+              <w:t>SECTION / COPY BLOCK</w:t>
+            </w:r>
+          </w:p>
+          <w:p>
+            <w:pPr>
+              <w:spacing w:after="100"/>
+            </w:pPr>
+            <w:r>
+              <w:rPr>
+                <w:rFonts w:ascii="Calibri" w:hAnsi="Calibri"/>
+                <w:b/>
+                <w:color w:val="0F2038"/>
+                <w:sz w:val="21"/>
+              </w:rPr>
               <w:t>People who own the next step.</w:t>
             </w:r>
           </w:p>
@@ -16955,6 +17762,171 @@
                 <w:color w:val="0F2038"/>
                 <w:sz w:val="21"/>
               </w:rPr>
+              <w:t>Accessibility and interface text</w:t>
+            </w:r>
+          </w:p>
+          <w:p>
+            <w:pPr>
+              <w:spacing w:after="80"/>
+            </w:pPr>
+            <w:r>
+              <w:rPr>
+                <w:rFonts w:ascii="Calibri" w:hAnsi="Calibri"/>
+                <w:color w:val="425B72"/>
+                <w:sz w:val="19"/>
+              </w:rPr>
+              <w:t>INTERFACE LABEL: Toggle navigation</w:t>
+            </w:r>
+          </w:p>
+        </w:tc>
+        <w:tc>
+          <w:tcPr>
+            <w:tcW w:type="dxa" w:w="6986"/>
+            <w:shd w:fill="FFF9ED"/>
+          </w:tcPr>
+          <w:p>
+            <w:pPr>
+              <w:spacing w:after="60"/>
+            </w:pPr>
+            <w:r/>
+          </w:p>
+          <w:p>
+            <w:pPr>
+              <w:spacing w:before="0" w:after="80"/>
+            </w:pPr>
+            <w:r>
+              <w:rPr>
+                <w:rFonts w:ascii="Calibri" w:hAnsi="Calibri"/>
+                <w:b/>
+                <w:color w:val="2D5474"/>
+                <w:sz w:val="15"/>
+              </w:rPr>
+              <w:t>DECISION</w:t>
+            </w:r>
+          </w:p>
+          <w:p>
+            <w:pPr>
+              <w:spacing w:after="100"/>
+            </w:pPr>
+            <w:r>
+              <w:rPr>
+                <w:rFonts w:ascii="Calibri" w:hAnsi="Calibri"/>
+                <w:b/>
+                <w:color w:val="0F2038"/>
+                <w:sz w:val="19"/>
+              </w:rPr>
+              <w:t>Keep  /  Edit  /  Replace</w:t>
+            </w:r>
+          </w:p>
+          <w:p>
+            <w:pPr>
+              <w:spacing w:after="160"/>
+            </w:pPr>
+            <w:r>
+              <w:rPr>
+                <w:rFonts w:ascii="Calibri" w:hAnsi="Calibri"/>
+                <w:i/>
+                <w:color w:val="425B72"/>
+                <w:sz w:val="17"/>
+              </w:rPr>
+              <w:t>Confirm image descriptions and page-specific labels; standard navigation/control labels can remain unless inaccurate.</w:t>
+            </w:r>
+          </w:p>
+          <w:p>
+            <w:pPr>
+              <w:spacing w:after="80"/>
+            </w:pPr>
+            <w:r>
+              <w:rPr>
+                <w:rFonts w:ascii="Calibri" w:hAnsi="Calibri"/>
+                <w:b/>
+                <w:color w:val="2D5474"/>
+                <w:sz w:val="17"/>
+              </w:rPr>
+              <w:t>Alex's replacement copy or notes:</w:t>
+            </w:r>
+          </w:p>
+          <w:p>
+            <w:pPr>
+              <w:spacing w:after="180"/>
+            </w:pPr>
+            <w:r>
+              <w:rPr>
+                <w:rFonts w:ascii="Calibri" w:hAnsi="Calibri"/>
+                <w:color w:val="425B72"/>
+                <w:sz w:val="19"/>
+              </w:rPr>
+              <w:t xml:space="preserve"> </w:t>
+            </w:r>
+          </w:p>
+          <w:p>
+            <w:pPr>
+              <w:spacing w:after="180"/>
+            </w:pPr>
+            <w:r>
+              <w:rPr>
+                <w:rFonts w:ascii="Calibri" w:hAnsi="Calibri"/>
+                <w:color w:val="425B72"/>
+                <w:sz w:val="19"/>
+              </w:rPr>
+              <w:t xml:space="preserve"> </w:t>
+            </w:r>
+          </w:p>
+          <w:p>
+            <w:pPr>
+              <w:spacing w:after="180"/>
+            </w:pPr>
+            <w:r>
+              <w:rPr>
+                <w:rFonts w:ascii="Calibri" w:hAnsi="Calibri"/>
+                <w:color w:val="425B72"/>
+                <w:sz w:val="19"/>
+              </w:rPr>
+              <w:t xml:space="preserve"> </w:t>
+            </w:r>
+          </w:p>
+        </w:tc>
+      </w:tr>
+      <w:tr>
+        <w:trPr>
+          <w:cantSplit w:val="true"/>
+        </w:trPr>
+        <w:tc>
+          <w:tcPr>
+            <w:tcW w:type="dxa" w:w="6986"/>
+            <w:shd w:fill="FFFFFF"/>
+          </w:tcPr>
+          <w:p>
+            <w:pPr>
+              <w:spacing w:after="60"/>
+            </w:pPr>
+            <w:r/>
+          </w:p>
+          <w:p>
+            <w:pPr>
+              <w:spacing w:before="0" w:after="80"/>
+            </w:pPr>
+            <w:r>
+              <w:rPr>
+                <w:rFonts w:ascii="Calibri" w:hAnsi="Calibri"/>
+                <w:b/>
+                <w:color w:val="B18F4D"/>
+                <w:sz w:val="15"/>
+              </w:rPr>
+              <w:t>SECTION / COPY BLOCK</w:t>
+            </w:r>
+          </w:p>
+          <w:p>
+            <w:pPr>
+              <w:spacing w:after="100"/>
+            </w:pPr>
+            <w:r>
+              <w:rPr>
+                <w:rFonts w:ascii="Calibri" w:hAnsi="Calibri"/>
+                <w:b/>
+                <w:color w:val="0F2038"/>
+                <w:sz w:val="21"/>
+              </w:rPr>
               <w:t>Your compensation moves with the cycle.</w:t>
             </w:r>
           </w:p>
@@ -18496,6 +19468,171 @@
                 <w:color w:val="0F2038"/>
                 <w:sz w:val="21"/>
               </w:rPr>
+              <w:t>Accessibility and interface text</w:t>
+            </w:r>
+          </w:p>
+          <w:p>
+            <w:pPr>
+              <w:spacing w:after="80"/>
+            </w:pPr>
+            <w:r>
+              <w:rPr>
+                <w:rFonts w:ascii="Calibri" w:hAnsi="Calibri"/>
+                <w:color w:val="425B72"/>
+                <w:sz w:val="19"/>
+              </w:rPr>
+              <w:t>INTERFACE LABEL: Toggle navigation</w:t>
+            </w:r>
+          </w:p>
+        </w:tc>
+        <w:tc>
+          <w:tcPr>
+            <w:tcW w:type="dxa" w:w="6986"/>
+            <w:shd w:fill="FFF9ED"/>
+          </w:tcPr>
+          <w:p>
+            <w:pPr>
+              <w:spacing w:after="60"/>
+            </w:pPr>
+            <w:r/>
+          </w:p>
+          <w:p>
+            <w:pPr>
+              <w:spacing w:before="0" w:after="80"/>
+            </w:pPr>
+            <w:r>
+              <w:rPr>
+                <w:rFonts w:ascii="Calibri" w:hAnsi="Calibri"/>
+                <w:b/>
+                <w:color w:val="2D5474"/>
+                <w:sz w:val="15"/>
+              </w:rPr>
+              <w:t>DECISION</w:t>
+            </w:r>
+          </w:p>
+          <w:p>
+            <w:pPr>
+              <w:spacing w:after="100"/>
+            </w:pPr>
+            <w:r>
+              <w:rPr>
+                <w:rFonts w:ascii="Calibri" w:hAnsi="Calibri"/>
+                <w:b/>
+                <w:color w:val="0F2038"/>
+                <w:sz w:val="19"/>
+              </w:rPr>
+              <w:t>Keep  /  Edit  /  Replace</w:t>
+            </w:r>
+          </w:p>
+          <w:p>
+            <w:pPr>
+              <w:spacing w:after="160"/>
+            </w:pPr>
+            <w:r>
+              <w:rPr>
+                <w:rFonts w:ascii="Calibri" w:hAnsi="Calibri"/>
+                <w:i/>
+                <w:color w:val="425B72"/>
+                <w:sz w:val="17"/>
+              </w:rPr>
+              <w:t>Confirm image descriptions and page-specific labels; standard navigation/control labels can remain unless inaccurate.</w:t>
+            </w:r>
+          </w:p>
+          <w:p>
+            <w:pPr>
+              <w:spacing w:after="80"/>
+            </w:pPr>
+            <w:r>
+              <w:rPr>
+                <w:rFonts w:ascii="Calibri" w:hAnsi="Calibri"/>
+                <w:b/>
+                <w:color w:val="2D5474"/>
+                <w:sz w:val="17"/>
+              </w:rPr>
+              <w:t>Alex's replacement copy or notes:</w:t>
+            </w:r>
+          </w:p>
+          <w:p>
+            <w:pPr>
+              <w:spacing w:after="180"/>
+            </w:pPr>
+            <w:r>
+              <w:rPr>
+                <w:rFonts w:ascii="Calibri" w:hAnsi="Calibri"/>
+                <w:color w:val="425B72"/>
+                <w:sz w:val="19"/>
+              </w:rPr>
+              <w:t xml:space="preserve"> </w:t>
+            </w:r>
+          </w:p>
+          <w:p>
+            <w:pPr>
+              <w:spacing w:after="180"/>
+            </w:pPr>
+            <w:r>
+              <w:rPr>
+                <w:rFonts w:ascii="Calibri" w:hAnsi="Calibri"/>
+                <w:color w:val="425B72"/>
+                <w:sz w:val="19"/>
+              </w:rPr>
+              <w:t xml:space="preserve"> </w:t>
+            </w:r>
+          </w:p>
+          <w:p>
+            <w:pPr>
+              <w:spacing w:after="180"/>
+            </w:pPr>
+            <w:r>
+              <w:rPr>
+                <w:rFonts w:ascii="Calibri" w:hAnsi="Calibri"/>
+                <w:color w:val="425B72"/>
+                <w:sz w:val="19"/>
+              </w:rPr>
+              <w:t xml:space="preserve"> </w:t>
+            </w:r>
+          </w:p>
+        </w:tc>
+      </w:tr>
+      <w:tr>
+        <w:trPr>
+          <w:cantSplit w:val="true"/>
+        </w:trPr>
+        <w:tc>
+          <w:tcPr>
+            <w:tcW w:type="dxa" w:w="6986"/>
+            <w:shd w:fill="FFFFFF"/>
+          </w:tcPr>
+          <w:p>
+            <w:pPr>
+              <w:spacing w:after="60"/>
+            </w:pPr>
+            <w:r/>
+          </w:p>
+          <w:p>
+            <w:pPr>
+              <w:spacing w:before="0" w:after="80"/>
+            </w:pPr>
+            <w:r>
+              <w:rPr>
+                <w:rFonts w:ascii="Calibri" w:hAnsi="Calibri"/>
+                <w:b/>
+                <w:color w:val="B18F4D"/>
+                <w:sz w:val="15"/>
+              </w:rPr>
+              <w:t>SECTION / COPY BLOCK</w:t>
+            </w:r>
+          </w:p>
+          <w:p>
+            <w:pPr>
+              <w:spacing w:after="100"/>
+            </w:pPr>
+            <w:r>
+              <w:rPr>
+                <w:rFonts w:ascii="Calibri" w:hAnsi="Calibri"/>
+                <w:b/>
+                <w:color w:val="0F2038"/>
+                <w:sz w:val="21"/>
+              </w:rPr>
               <w:t>The exit conversation starts before the offer.</w:t>
             </w:r>
           </w:p>
@@ -20037,6 +21174,171 @@
                 <w:color w:val="0F2038"/>
                 <w:sz w:val="21"/>
               </w:rPr>
+              <w:t>Accessibility and interface text</w:t>
+            </w:r>
+          </w:p>
+          <w:p>
+            <w:pPr>
+              <w:spacing w:after="80"/>
+            </w:pPr>
+            <w:r>
+              <w:rPr>
+                <w:rFonts w:ascii="Calibri" w:hAnsi="Calibri"/>
+                <w:color w:val="425B72"/>
+                <w:sz w:val="19"/>
+              </w:rPr>
+              <w:t>INTERFACE LABEL: Toggle navigation</w:t>
+            </w:r>
+          </w:p>
+        </w:tc>
+        <w:tc>
+          <w:tcPr>
+            <w:tcW w:type="dxa" w:w="6986"/>
+            <w:shd w:fill="FFF9ED"/>
+          </w:tcPr>
+          <w:p>
+            <w:pPr>
+              <w:spacing w:after="60"/>
+            </w:pPr>
+            <w:r/>
+          </w:p>
+          <w:p>
+            <w:pPr>
+              <w:spacing w:before="0" w:after="80"/>
+            </w:pPr>
+            <w:r>
+              <w:rPr>
+                <w:rFonts w:ascii="Calibri" w:hAnsi="Calibri"/>
+                <w:b/>
+                <w:color w:val="2D5474"/>
+                <w:sz w:val="15"/>
+              </w:rPr>
+              <w:t>DECISION</w:t>
+            </w:r>
+          </w:p>
+          <w:p>
+            <w:pPr>
+              <w:spacing w:after="100"/>
+            </w:pPr>
+            <w:r>
+              <w:rPr>
+                <w:rFonts w:ascii="Calibri" w:hAnsi="Calibri"/>
+                <w:b/>
+                <w:color w:val="0F2038"/>
+                <w:sz w:val="19"/>
+              </w:rPr>
+              <w:t>Keep  /  Edit  /  Replace</w:t>
+            </w:r>
+          </w:p>
+          <w:p>
+            <w:pPr>
+              <w:spacing w:after="160"/>
+            </w:pPr>
+            <w:r>
+              <w:rPr>
+                <w:rFonts w:ascii="Calibri" w:hAnsi="Calibri"/>
+                <w:i/>
+                <w:color w:val="425B72"/>
+                <w:sz w:val="17"/>
+              </w:rPr>
+              <w:t>Confirm image descriptions and page-specific labels; standard navigation/control labels can remain unless inaccurate.</w:t>
+            </w:r>
+          </w:p>
+          <w:p>
+            <w:pPr>
+              <w:spacing w:after="80"/>
+            </w:pPr>
+            <w:r>
+              <w:rPr>
+                <w:rFonts w:ascii="Calibri" w:hAnsi="Calibri"/>
+                <w:b/>
+                <w:color w:val="2D5474"/>
+                <w:sz w:val="17"/>
+              </w:rPr>
+              <w:t>Alex's replacement copy or notes:</w:t>
+            </w:r>
+          </w:p>
+          <w:p>
+            <w:pPr>
+              <w:spacing w:after="180"/>
+            </w:pPr>
+            <w:r>
+              <w:rPr>
+                <w:rFonts w:ascii="Calibri" w:hAnsi="Calibri"/>
+                <w:color w:val="425B72"/>
+                <w:sz w:val="19"/>
+              </w:rPr>
+              <w:t xml:space="preserve"> </w:t>
+            </w:r>
+          </w:p>
+          <w:p>
+            <w:pPr>
+              <w:spacing w:after="180"/>
+            </w:pPr>
+            <w:r>
+              <w:rPr>
+                <w:rFonts w:ascii="Calibri" w:hAnsi="Calibri"/>
+                <w:color w:val="425B72"/>
+                <w:sz w:val="19"/>
+              </w:rPr>
+              <w:t xml:space="preserve"> </w:t>
+            </w:r>
+          </w:p>
+          <w:p>
+            <w:pPr>
+              <w:spacing w:after="180"/>
+            </w:pPr>
+            <w:r>
+              <w:rPr>
+                <w:rFonts w:ascii="Calibri" w:hAnsi="Calibri"/>
+                <w:color w:val="425B72"/>
+                <w:sz w:val="19"/>
+              </w:rPr>
+              <w:t xml:space="preserve"> </w:t>
+            </w:r>
+          </w:p>
+        </w:tc>
+      </w:tr>
+      <w:tr>
+        <w:trPr>
+          <w:cantSplit w:val="true"/>
+        </w:trPr>
+        <w:tc>
+          <w:tcPr>
+            <w:tcW w:type="dxa" w:w="6986"/>
+            <w:shd w:fill="FFFFFF"/>
+          </w:tcPr>
+          <w:p>
+            <w:pPr>
+              <w:spacing w:after="60"/>
+            </w:pPr>
+            <w:r/>
+          </w:p>
+          <w:p>
+            <w:pPr>
+              <w:spacing w:before="0" w:after="80"/>
+            </w:pPr>
+            <w:r>
+              <w:rPr>
+                <w:rFonts w:ascii="Calibri" w:hAnsi="Calibri"/>
+                <w:b/>
+                <w:color w:val="B18F4D"/>
+                <w:sz w:val="15"/>
+              </w:rPr>
+              <w:t>SECTION / COPY BLOCK</w:t>
+            </w:r>
+          </w:p>
+          <w:p>
+            <w:pPr>
+              <w:spacing w:after="100"/>
+            </w:pPr>
+            <w:r>
+              <w:rPr>
+                <w:rFonts w:ascii="Calibri" w:hAnsi="Calibri"/>
+                <w:b/>
+                <w:color w:val="0F2038"/>
+                <w:sz w:val="21"/>
+              </w:rPr>
               <w:t>Keep the plan current across generations.</w:t>
             </w:r>
           </w:p>
@@ -21639,6 +22941,262 @@
                 <w:color w:val="0F2038"/>
                 <w:sz w:val="21"/>
               </w:rPr>
+              <w:t>Accessibility and interface text</w:t>
+            </w:r>
+          </w:p>
+          <w:p>
+            <w:pPr>
+              <w:spacing w:after="80"/>
+            </w:pPr>
+            <w:r>
+              <w:rPr>
+                <w:rFonts w:ascii="Calibri" w:hAnsi="Calibri"/>
+                <w:color w:val="425B72"/>
+                <w:sz w:val="19"/>
+              </w:rPr>
+              <w:t>IMAGE ALT: An illustrated planning map aligning an RSU vest with tax, trading, and personal planning timelines</w:t>
+            </w:r>
+          </w:p>
+          <w:p>
+            <w:pPr>
+              <w:spacing w:after="80"/>
+            </w:pPr>
+            <w:r>
+              <w:rPr>
+                <w:rFonts w:ascii="Calibri" w:hAnsi="Calibri"/>
+                <w:color w:val="425B72"/>
+                <w:sz w:val="19"/>
+              </w:rPr>
+              <w:t>INTERFACE LABEL: Primary navigation</w:t>
+            </w:r>
+          </w:p>
+          <w:p>
+            <w:pPr>
+              <w:spacing w:after="80"/>
+            </w:pPr>
+            <w:r>
+              <w:rPr>
+                <w:rFonts w:ascii="Calibri" w:hAnsi="Calibri"/>
+                <w:color w:val="425B72"/>
+                <w:sz w:val="19"/>
+              </w:rPr>
+              <w:t>INTERFACE LABEL: Anchor Wealth Planning home</w:t>
+            </w:r>
+          </w:p>
+          <w:p>
+            <w:pPr>
+              <w:spacing w:after="80"/>
+            </w:pPr>
+            <w:r>
+              <w:rPr>
+                <w:rFonts w:ascii="Calibri" w:hAnsi="Calibri"/>
+                <w:color w:val="425B72"/>
+                <w:sz w:val="19"/>
+              </w:rPr>
+              <w:t>INTERFACE LABEL: Toggle navigation</w:t>
+            </w:r>
+          </w:p>
+          <w:p>
+            <w:pPr>
+              <w:spacing w:after="80"/>
+            </w:pPr>
+            <w:r>
+              <w:rPr>
+                <w:rFonts w:ascii="Calibri" w:hAnsi="Calibri"/>
+                <w:color w:val="425B72"/>
+                <w:sz w:val="19"/>
+              </w:rPr>
+              <w:t>INTERFACE LABEL: Breadcrumb</w:t>
+            </w:r>
+          </w:p>
+          <w:p>
+            <w:pPr>
+              <w:spacing w:after="80"/>
+            </w:pPr>
+            <w:r>
+              <w:rPr>
+                <w:rFonts w:ascii="Calibri" w:hAnsi="Calibri"/>
+                <w:color w:val="425B72"/>
+                <w:sz w:val="19"/>
+              </w:rPr>
+              <w:t>INTERFACE LABEL: Read How RSU vesting creates a tax-timing trap</w:t>
+            </w:r>
+          </w:p>
+          <w:p>
+            <w:pPr>
+              <w:spacing w:after="80"/>
+            </w:pPr>
+            <w:r>
+              <w:rPr>
+                <w:rFonts w:ascii="Calibri" w:hAnsi="Calibri"/>
+                <w:color w:val="425B72"/>
+                <w:sz w:val="19"/>
+              </w:rPr>
+              <w:t>INTERFACE LABEL: Filter decision briefs</w:t>
+            </w:r>
+          </w:p>
+          <w:p>
+            <w:pPr>
+              <w:spacing w:after="80"/>
+            </w:pPr>
+            <w:r>
+              <w:rPr>
+                <w:rFonts w:ascii="Calibri" w:hAnsi="Calibri"/>
+                <w:color w:val="425B72"/>
+                <w:sz w:val="19"/>
+              </w:rPr>
+              <w:t>INTERFACE LABEL: Fit Check steps</w:t>
+            </w:r>
+          </w:p>
+        </w:tc>
+        <w:tc>
+          <w:tcPr>
+            <w:tcW w:type="dxa" w:w="6986"/>
+            <w:shd w:fill="FFF9ED"/>
+          </w:tcPr>
+          <w:p>
+            <w:pPr>
+              <w:spacing w:after="60"/>
+            </w:pPr>
+            <w:r/>
+          </w:p>
+          <w:p>
+            <w:pPr>
+              <w:spacing w:before="0" w:after="80"/>
+            </w:pPr>
+            <w:r>
+              <w:rPr>
+                <w:rFonts w:ascii="Calibri" w:hAnsi="Calibri"/>
+                <w:b/>
+                <w:color w:val="2D5474"/>
+                <w:sz w:val="15"/>
+              </w:rPr>
+              <w:t>DECISION</w:t>
+            </w:r>
+          </w:p>
+          <w:p>
+            <w:pPr>
+              <w:spacing w:after="100"/>
+            </w:pPr>
+            <w:r>
+              <w:rPr>
+                <w:rFonts w:ascii="Calibri" w:hAnsi="Calibri"/>
+                <w:b/>
+                <w:color w:val="0F2038"/>
+                <w:sz w:val="19"/>
+              </w:rPr>
+              <w:t>Keep  /  Edit  /  Replace</w:t>
+            </w:r>
+          </w:p>
+          <w:p>
+            <w:pPr>
+              <w:spacing w:after="160"/>
+            </w:pPr>
+            <w:r>
+              <w:rPr>
+                <w:rFonts w:ascii="Calibri" w:hAnsi="Calibri"/>
+                <w:i/>
+                <w:color w:val="425B72"/>
+                <w:sz w:val="17"/>
+              </w:rPr>
+              <w:t>Confirm image descriptions and page-specific labels; standard navigation/control labels can remain unless inaccurate.</w:t>
+            </w:r>
+          </w:p>
+          <w:p>
+            <w:pPr>
+              <w:spacing w:after="80"/>
+            </w:pPr>
+            <w:r>
+              <w:rPr>
+                <w:rFonts w:ascii="Calibri" w:hAnsi="Calibri"/>
+                <w:b/>
+                <w:color w:val="2D5474"/>
+                <w:sz w:val="17"/>
+              </w:rPr>
+              <w:t>Alex's replacement copy or notes:</w:t>
+            </w:r>
+          </w:p>
+          <w:p>
+            <w:pPr>
+              <w:spacing w:after="180"/>
+            </w:pPr>
+            <w:r>
+              <w:rPr>
+                <w:rFonts w:ascii="Calibri" w:hAnsi="Calibri"/>
+                <w:color w:val="425B72"/>
+                <w:sz w:val="19"/>
+              </w:rPr>
+              <w:t xml:space="preserve"> </w:t>
+            </w:r>
+          </w:p>
+          <w:p>
+            <w:pPr>
+              <w:spacing w:after="180"/>
+            </w:pPr>
+            <w:r>
+              <w:rPr>
+                <w:rFonts w:ascii="Calibri" w:hAnsi="Calibri"/>
+                <w:color w:val="425B72"/>
+                <w:sz w:val="19"/>
+              </w:rPr>
+              <w:t xml:space="preserve"> </w:t>
+            </w:r>
+          </w:p>
+          <w:p>
+            <w:pPr>
+              <w:spacing w:after="180"/>
+            </w:pPr>
+            <w:r>
+              <w:rPr>
+                <w:rFonts w:ascii="Calibri" w:hAnsi="Calibri"/>
+                <w:color w:val="425B72"/>
+                <w:sz w:val="19"/>
+              </w:rPr>
+              <w:t xml:space="preserve"> </w:t>
+            </w:r>
+          </w:p>
+        </w:tc>
+      </w:tr>
+      <w:tr>
+        <w:trPr>
+          <w:cantSplit w:val="true"/>
+        </w:trPr>
+        <w:tc>
+          <w:tcPr>
+            <w:tcW w:type="dxa" w:w="6986"/>
+            <w:shd w:fill="FFFFFF"/>
+          </w:tcPr>
+          <w:p>
+            <w:pPr>
+              <w:spacing w:after="60"/>
+            </w:pPr>
+            <w:r/>
+          </w:p>
+          <w:p>
+            <w:pPr>
+              <w:spacing w:before="0" w:after="80"/>
+            </w:pPr>
+            <w:r>
+              <w:rPr>
+                <w:rFonts w:ascii="Calibri" w:hAnsi="Calibri"/>
+                <w:b/>
+                <w:color w:val="B18F4D"/>
+                <w:sz w:val="15"/>
+              </w:rPr>
+              <w:t>SECTION / COPY BLOCK</w:t>
+            </w:r>
+          </w:p>
+          <w:p>
+            <w:pPr>
+              <w:spacing w:after="100"/>
+            </w:pPr>
+            <w:r>
+              <w:rPr>
+                <w:rFonts w:ascii="Calibri" w:hAnsi="Calibri"/>
+                <w:b/>
+                <w:color w:val="0F2038"/>
+                <w:sz w:val="21"/>
+              </w:rPr>
               <w:t>Page introduction</w:t>
             </w:r>
           </w:p>
@@ -24769,6 +26327,262 @@
                 <w:color w:val="0F2038"/>
                 <w:sz w:val="21"/>
               </w:rPr>
+              <w:t>Accessibility and interface text</w:t>
+            </w:r>
+          </w:p>
+          <w:p>
+            <w:pPr>
+              <w:spacing w:after="80"/>
+            </w:pPr>
+            <w:r>
+              <w:rPr>
+                <w:rFonts w:ascii="Calibri" w:hAnsi="Calibri"/>
+                <w:color w:val="425B72"/>
+                <w:sz w:val="19"/>
+              </w:rPr>
+              <w:t>IMAGE ALT: Four timelines aligning an RSU vest with tax recognition, the first open trading window, and the personal plan for the shares</w:t>
+            </w:r>
+          </w:p>
+          <w:p>
+            <w:pPr>
+              <w:spacing w:after="80"/>
+            </w:pPr>
+            <w:r>
+              <w:rPr>
+                <w:rFonts w:ascii="Calibri" w:hAnsi="Calibri"/>
+                <w:color w:val="425B72"/>
+                <w:sz w:val="19"/>
+              </w:rPr>
+              <w:t>INTERFACE LABEL: Primary navigation</w:t>
+            </w:r>
+          </w:p>
+          <w:p>
+            <w:pPr>
+              <w:spacing w:after="80"/>
+            </w:pPr>
+            <w:r>
+              <w:rPr>
+                <w:rFonts w:ascii="Calibri" w:hAnsi="Calibri"/>
+                <w:color w:val="425B72"/>
+                <w:sz w:val="19"/>
+              </w:rPr>
+              <w:t>INTERFACE LABEL: Anchor Wealth Planning home</w:t>
+            </w:r>
+          </w:p>
+          <w:p>
+            <w:pPr>
+              <w:spacing w:after="80"/>
+            </w:pPr>
+            <w:r>
+              <w:rPr>
+                <w:rFonts w:ascii="Calibri" w:hAnsi="Calibri"/>
+                <w:color w:val="425B72"/>
+                <w:sz w:val="19"/>
+              </w:rPr>
+              <w:t>INTERFACE LABEL: Toggle navigation</w:t>
+            </w:r>
+          </w:p>
+          <w:p>
+            <w:pPr>
+              <w:spacing w:after="80"/>
+            </w:pPr>
+            <w:r>
+              <w:rPr>
+                <w:rFonts w:ascii="Calibri" w:hAnsi="Calibri"/>
+                <w:color w:val="425B72"/>
+                <w:sz w:val="19"/>
+              </w:rPr>
+              <w:t>INTERFACE LABEL: Breadcrumb</w:t>
+            </w:r>
+          </w:p>
+          <w:p>
+            <w:pPr>
+              <w:spacing w:after="80"/>
+            </w:pPr>
+            <w:r>
+              <w:rPr>
+                <w:rFonts w:ascii="Calibri" w:hAnsi="Calibri"/>
+                <w:color w:val="425B72"/>
+                <w:sz w:val="19"/>
+              </w:rPr>
+              <w:t>INTERFACE LABEL: On this page</w:t>
+            </w:r>
+          </w:p>
+          <w:p>
+            <w:pPr>
+              <w:spacing w:after="80"/>
+            </w:pPr>
+            <w:r>
+              <w:rPr>
+                <w:rFonts w:ascii="Calibri" w:hAnsi="Calibri"/>
+                <w:color w:val="425B72"/>
+                <w:sz w:val="19"/>
+              </w:rPr>
+              <w:t>INTERFACE LABEL: Related planning pages</w:t>
+            </w:r>
+          </w:p>
+          <w:p>
+            <w:pPr>
+              <w:spacing w:after="80"/>
+            </w:pPr>
+            <w:r>
+              <w:rPr>
+                <w:rFonts w:ascii="Calibri" w:hAnsi="Calibri"/>
+                <w:color w:val="425B72"/>
+                <w:sz w:val="19"/>
+              </w:rPr>
+              <w:t>INTERFACE LABEL: Fit Check steps</w:t>
+            </w:r>
+          </w:p>
+        </w:tc>
+        <w:tc>
+          <w:tcPr>
+            <w:tcW w:type="dxa" w:w="6986"/>
+            <w:shd w:fill="FFF9ED"/>
+          </w:tcPr>
+          <w:p>
+            <w:pPr>
+              <w:spacing w:after="60"/>
+            </w:pPr>
+            <w:r/>
+          </w:p>
+          <w:p>
+            <w:pPr>
+              <w:spacing w:before="0" w:after="80"/>
+            </w:pPr>
+            <w:r>
+              <w:rPr>
+                <w:rFonts w:ascii="Calibri" w:hAnsi="Calibri"/>
+                <w:b/>
+                <w:color w:val="2D5474"/>
+                <w:sz w:val="15"/>
+              </w:rPr>
+              <w:t>DECISION</w:t>
+            </w:r>
+          </w:p>
+          <w:p>
+            <w:pPr>
+              <w:spacing w:after="100"/>
+            </w:pPr>
+            <w:r>
+              <w:rPr>
+                <w:rFonts w:ascii="Calibri" w:hAnsi="Calibri"/>
+                <w:b/>
+                <w:color w:val="0F2038"/>
+                <w:sz w:val="19"/>
+              </w:rPr>
+              <w:t>Keep  /  Edit  /  Replace</w:t>
+            </w:r>
+          </w:p>
+          <w:p>
+            <w:pPr>
+              <w:spacing w:after="160"/>
+            </w:pPr>
+            <w:r>
+              <w:rPr>
+                <w:rFonts w:ascii="Calibri" w:hAnsi="Calibri"/>
+                <w:i/>
+                <w:color w:val="425B72"/>
+                <w:sz w:val="17"/>
+              </w:rPr>
+              <w:t>Confirm image descriptions and page-specific labels; standard navigation/control labels can remain unless inaccurate.</w:t>
+            </w:r>
+          </w:p>
+          <w:p>
+            <w:pPr>
+              <w:spacing w:after="80"/>
+            </w:pPr>
+            <w:r>
+              <w:rPr>
+                <w:rFonts w:ascii="Calibri" w:hAnsi="Calibri"/>
+                <w:b/>
+                <w:color w:val="2D5474"/>
+                <w:sz w:val="17"/>
+              </w:rPr>
+              <w:t>Alex's replacement copy or notes:</w:t>
+            </w:r>
+          </w:p>
+          <w:p>
+            <w:pPr>
+              <w:spacing w:after="180"/>
+            </w:pPr>
+            <w:r>
+              <w:rPr>
+                <w:rFonts w:ascii="Calibri" w:hAnsi="Calibri"/>
+                <w:color w:val="425B72"/>
+                <w:sz w:val="19"/>
+              </w:rPr>
+              <w:t xml:space="preserve"> </w:t>
+            </w:r>
+          </w:p>
+          <w:p>
+            <w:pPr>
+              <w:spacing w:after="180"/>
+            </w:pPr>
+            <w:r>
+              <w:rPr>
+                <w:rFonts w:ascii="Calibri" w:hAnsi="Calibri"/>
+                <w:color w:val="425B72"/>
+                <w:sz w:val="19"/>
+              </w:rPr>
+              <w:t xml:space="preserve"> </w:t>
+            </w:r>
+          </w:p>
+          <w:p>
+            <w:pPr>
+              <w:spacing w:after="180"/>
+            </w:pPr>
+            <w:r>
+              <w:rPr>
+                <w:rFonts w:ascii="Calibri" w:hAnsi="Calibri"/>
+                <w:color w:val="425B72"/>
+                <w:sz w:val="19"/>
+              </w:rPr>
+              <w:t xml:space="preserve"> </w:t>
+            </w:r>
+          </w:p>
+        </w:tc>
+      </w:tr>
+      <w:tr>
+        <w:trPr>
+          <w:cantSplit w:val="true"/>
+        </w:trPr>
+        <w:tc>
+          <w:tcPr>
+            <w:tcW w:type="dxa" w:w="6986"/>
+            <w:shd w:fill="FFFFFF"/>
+          </w:tcPr>
+          <w:p>
+            <w:pPr>
+              <w:spacing w:after="60"/>
+            </w:pPr>
+            <w:r/>
+          </w:p>
+          <w:p>
+            <w:pPr>
+              <w:spacing w:before="0" w:after="80"/>
+            </w:pPr>
+            <w:r>
+              <w:rPr>
+                <w:rFonts w:ascii="Calibri" w:hAnsi="Calibri"/>
+                <w:b/>
+                <w:color w:val="B18F4D"/>
+                <w:sz w:val="15"/>
+              </w:rPr>
+              <w:t>SECTION / COPY BLOCK</w:t>
+            </w:r>
+          </w:p>
+          <w:p>
+            <w:pPr>
+              <w:spacing w:after="100"/>
+            </w:pPr>
+            <w:r>
+              <w:rPr>
+                <w:rFonts w:ascii="Calibri" w:hAnsi="Calibri"/>
+                <w:b/>
+                <w:color w:val="0F2038"/>
+                <w:sz w:val="21"/>
+              </w:rPr>
               <w:t>Page introduction</w:t>
             </w:r>
           </w:p>
@@ -27680,6 +29494,262 @@
                 <w:sz w:val="17"/>
               </w:rPr>
               <w:t>Approve the search/social wording and verify every person, organization, date, and schema fact.</w:t>
+            </w:r>
+          </w:p>
+          <w:p>
+            <w:pPr>
+              <w:spacing w:after="80"/>
+            </w:pPr>
+            <w:r>
+              <w:rPr>
+                <w:rFonts w:ascii="Calibri" w:hAnsi="Calibri"/>
+                <w:b/>
+                <w:color w:val="2D5474"/>
+                <w:sz w:val="17"/>
+              </w:rPr>
+              <w:t>Alex's replacement copy or notes:</w:t>
+            </w:r>
+          </w:p>
+          <w:p>
+            <w:pPr>
+              <w:spacing w:after="180"/>
+            </w:pPr>
+            <w:r>
+              <w:rPr>
+                <w:rFonts w:ascii="Calibri" w:hAnsi="Calibri"/>
+                <w:color w:val="425B72"/>
+                <w:sz w:val="19"/>
+              </w:rPr>
+              <w:t xml:space="preserve"> </w:t>
+            </w:r>
+          </w:p>
+          <w:p>
+            <w:pPr>
+              <w:spacing w:after="180"/>
+            </w:pPr>
+            <w:r>
+              <w:rPr>
+                <w:rFonts w:ascii="Calibri" w:hAnsi="Calibri"/>
+                <w:color w:val="425B72"/>
+                <w:sz w:val="19"/>
+              </w:rPr>
+              <w:t xml:space="preserve"> </w:t>
+            </w:r>
+          </w:p>
+          <w:p>
+            <w:pPr>
+              <w:spacing w:after="180"/>
+            </w:pPr>
+            <w:r>
+              <w:rPr>
+                <w:rFonts w:ascii="Calibri" w:hAnsi="Calibri"/>
+                <w:color w:val="425B72"/>
+                <w:sz w:val="19"/>
+              </w:rPr>
+              <w:t xml:space="preserve"> </w:t>
+            </w:r>
+          </w:p>
+        </w:tc>
+      </w:tr>
+      <w:tr>
+        <w:trPr>
+          <w:cantSplit w:val="true"/>
+        </w:trPr>
+        <w:tc>
+          <w:tcPr>
+            <w:tcW w:type="dxa" w:w="6986"/>
+            <w:shd w:fill="FFFFFF"/>
+          </w:tcPr>
+          <w:p>
+            <w:pPr>
+              <w:spacing w:after="60"/>
+            </w:pPr>
+            <w:r/>
+          </w:p>
+          <w:p>
+            <w:pPr>
+              <w:spacing w:before="0" w:after="80"/>
+            </w:pPr>
+            <w:r>
+              <w:rPr>
+                <w:rFonts w:ascii="Calibri" w:hAnsi="Calibri"/>
+                <w:b/>
+                <w:color w:val="B18F4D"/>
+                <w:sz w:val="15"/>
+              </w:rPr>
+              <w:t>SECTION / COPY BLOCK</w:t>
+            </w:r>
+          </w:p>
+          <w:p>
+            <w:pPr>
+              <w:spacing w:after="100"/>
+            </w:pPr>
+            <w:r>
+              <w:rPr>
+                <w:rFonts w:ascii="Calibri" w:hAnsi="Calibri"/>
+                <w:b/>
+                <w:color w:val="0F2038"/>
+                <w:sz w:val="21"/>
+              </w:rPr>
+              <w:t>Accessibility and interface text</w:t>
+            </w:r>
+          </w:p>
+          <w:p>
+            <w:pPr>
+              <w:spacing w:after="80"/>
+            </w:pPr>
+            <w:r>
+              <w:rPr>
+                <w:rFonts w:ascii="Calibri" w:hAnsi="Calibri"/>
+                <w:color w:val="425B72"/>
+                <w:sz w:val="19"/>
+              </w:rPr>
+              <w:t>INTERFACE LABEL: Primary navigation</w:t>
+            </w:r>
+          </w:p>
+          <w:p>
+            <w:pPr>
+              <w:spacing w:after="80"/>
+            </w:pPr>
+            <w:r>
+              <w:rPr>
+                <w:rFonts w:ascii="Calibri" w:hAnsi="Calibri"/>
+                <w:color w:val="425B72"/>
+                <w:sz w:val="19"/>
+              </w:rPr>
+              <w:t>INTERFACE LABEL: Anchor Wealth Planning home</w:t>
+            </w:r>
+          </w:p>
+          <w:p>
+            <w:pPr>
+              <w:spacing w:after="80"/>
+            </w:pPr>
+            <w:r>
+              <w:rPr>
+                <w:rFonts w:ascii="Calibri" w:hAnsi="Calibri"/>
+                <w:color w:val="425B72"/>
+                <w:sz w:val="19"/>
+              </w:rPr>
+              <w:t>INTERFACE LABEL: Toggle navigation</w:t>
+            </w:r>
+          </w:p>
+          <w:p>
+            <w:pPr>
+              <w:spacing w:after="80"/>
+            </w:pPr>
+            <w:r>
+              <w:rPr>
+                <w:rFonts w:ascii="Calibri" w:hAnsi="Calibri"/>
+                <w:color w:val="425B72"/>
+                <w:sz w:val="19"/>
+              </w:rPr>
+              <w:t>INTERFACE LABEL: Breadcrumb</w:t>
+            </w:r>
+          </w:p>
+          <w:p>
+            <w:pPr>
+              <w:spacing w:after="80"/>
+            </w:pPr>
+            <w:r>
+              <w:rPr>
+                <w:rFonts w:ascii="Calibri" w:hAnsi="Calibri"/>
+                <w:color w:val="425B72"/>
+                <w:sz w:val="19"/>
+              </w:rPr>
+              <w:t>INTERFACE LABEL: The Planning Room podcast cover</w:t>
+            </w:r>
+          </w:p>
+          <w:p>
+            <w:pPr>
+              <w:spacing w:after="80"/>
+            </w:pPr>
+            <w:r>
+              <w:rPr>
+                <w:rFonts w:ascii="Calibri" w:hAnsi="Calibri"/>
+                <w:color w:val="425B72"/>
+                <w:sz w:val="19"/>
+              </w:rPr>
+              <w:t>INTERFACE LABEL: Conversation map</w:t>
+            </w:r>
+          </w:p>
+          <w:p>
+            <w:pPr>
+              <w:spacing w:after="80"/>
+            </w:pPr>
+            <w:r>
+              <w:rPr>
+                <w:rFonts w:ascii="Calibri" w:hAnsi="Calibri"/>
+                <w:color w:val="425B72"/>
+                <w:sz w:val="19"/>
+              </w:rPr>
+              <w:t>INTERFACE LABEL: Related planning pages</w:t>
+            </w:r>
+          </w:p>
+          <w:p>
+            <w:pPr>
+              <w:spacing w:after="80"/>
+            </w:pPr>
+            <w:r>
+              <w:rPr>
+                <w:rFonts w:ascii="Calibri" w:hAnsi="Calibri"/>
+                <w:color w:val="425B72"/>
+                <w:sz w:val="19"/>
+              </w:rPr>
+              <w:t>INTERFACE LABEL: Fit Check steps</w:t>
+            </w:r>
+          </w:p>
+        </w:tc>
+        <w:tc>
+          <w:tcPr>
+            <w:tcW w:type="dxa" w:w="6986"/>
+            <w:shd w:fill="FFF9ED"/>
+          </w:tcPr>
+          <w:p>
+            <w:pPr>
+              <w:spacing w:after="60"/>
+            </w:pPr>
+            <w:r/>
+          </w:p>
+          <w:p>
+            <w:pPr>
+              <w:spacing w:before="0" w:after="80"/>
+            </w:pPr>
+            <w:r>
+              <w:rPr>
+                <w:rFonts w:ascii="Calibri" w:hAnsi="Calibri"/>
+                <w:b/>
+                <w:color w:val="2D5474"/>
+                <w:sz w:val="15"/>
+              </w:rPr>
+              <w:t>DECISION</w:t>
+            </w:r>
+          </w:p>
+          <w:p>
+            <w:pPr>
+              <w:spacing w:after="100"/>
+            </w:pPr>
+            <w:r>
+              <w:rPr>
+                <w:rFonts w:ascii="Calibri" w:hAnsi="Calibri"/>
+                <w:b/>
+                <w:color w:val="0F2038"/>
+                <w:sz w:val="19"/>
+              </w:rPr>
+              <w:t>Keep  /  Edit  /  Replace</w:t>
+            </w:r>
+          </w:p>
+          <w:p>
+            <w:pPr>
+              <w:spacing w:after="160"/>
+            </w:pPr>
+            <w:r>
+              <w:rPr>
+                <w:rFonts w:ascii="Calibri" w:hAnsi="Calibri"/>
+                <w:i/>
+                <w:color w:val="425B72"/>
+                <w:sz w:val="17"/>
+              </w:rPr>
+              <w:t>Confirm image descriptions and page-specific labels; standard navigation/control labels can remain unless inaccurate.</w:t>
             </w:r>
           </w:p>
           <w:p>

</xml_diff>

<commit_message>
feat(anchor): finalize navigation and podcast system
</commit_message>
<xml_diff>
--- a/projects/awp/copy/Anchor_Copy_Review_Side_by_Side.docx
+++ b/projects/awp/copy/Anchor_Copy_Review_Side_by_Side.docx
@@ -505,20 +505,7 @@
                 <w:color w:val="425B72"/>
                 <w:sz w:val="19"/>
               </w:rPr>
-              <w:t>Homepage: About · Team · Who We Serve · Resources · Process · Book a Call</w:t>
-            </w:r>
-          </w:p>
-          <w:p>
-            <w:pPr>
-              <w:spacing w:after="80"/>
-            </w:pPr>
-            <w:r>
-              <w:rPr>
-                <w:rFonts w:ascii="Calibri" w:hAnsi="Calibri"/>
-                <w:color w:val="425B72"/>
-                <w:sz w:val="19"/>
-              </w:rPr>
-              <w:t>Content pages: About · Team · Who We Serve · Resources · Take the Fit Check</w:t>
+              <w:t>All pages: About · Team · Who We Serve · Resources · Process · Take the Fit Check</w:t>
             </w:r>
           </w:p>
         </w:tc>
@@ -572,7 +559,7 @@
                 <w:color w:val="425B72"/>
                 <w:sz w:val="17"/>
               </w:rPr>
-              <w:t>Confirm the labels and preferred primary action on both homepage and content pages.</w:t>
+              <w:t>Confirm the labels and the Fit Check as the consistent primary action across the site.</w:t>
             </w:r>
           </w:p>
           <w:p>
@@ -2621,7 +2608,7 @@
                 <w:color w:val="425B72"/>
                 <w:sz w:val="19"/>
               </w:rPr>
-              <w:t>INTERFACE LABEL: Open navigation</w:t>
+              <w:t>INTERFACE LABEL: Toggle navigation</w:t>
             </w:r>
           </w:p>
           <w:p>
@@ -12297,7 +12284,7 @@
                 <w:color w:val="425B72"/>
                 <w:sz w:val="19"/>
               </w:rPr>
-              <w:t>SECTION LABEL: From The Planning Room</w:t>
+              <w:t>SECTION LABEL: From Anchor Wealth Podcast</w:t>
             </w:r>
           </w:p>
           <w:p>
@@ -22543,7 +22530,7 @@
                 <w:color w:val="425B72"/>
                 <w:sz w:val="17"/>
               </w:rPr>
-              <w:t>1. Approve “The Planning Room” as the podcast/resource-series name.</w:t>
+              <w:t>1. Approve “Anchor Wealth Podcast” as the public podcast-series name.</w:t>
             </w:r>
           </w:p>
           <w:p>
@@ -22763,7 +22750,7 @@
                 <w:color w:val="425B72"/>
                 <w:sz w:val="19"/>
               </w:rPr>
-              <w:t>SOCIAL TITLE: The Planning Room | Anchor Wealth Planning</w:t>
+              <w:t>SOCIAL TITLE: Financial Planning Resources | Anchor Wealth Planning</w:t>
             </w:r>
           </w:p>
           <w:p>
@@ -22789,7 +22776,7 @@
                 <w:color w:val="425B72"/>
                 <w:sz w:val="19"/>
               </w:rPr>
-              <w:t>STRUCTURED DATA: CollectionPage · The Planning Room · Planning resources for complex financial decisions.</w:t>
+              <w:t>STRUCTURED DATA: CollectionPage · Anchor Wealth Planning Resources · Planning resources for complex financial decisions.</w:t>
             </w:r>
           </w:p>
         </w:tc>
@@ -23019,6 +23006,19 @@
                 <w:color w:val="425B72"/>
                 <w:sz w:val="19"/>
               </w:rPr>
+              <w:t>INTERFACE LABEL: Available resource formats</w:t>
+            </w:r>
+          </w:p>
+          <w:p>
+            <w:pPr>
+              <w:spacing w:after="80"/>
+            </w:pPr>
+            <w:r>
+              <w:rPr>
+                <w:rFonts w:ascii="Calibri" w:hAnsi="Calibri"/>
+                <w:color w:val="425B72"/>
+                <w:sz w:val="19"/>
+              </w:rPr>
               <w:t>INTERFACE LABEL: Read How RSU vesting creates a tax-timing trap</w:t>
             </w:r>
           </w:p>
@@ -23375,20 +23375,72 @@
                 <w:color w:val="0F2038"/>
                 <w:sz w:val="21"/>
               </w:rPr>
-              <w:t>Decisions that do not fit in a silo.</w:t>
-            </w:r>
-          </w:p>
-          <w:p>
-            <w:pPr>
-              <w:spacing w:after="80"/>
-            </w:pPr>
-            <w:r>
-              <w:rPr>
-                <w:rFonts w:ascii="Calibri" w:hAnsi="Calibri"/>
-                <w:color w:val="425B72"/>
-                <w:sz w:val="19"/>
-              </w:rPr>
-              <w:t>For Houston executives, business owners, and families. Clear answers for moments when tax, investments, estate planning, and timing all touch the same decision.</w:t>
+              <w:t>Clear thinking for decisions that touch everything.</w:t>
+            </w:r>
+          </w:p>
+          <w:p>
+            <w:pPr>
+              <w:spacing w:after="80"/>
+            </w:pPr>
+            <w:r>
+              <w:rPr>
+                <w:rFonts w:ascii="Calibri" w:hAnsi="Calibri"/>
+                <w:color w:val="425B72"/>
+                <w:sz w:val="19"/>
+              </w:rPr>
+              <w:t>SECTION LABEL: Anchor Resources</w:t>
+            </w:r>
+          </w:p>
+          <w:p>
+            <w:pPr>
+              <w:spacing w:after="80"/>
+            </w:pPr>
+            <w:r>
+              <w:rPr>
+                <w:rFonts w:ascii="Calibri" w:hAnsi="Calibri"/>
+                <w:color w:val="425B72"/>
+                <w:sz w:val="19"/>
+              </w:rPr>
+              <w:t>Built for Houston executives, business owners, and families. Browse articles, podcast conversations, and practical frameworks by the decision in front of you.</w:t>
+            </w:r>
+          </w:p>
+          <w:p>
+            <w:pPr>
+              <w:spacing w:after="80"/>
+            </w:pPr>
+            <w:r>
+              <w:rPr>
+                <w:rFonts w:ascii="Calibri" w:hAnsi="Calibri"/>
+                <w:color w:val="425B72"/>
+                <w:sz w:val="19"/>
+              </w:rPr>
+              <w:t>Articles</w:t>
+            </w:r>
+          </w:p>
+          <w:p>
+            <w:pPr>
+              <w:spacing w:after="80"/>
+            </w:pPr>
+            <w:r>
+              <w:rPr>
+                <w:rFonts w:ascii="Calibri" w:hAnsi="Calibri"/>
+                <w:color w:val="425B72"/>
+                <w:sz w:val="19"/>
+              </w:rPr>
+              <w:t>Podcasts</w:t>
+            </w:r>
+          </w:p>
+          <w:p>
+            <w:pPr>
+              <w:spacing w:after="80"/>
+            </w:pPr>
+            <w:r>
+              <w:rPr>
+                <w:rFonts w:ascii="Calibri" w:hAnsi="Calibri"/>
+                <w:color w:val="425B72"/>
+                <w:sz w:val="19"/>
+              </w:rPr>
+              <w:t>Frameworks</w:t>
             </w:r>
           </w:p>
         </w:tc>
@@ -23540,20 +23592,33 @@
                 <w:color w:val="0F2038"/>
                 <w:sz w:val="21"/>
               </w:rPr>
-              <w:t>Two ways into the conversation.</w:t>
-            </w:r>
-          </w:p>
-          <w:p>
-            <w:pPr>
-              <w:spacing w:after="80"/>
-            </w:pPr>
-            <w:r>
-              <w:rPr>
-                <w:rFonts w:ascii="Calibri" w:hAnsi="Calibri"/>
-                <w:color w:val="425B72"/>
-                <w:sz w:val="19"/>
-              </w:rPr>
-              <w:t>Read the decision brief or open the podcast. Both are designed to leave you with a clearer next question.</w:t>
+              <w:t>Choose how you want to think it through.</w:t>
+            </w:r>
+          </w:p>
+          <w:p>
+            <w:pPr>
+              <w:spacing w:after="80"/>
+            </w:pPr>
+            <w:r>
+              <w:rPr>
+                <w:rFonts w:ascii="Calibri" w:hAnsi="Calibri"/>
+                <w:color w:val="425B72"/>
+                <w:sz w:val="19"/>
+              </w:rPr>
+              <w:t>SECTION LABEL: Start here</w:t>
+            </w:r>
+          </w:p>
+          <w:p>
+            <w:pPr>
+              <w:spacing w:after="80"/>
+            </w:pPr>
+            <w:r>
+              <w:rPr>
+                <w:rFonts w:ascii="Calibri" w:hAnsi="Calibri"/>
+                <w:color w:val="425B72"/>
+                <w:sz w:val="19"/>
+              </w:rPr>
+              <w:t>Read the six-minute brief or listen to a focused planning conversation. Both lead to a practical next question.</w:t>
             </w:r>
           </w:p>
         </w:tc>
@@ -23747,6 +23812,19 @@
               <w:t>CTA / LINK: Read the 6-minute briefing</w:t>
             </w:r>
           </w:p>
+          <w:p>
+            <w:pPr>
+              <w:spacing w:after="80"/>
+            </w:pPr>
+            <w:r>
+              <w:rPr>
+                <w:rFonts w:ascii="Calibri" w:hAnsi="Calibri"/>
+                <w:color w:val="425B72"/>
+                <w:sz w:val="19"/>
+              </w:rPr>
+              <w:t>Podcast</w:t>
+            </w:r>
+          </w:p>
         </w:tc>
         <w:tc>
           <w:tcPr>
@@ -23896,7 +23974,7 @@
                 <w:color w:val="0F2038"/>
                 <w:sz w:val="21"/>
               </w:rPr>
-              <w:t>The Planning Room</w:t>
+              <w:t>Anchor Wealth Podcast</w:t>
             </w:r>
           </w:p>
           <w:p>
@@ -23922,7 +24000,7 @@
                 <w:color w:val="425B72"/>
                 <w:sz w:val="19"/>
               </w:rPr>
-              <w:t>CTA / LINK: Open the podcast series</w:t>
+              <w:t>CTA / LINK: Listen to the podcast</w:t>
             </w:r>
           </w:p>
         </w:tc>
@@ -24074,20 +24152,33 @@
                 <w:color w:val="0F2038"/>
                 <w:sz w:val="21"/>
               </w:rPr>
-              <w:t>Find the pressure point first.</w:t>
-            </w:r>
-          </w:p>
-          <w:p>
-            <w:pPr>
-              <w:spacing w:after="80"/>
-            </w:pPr>
-            <w:r>
-              <w:rPr>
-                <w:rFonts w:ascii="Calibri" w:hAnsi="Calibri"/>
-                <w:color w:val="425B72"/>
-                <w:sz w:val="19"/>
-              </w:rPr>
-              <w:t>The directory is organized around the problem a reader is trying to solve, not the format of the content.</w:t>
+              <w:t>Start with the decision, not the format.</w:t>
+            </w:r>
+          </w:p>
+          <w:p>
+            <w:pPr>
+              <w:spacing w:after="80"/>
+            </w:pPr>
+            <w:r>
+              <w:rPr>
+                <w:rFonts w:ascii="Calibri" w:hAnsi="Calibri"/>
+                <w:color w:val="425B72"/>
+                <w:sz w:val="19"/>
+              </w:rPr>
+              <w:t>SECTION LABEL: Resource directory</w:t>
+            </w:r>
+          </w:p>
+          <w:p>
+            <w:pPr>
+              <w:spacing w:after="80"/>
+            </w:pPr>
+            <w:r>
+              <w:rPr>
+                <w:rFonts w:ascii="Calibri" w:hAnsi="Calibri"/>
+                <w:color w:val="425B72"/>
+                <w:sz w:val="19"/>
+              </w:rPr>
+              <w:t>Articles, podcast episodes, and working frameworks live together here. Filter by the issue that needs attention now.</w:t>
             </w:r>
           </w:p>
           <w:p>
@@ -24317,7 +24408,7 @@
                 <w:color w:val="425B72"/>
                 <w:sz w:val="19"/>
               </w:rPr>
-              <w:t>DETAIL LABEL: Decision brief · 6 min</w:t>
+              <w:t>DETAIL LABEL: Article · 6 min</w:t>
             </w:r>
           </w:p>
           <w:p>
@@ -24495,46 +24586,46 @@
                 <w:color w:val="0F2038"/>
                 <w:sz w:val="21"/>
               </w:rPr>
-              <w:t>What one living plan actually coordinates</w:t>
-            </w:r>
-          </w:p>
-          <w:p>
-            <w:pPr>
-              <w:spacing w:after="80"/>
-            </w:pPr>
-            <w:r>
-              <w:rPr>
-                <w:rFonts w:ascii="Calibri" w:hAnsi="Calibri"/>
-                <w:color w:val="425B72"/>
-                <w:sz w:val="19"/>
-              </w:rPr>
-              <w:t>DETAIL LABEL: Framework · 5 min</w:t>
-            </w:r>
-          </w:p>
-          <w:p>
-            <w:pPr>
-              <w:spacing w:after="80"/>
-            </w:pPr>
-            <w:r>
-              <w:rPr>
-                <w:rFonts w:ascii="Calibri" w:hAnsi="Calibri"/>
-                <w:color w:val="425B72"/>
-                <w:sz w:val="19"/>
-              </w:rPr>
-              <w:t>A practical division of labor across the advisor, CPA, attorney, and client.</w:t>
-            </w:r>
-          </w:p>
-          <w:p>
-            <w:pPr>
-              <w:spacing w:after="80"/>
-            </w:pPr>
-            <w:r>
-              <w:rPr>
-                <w:rFonts w:ascii="Calibri" w:hAnsi="Calibri"/>
-                <w:color w:val="425B72"/>
-                <w:sz w:val="19"/>
-              </w:rPr>
-              <w:t>View framework</w:t>
+              <w:t>What coordinated planning looks like before year-end</w:t>
+            </w:r>
+          </w:p>
+          <w:p>
+            <w:pPr>
+              <w:spacing w:after="80"/>
+            </w:pPr>
+            <w:r>
+              <w:rPr>
+                <w:rFonts w:ascii="Calibri" w:hAnsi="Calibri"/>
+                <w:color w:val="425B72"/>
+                <w:sz w:val="19"/>
+              </w:rPr>
+              <w:t>DETAIL LABEL: Podcast · Episode 01</w:t>
+            </w:r>
+          </w:p>
+          <w:p>
+            <w:pPr>
+              <w:spacing w:after="80"/>
+            </w:pPr>
+            <w:r>
+              <w:rPr>
+                <w:rFonts w:ascii="Calibri" w:hAnsi="Calibri"/>
+                <w:color w:val="425B72"/>
+                <w:sz w:val="19"/>
+              </w:rPr>
+              <w:t>Put every decision, owner, and deadline on one shared calendar before the year gets crowded.</w:t>
+            </w:r>
+          </w:p>
+          <w:p>
+            <w:pPr>
+              <w:spacing w:after="80"/>
+            </w:pPr>
+            <w:r>
+              <w:rPr>
+                <w:rFonts w:ascii="Calibri" w:hAnsi="Calibri"/>
+                <w:color w:val="425B72"/>
+                <w:sz w:val="19"/>
+              </w:rPr>
+              <w:t>Listen to the podcast</w:t>
             </w:r>
           </w:p>
         </w:tc>
@@ -24686,46 +24777,46 @@
                 <w:color w:val="0F2038"/>
                 <w:sz w:val="21"/>
               </w:rPr>
-              <w:t>The exit conversation starts before the LOI</w:t>
-            </w:r>
-          </w:p>
-          <w:p>
-            <w:pPr>
-              <w:spacing w:after="80"/>
-            </w:pPr>
-            <w:r>
-              <w:rPr>
-                <w:rFonts w:ascii="Calibri" w:hAnsi="Calibri"/>
-                <w:color w:val="425B72"/>
-                <w:sz w:val="19"/>
-              </w:rPr>
-              <w:t>DETAIL LABEL: Owner checklist · 7 min</w:t>
-            </w:r>
-          </w:p>
-          <w:p>
-            <w:pPr>
-              <w:spacing w:after="80"/>
-            </w:pPr>
-            <w:r>
-              <w:rPr>
-                <w:rFonts w:ascii="Calibri" w:hAnsi="Calibri"/>
-                <w:color w:val="425B72"/>
-                <w:sz w:val="19"/>
-              </w:rPr>
-              <w:t>Questions to answer while the owner still controls the timeline and the range of options.</w:t>
-            </w:r>
-          </w:p>
-          <w:p>
-            <w:pPr>
-              <w:spacing w:after="80"/>
-            </w:pPr>
-            <w:r>
-              <w:rPr>
-                <w:rFonts w:ascii="Calibri" w:hAnsi="Calibri"/>
-                <w:color w:val="425B72"/>
-                <w:sz w:val="19"/>
-              </w:rPr>
-              <w:t>Explore topic</w:t>
+              <w:t>What one living plan actually coordinates</w:t>
+            </w:r>
+          </w:p>
+          <w:p>
+            <w:pPr>
+              <w:spacing w:after="80"/>
+            </w:pPr>
+            <w:r>
+              <w:rPr>
+                <w:rFonts w:ascii="Calibri" w:hAnsi="Calibri"/>
+                <w:color w:val="425B72"/>
+                <w:sz w:val="19"/>
+              </w:rPr>
+              <w:t>DETAIL LABEL: Framework · 5 min</w:t>
+            </w:r>
+          </w:p>
+          <w:p>
+            <w:pPr>
+              <w:spacing w:after="80"/>
+            </w:pPr>
+            <w:r>
+              <w:rPr>
+                <w:rFonts w:ascii="Calibri" w:hAnsi="Calibri"/>
+                <w:color w:val="425B72"/>
+                <w:sz w:val="19"/>
+              </w:rPr>
+              <w:t>A practical division of labor across the advisor, CPA, attorney, and client.</w:t>
+            </w:r>
+          </w:p>
+          <w:p>
+            <w:pPr>
+              <w:spacing w:after="80"/>
+            </w:pPr>
+            <w:r>
+              <w:rPr>
+                <w:rFonts w:ascii="Calibri" w:hAnsi="Calibri"/>
+                <w:color w:val="425B72"/>
+                <w:sz w:val="19"/>
+              </w:rPr>
+              <w:t>View framework</w:t>
             </w:r>
           </w:p>
         </w:tc>
@@ -24877,33 +24968,33 @@
                 <w:color w:val="0F2038"/>
                 <w:sz w:val="21"/>
               </w:rPr>
-              <w:t>Does the estate plan still match what the family owns?</w:t>
-            </w:r>
-          </w:p>
-          <w:p>
-            <w:pPr>
-              <w:spacing w:after="80"/>
-            </w:pPr>
-            <w:r>
-              <w:rPr>
-                <w:rFonts w:ascii="Calibri" w:hAnsi="Calibri"/>
-                <w:color w:val="425B72"/>
-                <w:sz w:val="19"/>
-              </w:rPr>
-              <w:t>DETAIL LABEL: Family review · 5 min</w:t>
-            </w:r>
-          </w:p>
-          <w:p>
-            <w:pPr>
-              <w:spacing w:after="80"/>
-            </w:pPr>
-            <w:r>
-              <w:rPr>
-                <w:rFonts w:ascii="Calibri" w:hAnsi="Calibri"/>
-                <w:color w:val="425B72"/>
-                <w:sz w:val="19"/>
-              </w:rPr>
-              <w:t>Review funding, beneficiaries, decision makers, and family communication after wealth changes.</w:t>
+              <w:t>The exit conversation starts before the LOI</w:t>
+            </w:r>
+          </w:p>
+          <w:p>
+            <w:pPr>
+              <w:spacing w:after="80"/>
+            </w:pPr>
+            <w:r>
+              <w:rPr>
+                <w:rFonts w:ascii="Calibri" w:hAnsi="Calibri"/>
+                <w:color w:val="425B72"/>
+                <w:sz w:val="19"/>
+              </w:rPr>
+              <w:t>DETAIL LABEL: Checklist · 7 min</w:t>
+            </w:r>
+          </w:p>
+          <w:p>
+            <w:pPr>
+              <w:spacing w:after="80"/>
+            </w:pPr>
+            <w:r>
+              <w:rPr>
+                <w:rFonts w:ascii="Calibri" w:hAnsi="Calibri"/>
+                <w:color w:val="425B72"/>
+                <w:sz w:val="19"/>
+              </w:rPr>
+              <w:t>Questions to answer while the owner still controls the timeline and the range of options.</w:t>
             </w:r>
           </w:p>
           <w:p>
@@ -25068,20 +25159,46 @@
                 <w:color w:val="0F2038"/>
                 <w:sz w:val="21"/>
               </w:rPr>
-              <w:t>Conversations for the planning room.</w:t>
-            </w:r>
-          </w:p>
-          <w:p>
-            <w:pPr>
-              <w:spacing w:after="80"/>
-            </w:pPr>
-            <w:r>
-              <w:rPr>
-                <w:rFonts w:ascii="Calibri" w:hAnsi="Calibri"/>
-                <w:color w:val="425B72"/>
-                <w:sz w:val="19"/>
-              </w:rPr>
-              <w:t>Short, focused discussions with written notes for readers who prefer the key decisions in one place.</w:t>
+              <w:t>Five questions to ask before responding to an offer</w:t>
+            </w:r>
+          </w:p>
+          <w:p>
+            <w:pPr>
+              <w:spacing w:after="80"/>
+            </w:pPr>
+            <w:r>
+              <w:rPr>
+                <w:rFonts w:ascii="Calibri" w:hAnsi="Calibri"/>
+                <w:color w:val="425B72"/>
+                <w:sz w:val="19"/>
+              </w:rPr>
+              <w:t>DETAIL LABEL: Podcast · Preview</w:t>
+            </w:r>
+          </w:p>
+          <w:p>
+            <w:pPr>
+              <w:spacing w:after="80"/>
+            </w:pPr>
+            <w:r>
+              <w:rPr>
+                <w:rFonts w:ascii="Calibri" w:hAnsi="Calibri"/>
+                <w:color w:val="425B72"/>
+                <w:sz w:val="19"/>
+              </w:rPr>
+              <w:t>Separate valuation, taxes, family goals, and deal timing before momentum makes the choice.</w:t>
+            </w:r>
+          </w:p>
+          <w:p>
+            <w:pPr>
+              <w:spacing w:after="80"/>
+            </w:pPr>
+            <w:r>
+              <w:rPr>
+                <w:rFonts w:ascii="Calibri" w:hAnsi="Calibri"/>
+                <w:color w:val="425B72"/>
+                <w:sz w:val="19"/>
+              </w:rPr>
+              <w:t>Listen to the podcast</w:t>
             </w:r>
           </w:p>
         </w:tc>
@@ -25233,46 +25350,46 @@
                 <w:color w:val="0F2038"/>
                 <w:sz w:val="21"/>
               </w:rPr>
-              <w:t>What coordinated planning looks like before year-end</w:t>
-            </w:r>
-          </w:p>
-          <w:p>
-            <w:pPr>
-              <w:spacing w:after="80"/>
-            </w:pPr>
-            <w:r>
-              <w:rPr>
-                <w:rFonts w:ascii="Calibri" w:hAnsi="Calibri"/>
-                <w:color w:val="425B72"/>
-                <w:sz w:val="19"/>
-              </w:rPr>
-              <w:t>DETAIL LABEL: Coordination series preview</w:t>
-            </w:r>
-          </w:p>
-          <w:p>
-            <w:pPr>
-              <w:spacing w:after="80"/>
-            </w:pPr>
-            <w:r>
-              <w:rPr>
-                <w:rFonts w:ascii="Calibri" w:hAnsi="Calibri"/>
-                <w:color w:val="425B72"/>
-                <w:sz w:val="19"/>
-              </w:rPr>
-              <w:t>Assign the decision, the owner, and the deadline before the calendar gets crowded.</w:t>
-            </w:r>
-          </w:p>
-          <w:p>
-            <w:pPr>
-              <w:spacing w:after="80"/>
-            </w:pPr>
-            <w:r>
-              <w:rPr>
-                <w:rFonts w:ascii="Calibri" w:hAnsi="Calibri"/>
-                <w:color w:val="425B72"/>
-                <w:sz w:val="19"/>
-              </w:rPr>
-              <w:t>View episode page</w:t>
+              <w:t>Does the estate plan still match what the family owns?</w:t>
+            </w:r>
+          </w:p>
+          <w:p>
+            <w:pPr>
+              <w:spacing w:after="80"/>
+            </w:pPr>
+            <w:r>
+              <w:rPr>
+                <w:rFonts w:ascii="Calibri" w:hAnsi="Calibri"/>
+                <w:color w:val="425B72"/>
+                <w:sz w:val="19"/>
+              </w:rPr>
+              <w:t>DETAIL LABEL: Family review · 5 min</w:t>
+            </w:r>
+          </w:p>
+          <w:p>
+            <w:pPr>
+              <w:spacing w:after="80"/>
+            </w:pPr>
+            <w:r>
+              <w:rPr>
+                <w:rFonts w:ascii="Calibri" w:hAnsi="Calibri"/>
+                <w:color w:val="425B72"/>
+                <w:sz w:val="19"/>
+              </w:rPr>
+              <w:t>Review funding, beneficiaries, decision makers, and family communication after wealth changes.</w:t>
+            </w:r>
+          </w:p>
+          <w:p>
+            <w:pPr>
+              <w:spacing w:after="80"/>
+            </w:pPr>
+            <w:r>
+              <w:rPr>
+                <w:rFonts w:ascii="Calibri" w:hAnsi="Calibri"/>
+                <w:color w:val="425B72"/>
+                <w:sz w:val="19"/>
+              </w:rPr>
+              <w:t>Explore topic</w:t>
             </w:r>
           </w:p>
         </w:tc>
@@ -25424,46 +25541,46 @@
                 <w:color w:val="0F2038"/>
                 <w:sz w:val="21"/>
               </w:rPr>
-              <w:t>Five questions to ask before responding to an offer</w:t>
-            </w:r>
-          </w:p>
-          <w:p>
-            <w:pPr>
-              <w:spacing w:after="80"/>
-            </w:pPr>
-            <w:r>
-              <w:rPr>
-                <w:rFonts w:ascii="Calibri" w:hAnsi="Calibri"/>
-                <w:color w:val="425B72"/>
-                <w:sz w:val="19"/>
-              </w:rPr>
-              <w:t>DETAIL LABEL: Business transition series preview</w:t>
-            </w:r>
-          </w:p>
-          <w:p>
-            <w:pPr>
-              <w:spacing w:after="80"/>
-            </w:pPr>
-            <w:r>
-              <w:rPr>
-                <w:rFonts w:ascii="Calibri" w:hAnsi="Calibri"/>
-                <w:color w:val="425B72"/>
-                <w:sz w:val="19"/>
-              </w:rPr>
-              <w:t>Separate valuation, taxes, family goals, and deal timing before momentum makes the choice.</w:t>
-            </w:r>
-          </w:p>
-          <w:p>
-            <w:pPr>
-              <w:spacing w:after="80"/>
-            </w:pPr>
-            <w:r>
-              <w:rPr>
-                <w:rFonts w:ascii="Calibri" w:hAnsi="Calibri"/>
-                <w:color w:val="425B72"/>
-                <w:sz w:val="19"/>
-              </w:rPr>
-              <w:t>View episode notes</w:t>
+              <w:t>The decisions hiding inside an RSU vest</w:t>
+            </w:r>
+          </w:p>
+          <w:p>
+            <w:pPr>
+              <w:spacing w:after="80"/>
+            </w:pPr>
+            <w:r>
+              <w:rPr>
+                <w:rFonts w:ascii="Calibri" w:hAnsi="Calibri"/>
+                <w:color w:val="425B72"/>
+                <w:sz w:val="19"/>
+              </w:rPr>
+              <w:t>DETAIL LABEL: Podcast · Preview</w:t>
+            </w:r>
+          </w:p>
+          <w:p>
+            <w:pPr>
+              <w:spacing w:after="80"/>
+            </w:pPr>
+            <w:r>
+              <w:rPr>
+                <w:rFonts w:ascii="Calibri" w:hAnsi="Calibri"/>
+                <w:color w:val="425B72"/>
+                <w:sz w:val="19"/>
+              </w:rPr>
+              <w:t>Withholding is only one part of the decision. Concentration and cash flow still need a plan.</w:t>
+            </w:r>
+          </w:p>
+          <w:p>
+            <w:pPr>
+              <w:spacing w:after="80"/>
+            </w:pPr>
+            <w:r>
+              <w:rPr>
+                <w:rFonts w:ascii="Calibri" w:hAnsi="Calibri"/>
+                <w:color w:val="425B72"/>
+                <w:sz w:val="19"/>
+              </w:rPr>
+              <w:t>Listen to the podcast</w:t>
             </w:r>
           </w:p>
         </w:tc>
@@ -25615,6 +25732,566 @@
                 <w:color w:val="0F2038"/>
                 <w:sz w:val="21"/>
               </w:rPr>
+              <w:t>Listen to the Anchor Wealth Podcast.</w:t>
+            </w:r>
+          </w:p>
+          <w:p>
+            <w:pPr>
+              <w:spacing w:after="80"/>
+            </w:pPr>
+            <w:r>
+              <w:rPr>
+                <w:rFonts w:ascii="Calibri" w:hAnsi="Calibri"/>
+                <w:color w:val="425B72"/>
+                <w:sz w:val="19"/>
+              </w:rPr>
+              <w:t>SECTION LABEL: The podcast</w:t>
+            </w:r>
+          </w:p>
+          <w:p>
+            <w:pPr>
+              <w:spacing w:after="80"/>
+            </w:pPr>
+            <w:r>
+              <w:rPr>
+                <w:rFonts w:ascii="Calibri" w:hAnsi="Calibri"/>
+                <w:color w:val="425B72"/>
+                <w:sz w:val="19"/>
+              </w:rPr>
+              <w:t>Short, focused conversations. Every episode page includes written notes, a conversation map, and related reading.</w:t>
+            </w:r>
+          </w:p>
+        </w:tc>
+        <w:tc>
+          <w:tcPr>
+            <w:tcW w:type="dxa" w:w="6986"/>
+            <w:shd w:fill="FFF9ED"/>
+          </w:tcPr>
+          <w:p>
+            <w:pPr>
+              <w:spacing w:after="60"/>
+            </w:pPr>
+            <w:r/>
+          </w:p>
+          <w:p>
+            <w:pPr>
+              <w:spacing w:before="0" w:after="80"/>
+            </w:pPr>
+            <w:r>
+              <w:rPr>
+                <w:rFonts w:ascii="Calibri" w:hAnsi="Calibri"/>
+                <w:b/>
+                <w:color w:val="2D5474"/>
+                <w:sz w:val="15"/>
+              </w:rPr>
+              <w:t>DECISION</w:t>
+            </w:r>
+          </w:p>
+          <w:p>
+            <w:pPr>
+              <w:spacing w:after="100"/>
+            </w:pPr>
+            <w:r>
+              <w:rPr>
+                <w:rFonts w:ascii="Calibri" w:hAnsi="Calibri"/>
+                <w:b/>
+                <w:color w:val="0F2038"/>
+                <w:sz w:val="19"/>
+              </w:rPr>
+              <w:t>Keep  /  Edit  /  Replace</w:t>
+            </w:r>
+          </w:p>
+          <w:p>
+            <w:pPr>
+              <w:spacing w:after="160"/>
+            </w:pPr>
+            <w:r>
+              <w:rPr>
+                <w:rFonts w:ascii="Calibri" w:hAnsi="Calibri"/>
+                <w:i/>
+                <w:color w:val="425B72"/>
+                <w:sz w:val="17"/>
+              </w:rPr>
+              <w:t>Keep, edit, or replace this copy.</w:t>
+            </w:r>
+          </w:p>
+          <w:p>
+            <w:pPr>
+              <w:spacing w:after="80"/>
+            </w:pPr>
+            <w:r>
+              <w:rPr>
+                <w:rFonts w:ascii="Calibri" w:hAnsi="Calibri"/>
+                <w:b/>
+                <w:color w:val="2D5474"/>
+                <w:sz w:val="17"/>
+              </w:rPr>
+              <w:t>Alex's replacement copy or notes:</w:t>
+            </w:r>
+          </w:p>
+          <w:p>
+            <w:pPr>
+              <w:spacing w:after="180"/>
+            </w:pPr>
+            <w:r>
+              <w:rPr>
+                <w:rFonts w:ascii="Calibri" w:hAnsi="Calibri"/>
+                <w:color w:val="425B72"/>
+                <w:sz w:val="19"/>
+              </w:rPr>
+              <w:t xml:space="preserve"> </w:t>
+            </w:r>
+          </w:p>
+          <w:p>
+            <w:pPr>
+              <w:spacing w:after="180"/>
+            </w:pPr>
+            <w:r>
+              <w:rPr>
+                <w:rFonts w:ascii="Calibri" w:hAnsi="Calibri"/>
+                <w:color w:val="425B72"/>
+                <w:sz w:val="19"/>
+              </w:rPr>
+              <w:t xml:space="preserve"> </w:t>
+            </w:r>
+          </w:p>
+          <w:p>
+            <w:pPr>
+              <w:spacing w:after="180"/>
+            </w:pPr>
+            <w:r>
+              <w:rPr>
+                <w:rFonts w:ascii="Calibri" w:hAnsi="Calibri"/>
+                <w:color w:val="425B72"/>
+                <w:sz w:val="19"/>
+              </w:rPr>
+              <w:t xml:space="preserve"> </w:t>
+            </w:r>
+          </w:p>
+        </w:tc>
+      </w:tr>
+      <w:tr>
+        <w:trPr>
+          <w:cantSplit w:val="true"/>
+        </w:trPr>
+        <w:tc>
+          <w:tcPr>
+            <w:tcW w:type="dxa" w:w="6986"/>
+            <w:shd w:fill="FFFFFF"/>
+          </w:tcPr>
+          <w:p>
+            <w:pPr>
+              <w:spacing w:after="60"/>
+            </w:pPr>
+            <w:r/>
+          </w:p>
+          <w:p>
+            <w:pPr>
+              <w:spacing w:before="0" w:after="80"/>
+            </w:pPr>
+            <w:r>
+              <w:rPr>
+                <w:rFonts w:ascii="Calibri" w:hAnsi="Calibri"/>
+                <w:b/>
+                <w:color w:val="B18F4D"/>
+                <w:sz w:val="15"/>
+              </w:rPr>
+              <w:t>SECTION / COPY BLOCK</w:t>
+            </w:r>
+          </w:p>
+          <w:p>
+            <w:pPr>
+              <w:spacing w:after="100"/>
+            </w:pPr>
+            <w:r>
+              <w:rPr>
+                <w:rFonts w:ascii="Calibri" w:hAnsi="Calibri"/>
+                <w:b/>
+                <w:color w:val="0F2038"/>
+                <w:sz w:val="21"/>
+              </w:rPr>
+              <w:t>What coordinated planning looks like before year-end</w:t>
+            </w:r>
+          </w:p>
+          <w:p>
+            <w:pPr>
+              <w:spacing w:after="80"/>
+            </w:pPr>
+            <w:r>
+              <w:rPr>
+                <w:rFonts w:ascii="Calibri" w:hAnsi="Calibri"/>
+                <w:color w:val="425B72"/>
+                <w:sz w:val="19"/>
+              </w:rPr>
+              <w:t>DETAIL LABEL: Coordination series preview</w:t>
+            </w:r>
+          </w:p>
+          <w:p>
+            <w:pPr>
+              <w:spacing w:after="80"/>
+            </w:pPr>
+            <w:r>
+              <w:rPr>
+                <w:rFonts w:ascii="Calibri" w:hAnsi="Calibri"/>
+                <w:color w:val="425B72"/>
+                <w:sz w:val="19"/>
+              </w:rPr>
+              <w:t>Assign the decision, the owner, and the deadline before the calendar gets crowded.</w:t>
+            </w:r>
+          </w:p>
+          <w:p>
+            <w:pPr>
+              <w:spacing w:after="80"/>
+            </w:pPr>
+            <w:r>
+              <w:rPr>
+                <w:rFonts w:ascii="Calibri" w:hAnsi="Calibri"/>
+                <w:color w:val="425B72"/>
+                <w:sz w:val="19"/>
+              </w:rPr>
+              <w:t>Listen to the podcast</w:t>
+            </w:r>
+          </w:p>
+        </w:tc>
+        <w:tc>
+          <w:tcPr>
+            <w:tcW w:type="dxa" w:w="6986"/>
+            <w:shd w:fill="FFF9ED"/>
+          </w:tcPr>
+          <w:p>
+            <w:pPr>
+              <w:spacing w:after="60"/>
+            </w:pPr>
+            <w:r/>
+          </w:p>
+          <w:p>
+            <w:pPr>
+              <w:spacing w:before="0" w:after="80"/>
+            </w:pPr>
+            <w:r>
+              <w:rPr>
+                <w:rFonts w:ascii="Calibri" w:hAnsi="Calibri"/>
+                <w:b/>
+                <w:color w:val="2D5474"/>
+                <w:sz w:val="15"/>
+              </w:rPr>
+              <w:t>DECISION</w:t>
+            </w:r>
+          </w:p>
+          <w:p>
+            <w:pPr>
+              <w:spacing w:after="100"/>
+            </w:pPr>
+            <w:r>
+              <w:rPr>
+                <w:rFonts w:ascii="Calibri" w:hAnsi="Calibri"/>
+                <w:b/>
+                <w:color w:val="0F2038"/>
+                <w:sz w:val="19"/>
+              </w:rPr>
+              <w:t>Keep  /  Edit  /  Replace</w:t>
+            </w:r>
+          </w:p>
+          <w:p>
+            <w:pPr>
+              <w:spacing w:after="160"/>
+            </w:pPr>
+            <w:r>
+              <w:rPr>
+                <w:rFonts w:ascii="Calibri" w:hAnsi="Calibri"/>
+                <w:i/>
+                <w:color w:val="425B72"/>
+                <w:sz w:val="17"/>
+              </w:rPr>
+              <w:t>Keep, edit, or replace this copy.</w:t>
+            </w:r>
+          </w:p>
+          <w:p>
+            <w:pPr>
+              <w:spacing w:after="80"/>
+            </w:pPr>
+            <w:r>
+              <w:rPr>
+                <w:rFonts w:ascii="Calibri" w:hAnsi="Calibri"/>
+                <w:b/>
+                <w:color w:val="2D5474"/>
+                <w:sz w:val="17"/>
+              </w:rPr>
+              <w:t>Alex's replacement copy or notes:</w:t>
+            </w:r>
+          </w:p>
+          <w:p>
+            <w:pPr>
+              <w:spacing w:after="180"/>
+            </w:pPr>
+            <w:r>
+              <w:rPr>
+                <w:rFonts w:ascii="Calibri" w:hAnsi="Calibri"/>
+                <w:color w:val="425B72"/>
+                <w:sz w:val="19"/>
+              </w:rPr>
+              <w:t xml:space="preserve"> </w:t>
+            </w:r>
+          </w:p>
+          <w:p>
+            <w:pPr>
+              <w:spacing w:after="180"/>
+            </w:pPr>
+            <w:r>
+              <w:rPr>
+                <w:rFonts w:ascii="Calibri" w:hAnsi="Calibri"/>
+                <w:color w:val="425B72"/>
+                <w:sz w:val="19"/>
+              </w:rPr>
+              <w:t xml:space="preserve"> </w:t>
+            </w:r>
+          </w:p>
+          <w:p>
+            <w:pPr>
+              <w:spacing w:after="180"/>
+            </w:pPr>
+            <w:r>
+              <w:rPr>
+                <w:rFonts w:ascii="Calibri" w:hAnsi="Calibri"/>
+                <w:color w:val="425B72"/>
+                <w:sz w:val="19"/>
+              </w:rPr>
+              <w:t xml:space="preserve"> </w:t>
+            </w:r>
+          </w:p>
+        </w:tc>
+      </w:tr>
+      <w:tr>
+        <w:trPr>
+          <w:cantSplit w:val="true"/>
+        </w:trPr>
+        <w:tc>
+          <w:tcPr>
+            <w:tcW w:type="dxa" w:w="6986"/>
+            <w:shd w:fill="FFFFFF"/>
+          </w:tcPr>
+          <w:p>
+            <w:pPr>
+              <w:spacing w:after="60"/>
+            </w:pPr>
+            <w:r/>
+          </w:p>
+          <w:p>
+            <w:pPr>
+              <w:spacing w:before="0" w:after="80"/>
+            </w:pPr>
+            <w:r>
+              <w:rPr>
+                <w:rFonts w:ascii="Calibri" w:hAnsi="Calibri"/>
+                <w:b/>
+                <w:color w:val="B18F4D"/>
+                <w:sz w:val="15"/>
+              </w:rPr>
+              <w:t>SECTION / COPY BLOCK</w:t>
+            </w:r>
+          </w:p>
+          <w:p>
+            <w:pPr>
+              <w:spacing w:after="100"/>
+            </w:pPr>
+            <w:r>
+              <w:rPr>
+                <w:rFonts w:ascii="Calibri" w:hAnsi="Calibri"/>
+                <w:b/>
+                <w:color w:val="0F2038"/>
+                <w:sz w:val="21"/>
+              </w:rPr>
+              <w:t>Five questions to ask before responding to an offer</w:t>
+            </w:r>
+          </w:p>
+          <w:p>
+            <w:pPr>
+              <w:spacing w:after="80"/>
+            </w:pPr>
+            <w:r>
+              <w:rPr>
+                <w:rFonts w:ascii="Calibri" w:hAnsi="Calibri"/>
+                <w:color w:val="425B72"/>
+                <w:sz w:val="19"/>
+              </w:rPr>
+              <w:t>DETAIL LABEL: Business transition series preview</w:t>
+            </w:r>
+          </w:p>
+          <w:p>
+            <w:pPr>
+              <w:spacing w:after="80"/>
+            </w:pPr>
+            <w:r>
+              <w:rPr>
+                <w:rFonts w:ascii="Calibri" w:hAnsi="Calibri"/>
+                <w:color w:val="425B72"/>
+                <w:sz w:val="19"/>
+              </w:rPr>
+              <w:t>Separate valuation, taxes, family goals, and deal timing before momentum makes the choice.</w:t>
+            </w:r>
+          </w:p>
+          <w:p>
+            <w:pPr>
+              <w:spacing w:after="80"/>
+            </w:pPr>
+            <w:r>
+              <w:rPr>
+                <w:rFonts w:ascii="Calibri" w:hAnsi="Calibri"/>
+                <w:color w:val="425B72"/>
+                <w:sz w:val="19"/>
+              </w:rPr>
+              <w:t>Listen to the podcast</w:t>
+            </w:r>
+          </w:p>
+        </w:tc>
+        <w:tc>
+          <w:tcPr>
+            <w:tcW w:type="dxa" w:w="6986"/>
+            <w:shd w:fill="FFF9ED"/>
+          </w:tcPr>
+          <w:p>
+            <w:pPr>
+              <w:spacing w:after="60"/>
+            </w:pPr>
+            <w:r/>
+          </w:p>
+          <w:p>
+            <w:pPr>
+              <w:spacing w:before="0" w:after="80"/>
+            </w:pPr>
+            <w:r>
+              <w:rPr>
+                <w:rFonts w:ascii="Calibri" w:hAnsi="Calibri"/>
+                <w:b/>
+                <w:color w:val="2D5474"/>
+                <w:sz w:val="15"/>
+              </w:rPr>
+              <w:t>DECISION</w:t>
+            </w:r>
+          </w:p>
+          <w:p>
+            <w:pPr>
+              <w:spacing w:after="100"/>
+            </w:pPr>
+            <w:r>
+              <w:rPr>
+                <w:rFonts w:ascii="Calibri" w:hAnsi="Calibri"/>
+                <w:b/>
+                <w:color w:val="0F2038"/>
+                <w:sz w:val="19"/>
+              </w:rPr>
+              <w:t>Keep  /  Edit  /  Replace</w:t>
+            </w:r>
+          </w:p>
+          <w:p>
+            <w:pPr>
+              <w:spacing w:after="160"/>
+            </w:pPr>
+            <w:r>
+              <w:rPr>
+                <w:rFonts w:ascii="Calibri" w:hAnsi="Calibri"/>
+                <w:i/>
+                <w:color w:val="425B72"/>
+                <w:sz w:val="17"/>
+              </w:rPr>
+              <w:t>Keep, edit, or replace this copy.</w:t>
+            </w:r>
+          </w:p>
+          <w:p>
+            <w:pPr>
+              <w:spacing w:after="80"/>
+            </w:pPr>
+            <w:r>
+              <w:rPr>
+                <w:rFonts w:ascii="Calibri" w:hAnsi="Calibri"/>
+                <w:b/>
+                <w:color w:val="2D5474"/>
+                <w:sz w:val="17"/>
+              </w:rPr>
+              <w:t>Alex's replacement copy or notes:</w:t>
+            </w:r>
+          </w:p>
+          <w:p>
+            <w:pPr>
+              <w:spacing w:after="180"/>
+            </w:pPr>
+            <w:r>
+              <w:rPr>
+                <w:rFonts w:ascii="Calibri" w:hAnsi="Calibri"/>
+                <w:color w:val="425B72"/>
+                <w:sz w:val="19"/>
+              </w:rPr>
+              <w:t xml:space="preserve"> </w:t>
+            </w:r>
+          </w:p>
+          <w:p>
+            <w:pPr>
+              <w:spacing w:after="180"/>
+            </w:pPr>
+            <w:r>
+              <w:rPr>
+                <w:rFonts w:ascii="Calibri" w:hAnsi="Calibri"/>
+                <w:color w:val="425B72"/>
+                <w:sz w:val="19"/>
+              </w:rPr>
+              <w:t xml:space="preserve"> </w:t>
+            </w:r>
+          </w:p>
+          <w:p>
+            <w:pPr>
+              <w:spacing w:after="180"/>
+            </w:pPr>
+            <w:r>
+              <w:rPr>
+                <w:rFonts w:ascii="Calibri" w:hAnsi="Calibri"/>
+                <w:color w:val="425B72"/>
+                <w:sz w:val="19"/>
+              </w:rPr>
+              <w:t xml:space="preserve"> </w:t>
+            </w:r>
+          </w:p>
+        </w:tc>
+      </w:tr>
+      <w:tr>
+        <w:trPr>
+          <w:cantSplit w:val="true"/>
+        </w:trPr>
+        <w:tc>
+          <w:tcPr>
+            <w:tcW w:type="dxa" w:w="6986"/>
+            <w:shd w:fill="FFFFFF"/>
+          </w:tcPr>
+          <w:p>
+            <w:pPr>
+              <w:spacing w:after="60"/>
+            </w:pPr>
+            <w:r/>
+          </w:p>
+          <w:p>
+            <w:pPr>
+              <w:spacing w:before="0" w:after="80"/>
+            </w:pPr>
+            <w:r>
+              <w:rPr>
+                <w:rFonts w:ascii="Calibri" w:hAnsi="Calibri"/>
+                <w:b/>
+                <w:color w:val="B18F4D"/>
+                <w:sz w:val="15"/>
+              </w:rPr>
+              <w:t>SECTION / COPY BLOCK</w:t>
+            </w:r>
+          </w:p>
+          <w:p>
+            <w:pPr>
+              <w:spacing w:after="100"/>
+            </w:pPr>
+            <w:r>
+              <w:rPr>
+                <w:rFonts w:ascii="Calibri" w:hAnsi="Calibri"/>
+                <w:b/>
+                <w:color w:val="0F2038"/>
+                <w:sz w:val="21"/>
+              </w:rPr>
               <w:t>The decisions hiding inside an RSU vest</w:t>
             </w:r>
           </w:p>
@@ -25654,7 +26331,7 @@
                 <w:color w:val="425B72"/>
                 <w:sz w:val="19"/>
               </w:rPr>
-              <w:t>Read the briefing</w:t>
+              <w:t>Listen to the podcast</w:t>
             </w:r>
           </w:p>
         </w:tc>
@@ -26162,20 +26839,20 @@
                 <w:color w:val="425B72"/>
                 <w:sz w:val="19"/>
               </w:rPr>
-              <w:t>SOCIAL DESCRIPTION: The vest, the withholding, and the first open trading window may happen on three different clocks.</w:t>
-            </w:r>
-          </w:p>
-          <w:p>
-            <w:pPr>
-              <w:spacing w:after="80"/>
-            </w:pPr>
-            <w:r>
-              <w:rPr>
-                <w:rFonts w:ascii="Calibri" w:hAnsi="Calibri"/>
-                <w:color w:val="425B72"/>
-                <w:sz w:val="19"/>
-              </w:rPr>
-              <w:t>STRUCTURED DATA: BlogPosting · How RSU Vesting Creates a Tax-Timing Trap · How RSU vesting, withholding, trading windows, and concentration risk can collide. · Alex Miller · 2026-07-17 | BreadcrumbList</w:t>
+              <w:t>SOCIAL DESCRIPTION: Plan for RSU income recognition, 2026 withholding, trading windows, and concentration risk before the shares settle.</w:t>
+            </w:r>
+          </w:p>
+          <w:p>
+            <w:pPr>
+              <w:spacing w:after="80"/>
+            </w:pPr>
+            <w:r>
+              <w:rPr>
+                <w:rFonts w:ascii="Calibri" w:hAnsi="Calibri"/>
+                <w:color w:val="425B72"/>
+                <w:sz w:val="19"/>
+              </w:rPr>
+              <w:t>STRUCTURED DATA: BlogPosting · How RSU Vesting Creates a Tax-Timing Trap · How RSU vesting, withholding, trading windows, and concentration risk can collide. · Alex Miller · 2026-07-17 | BreadcrumbList | FAQPage</w:t>
             </w:r>
           </w:p>
         </w:tc>
@@ -26340,19 +27017,6 @@
                 <w:color w:val="425B72"/>
                 <w:sz w:val="19"/>
               </w:rPr>
-              <w:t>IMAGE ALT: Four timelines aligning an RSU vest with tax recognition, the first open trading window, and the personal plan for the shares</w:t>
-            </w:r>
-          </w:p>
-          <w:p>
-            <w:pPr>
-              <w:spacing w:after="80"/>
-            </w:pPr>
-            <w:r>
-              <w:rPr>
-                <w:rFonts w:ascii="Calibri" w:hAnsi="Calibri"/>
-                <w:color w:val="425B72"/>
-                <w:sz w:val="19"/>
-              </w:rPr>
               <w:t>INTERFACE LABEL: Primary navigation</w:t>
             </w:r>
           </w:p>
@@ -26787,6 +27451,19 @@
                 <w:color w:val="425B72"/>
                 <w:sz w:val="19"/>
               </w:rPr>
+              <w:t>SECTION LABEL: Equity compensation · Decision briefing</w:t>
+            </w:r>
+          </w:p>
+          <w:p>
+            <w:pPr>
+              <w:spacing w:after="80"/>
+            </w:pPr>
+            <w:r>
+              <w:rPr>
+                <w:rFonts w:ascii="Calibri" w:hAnsi="Calibri"/>
+                <w:color w:val="425B72"/>
+                <w:sz w:val="19"/>
+              </w:rPr>
               <w:t>The vest, the tax withholding, and the first open trading window may happen on three different clocks. Your plan has to connect them before the shares arrive.</w:t>
             </w:r>
           </w:p>
@@ -26965,111 +27642,20 @@
                 <w:color w:val="425B72"/>
                 <w:sz w:val="19"/>
               </w:rPr>
-              <w:t>Published July 17, 2026 · 6 minute read</w:t>
-            </w:r>
-          </w:p>
-          <w:p>
-            <w:pPr>
-              <w:spacing w:after="80"/>
-            </w:pPr>
-            <w:r>
-              <w:rPr>
-                <w:rFonts w:ascii="Calibri" w:hAnsi="Calibri"/>
-                <w:color w:val="425B72"/>
-                <w:sz w:val="19"/>
-              </w:rPr>
-              <w:t>On this page</w:t>
-            </w:r>
-          </w:p>
-          <w:p>
-            <w:pPr>
-              <w:spacing w:after="80"/>
-            </w:pPr>
-            <w:r>
-              <w:rPr>
-                <w:rFonts w:ascii="Calibri" w:hAnsi="Calibri"/>
-                <w:color w:val="425B72"/>
-                <w:sz w:val="19"/>
-              </w:rPr>
-              <w:t>CTA / LINK: Short answer</w:t>
-            </w:r>
-          </w:p>
-          <w:p>
-            <w:pPr>
-              <w:spacing w:after="80"/>
-            </w:pPr>
-            <w:r>
-              <w:rPr>
-                <w:rFonts w:ascii="Calibri" w:hAnsi="Calibri"/>
-                <w:color w:val="425B72"/>
-                <w:sz w:val="19"/>
-              </w:rPr>
-              <w:t>CTA / LINK: What happens at vest</w:t>
-            </w:r>
-          </w:p>
-          <w:p>
-            <w:pPr>
-              <w:spacing w:after="80"/>
-            </w:pPr>
-            <w:r>
-              <w:rPr>
-                <w:rFonts w:ascii="Calibri" w:hAnsi="Calibri"/>
-                <w:color w:val="425B72"/>
-                <w:sz w:val="19"/>
-              </w:rPr>
-              <w:t>CTA / LINK: The withholding gap</w:t>
-            </w:r>
-          </w:p>
-          <w:p>
-            <w:pPr>
-              <w:spacing w:after="80"/>
-            </w:pPr>
-            <w:r>
-              <w:rPr>
-                <w:rFonts w:ascii="Calibri" w:hAnsi="Calibri"/>
-                <w:color w:val="425B72"/>
-                <w:sz w:val="19"/>
-              </w:rPr>
-              <w:t>CTA / LINK: Trading windows</w:t>
-            </w:r>
-          </w:p>
-          <w:p>
-            <w:pPr>
-              <w:spacing w:after="80"/>
-            </w:pPr>
-            <w:r>
-              <w:rPr>
-                <w:rFonts w:ascii="Calibri" w:hAnsi="Calibri"/>
-                <w:color w:val="425B72"/>
-                <w:sz w:val="19"/>
-              </w:rPr>
-              <w:t>CTA / LINK: Decision sequence</w:t>
-            </w:r>
-          </w:p>
-          <w:p>
-            <w:pPr>
-              <w:spacing w:after="80"/>
-            </w:pPr>
-            <w:r>
-              <w:rPr>
-                <w:rFonts w:ascii="Calibri" w:hAnsi="Calibri"/>
-                <w:color w:val="425B72"/>
-                <w:sz w:val="19"/>
-              </w:rPr>
-              <w:t>CTA / LINK: Questions to answer</w:t>
-            </w:r>
-          </w:p>
-          <w:p>
-            <w:pPr>
-              <w:spacing w:after="80"/>
-            </w:pPr>
-            <w:r>
-              <w:rPr>
-                <w:rFonts w:ascii="Calibri" w:hAnsi="Calibri"/>
-                <w:color w:val="425B72"/>
-                <w:sz w:val="19"/>
-              </w:rPr>
-              <w:t>CTA / LINK: Sources</w:t>
+              <w:t>Published July 17, 2026 · Updated July 20, 2026 · 8 minute read</w:t>
+            </w:r>
+          </w:p>
+          <w:p>
+            <w:pPr>
+              <w:spacing w:after="80"/>
+            </w:pPr>
+            <w:r>
+              <w:rPr>
+                <w:rFonts w:ascii="Calibri" w:hAnsi="Calibri"/>
+                <w:color w:val="425B72"/>
+                <w:sz w:val="19"/>
+              </w:rPr>
+              <w:t>Your next step</w:t>
             </w:r>
           </w:p>
         </w:tc>
@@ -27221,46 +27807,176 @@
                 <w:color w:val="0F2038"/>
                 <w:sz w:val="21"/>
               </w:rPr>
-              <w:t>The short answer</w:t>
-            </w:r>
-          </w:p>
-          <w:p>
-            <w:pPr>
-              <w:spacing w:after="80"/>
-            </w:pPr>
-            <w:r>
-              <w:rPr>
-                <w:rFonts w:ascii="Calibri" w:hAnsi="Calibri"/>
-                <w:color w:val="425B72"/>
-                <w:sz w:val="19"/>
-              </w:rPr>
-              <w:t>RSUs generally create compensation income when the shares settle after vesting. Employer withholding may not equal the tax ultimately due, and a trading restriction can delay your ability to sell. The planning task is to estimate the tax, decide how much stock to retain, and identify the cash source before the vest date.</w:t>
-            </w:r>
-          </w:p>
-          <w:p>
-            <w:pPr>
-              <w:spacing w:after="80"/>
-            </w:pPr>
-            <w:r>
-              <w:rPr>
-                <w:rFonts w:ascii="Calibri" w:hAnsi="Calibri"/>
-                <w:color w:val="425B72"/>
-                <w:sz w:val="19"/>
-              </w:rPr>
-              <w:t>An RSU vest can look automatic on a statement. Shares arrive, a portion is withheld, and the rest appears in the account. The harder part is what the statement does not decide: whether the withholding is enough, when the remaining shares can be sold, how much company exposure is reasonable, and what the proceeds are meant to fund.</w:t>
-            </w:r>
-          </w:p>
-          <w:p>
-            <w:pPr>
-              <w:spacing w:after="80"/>
-            </w:pPr>
-            <w:r>
-              <w:rPr>
-                <w:rFonts w:ascii="Calibri" w:hAnsi="Calibri"/>
-                <w:color w:val="425B72"/>
-                <w:sz w:val="19"/>
-              </w:rPr>
-              <w:t>IMAGE CAPTION: Illustrative planning map. Actual settlement, withholding, and trading restrictions depend on the employer plan and the individual situation.</w:t>
+              <w:t>Bring the whole decision into one conversation.</w:t>
+            </w:r>
+          </w:p>
+          <w:p>
+            <w:pPr>
+              <w:spacing w:after="80"/>
+            </w:pPr>
+            <w:r>
+              <w:rPr>
+                <w:rFonts w:ascii="Calibri" w:hAnsi="Calibri"/>
+                <w:color w:val="425B72"/>
+                <w:sz w:val="19"/>
+              </w:rPr>
+              <w:t>See whether Anchor’s planning process fits the complexity and timing of your situation.</w:t>
+            </w:r>
+          </w:p>
+          <w:p>
+            <w:pPr>
+              <w:spacing w:after="80"/>
+            </w:pPr>
+            <w:r>
+              <w:rPr>
+                <w:rFonts w:ascii="Calibri" w:hAnsi="Calibri"/>
+                <w:color w:val="425B72"/>
+                <w:sz w:val="19"/>
+              </w:rPr>
+              <w:t>CTA / LINK: Take the Fit Check</w:t>
+            </w:r>
+          </w:p>
+          <w:p>
+            <w:pPr>
+              <w:spacing w:after="80"/>
+            </w:pPr>
+            <w:r>
+              <w:rPr>
+                <w:rFonts w:ascii="Calibri" w:hAnsi="Calibri"/>
+                <w:color w:val="425B72"/>
+                <w:sz w:val="19"/>
+              </w:rPr>
+              <w:t>On this page</w:t>
+            </w:r>
+          </w:p>
+          <w:p>
+            <w:pPr>
+              <w:spacing w:after="80"/>
+            </w:pPr>
+            <w:r>
+              <w:rPr>
+                <w:rFonts w:ascii="Calibri" w:hAnsi="Calibri"/>
+                <w:color w:val="425B72"/>
+                <w:sz w:val="19"/>
+              </w:rPr>
+              <w:t>CTA / LINK: Short answer</w:t>
+            </w:r>
+          </w:p>
+          <w:p>
+            <w:pPr>
+              <w:spacing w:after="80"/>
+            </w:pPr>
+            <w:r>
+              <w:rPr>
+                <w:rFonts w:ascii="Calibri" w:hAnsi="Calibri"/>
+                <w:color w:val="425B72"/>
+                <w:sz w:val="19"/>
+              </w:rPr>
+              <w:t>CTA / LINK: What happens at vest</w:t>
+            </w:r>
+          </w:p>
+          <w:p>
+            <w:pPr>
+              <w:spacing w:after="80"/>
+            </w:pPr>
+            <w:r>
+              <w:rPr>
+                <w:rFonts w:ascii="Calibri" w:hAnsi="Calibri"/>
+                <w:color w:val="425B72"/>
+                <w:sz w:val="19"/>
+              </w:rPr>
+              <w:t>CTA / LINK: The withholding gap</w:t>
+            </w:r>
+          </w:p>
+          <w:p>
+            <w:pPr>
+              <w:spacing w:after="80"/>
+            </w:pPr>
+            <w:r>
+              <w:rPr>
+                <w:rFonts w:ascii="Calibri" w:hAnsi="Calibri"/>
+                <w:color w:val="425B72"/>
+                <w:sz w:val="19"/>
+              </w:rPr>
+              <w:t>CTA / LINK: Trading windows</w:t>
+            </w:r>
+          </w:p>
+          <w:p>
+            <w:pPr>
+              <w:spacing w:after="80"/>
+            </w:pPr>
+            <w:r>
+              <w:rPr>
+                <w:rFonts w:ascii="Calibri" w:hAnsi="Calibri"/>
+                <w:color w:val="425B72"/>
+                <w:sz w:val="19"/>
+              </w:rPr>
+              <w:t>CTA / LINK: Decision sequence</w:t>
+            </w:r>
+          </w:p>
+          <w:p>
+            <w:pPr>
+              <w:spacing w:after="80"/>
+            </w:pPr>
+            <w:r>
+              <w:rPr>
+                <w:rFonts w:ascii="Calibri" w:hAnsi="Calibri"/>
+                <w:color w:val="425B72"/>
+                <w:sz w:val="19"/>
+              </w:rPr>
+              <w:t>CTA / LINK: Documents to gather</w:t>
+            </w:r>
+          </w:p>
+          <w:p>
+            <w:pPr>
+              <w:spacing w:after="80"/>
+            </w:pPr>
+            <w:r>
+              <w:rPr>
+                <w:rFonts w:ascii="Calibri" w:hAnsi="Calibri"/>
+                <w:color w:val="425B72"/>
+                <w:sz w:val="19"/>
+              </w:rPr>
+              <w:t>CTA / LINK: Questions to answer</w:t>
+            </w:r>
+          </w:p>
+          <w:p>
+            <w:pPr>
+              <w:spacing w:after="80"/>
+            </w:pPr>
+            <w:r>
+              <w:rPr>
+                <w:rFonts w:ascii="Calibri" w:hAnsi="Calibri"/>
+                <w:color w:val="425B72"/>
+                <w:sz w:val="19"/>
+              </w:rPr>
+              <w:t>CTA / LINK: RSU FAQ</w:t>
+            </w:r>
+          </w:p>
+          <w:p>
+            <w:pPr>
+              <w:spacing w:after="80"/>
+            </w:pPr>
+            <w:r>
+              <w:rPr>
+                <w:rFonts w:ascii="Calibri" w:hAnsi="Calibri"/>
+                <w:color w:val="425B72"/>
+                <w:sz w:val="19"/>
+              </w:rPr>
+              <w:t>CTA / LINK: Sources</w:t>
+            </w:r>
+          </w:p>
+          <w:p>
+            <w:pPr>
+              <w:spacing w:after="80"/>
+            </w:pPr>
+            <w:r>
+              <w:rPr>
+                <w:rFonts w:ascii="Calibri" w:hAnsi="Calibri"/>
+                <w:color w:val="425B72"/>
+                <w:sz w:val="19"/>
+              </w:rPr>
+              <w:t>CTA / LINK: Companion podcastAnchor Wealth Podcast · Episode notesListen to the podcast</w:t>
             </w:r>
           </w:p>
         </w:tc>
@@ -27314,7 +28030,7 @@
                 <w:color w:val="425B72"/>
                 <w:sz w:val="17"/>
               </w:rPr>
-              <w:t>Keep, edit, or replace this copy.</w:t>
+              <w:t>Keep the action or type the preferred CTA and next step.</w:t>
             </w:r>
           </w:p>
           <w:p>
@@ -27412,33 +28128,33 @@
                 <w:color w:val="0F2038"/>
                 <w:sz w:val="21"/>
               </w:rPr>
-              <w:t>What usually happens when RSUs vest?</w:t>
-            </w:r>
-          </w:p>
-          <w:p>
-            <w:pPr>
-              <w:spacing w:after="80"/>
-            </w:pPr>
-            <w:r>
-              <w:rPr>
-                <w:rFonts w:ascii="Calibri" w:hAnsi="Calibri"/>
-                <w:color w:val="425B72"/>
-                <w:sz w:val="19"/>
-              </w:rPr>
-              <w:t>Restricted stock units are a promise to deliver shares or cash after specified conditions are met. For many public-company plans, ordinary compensation income is recognized when vested units settle and the shares are delivered. The amount is generally tied to the fair market value at that time and is commonly reported through payroll.</w:t>
-            </w:r>
-          </w:p>
-          <w:p>
-            <w:pPr>
-              <w:spacing w:after="80"/>
-            </w:pPr>
-            <w:r>
-              <w:rPr>
-                <w:rFonts w:ascii="Calibri" w:hAnsi="Calibri"/>
-                <w:color w:val="425B72"/>
-                <w:sz w:val="19"/>
-              </w:rPr>
-              <w:t>The grant document controls the actual mechanics. Settlement can occur on the vest date or later, and private-company plans can involve additional rules. That is why the first planning document should be the award agreement, not the brokerage statement.</w:t>
+              <w:t>The short answer</w:t>
+            </w:r>
+          </w:p>
+          <w:p>
+            <w:pPr>
+              <w:spacing w:after="80"/>
+            </w:pPr>
+            <w:r>
+              <w:rPr>
+                <w:rFonts w:ascii="Calibri" w:hAnsi="Calibri"/>
+                <w:color w:val="425B72"/>
+                <w:sz w:val="19"/>
+              </w:rPr>
+              <w:t>RSUs generally create compensation income when the shares settle after vesting. Employer withholding may not equal the tax ultimately due, and a trading restriction can delay your ability to sell. The planning task is to estimate the tax, decide how much stock to retain, and identify the cash source before the vest date.</w:t>
+            </w:r>
+          </w:p>
+          <w:p>
+            <w:pPr>
+              <w:spacing w:after="80"/>
+            </w:pPr>
+            <w:r>
+              <w:rPr>
+                <w:rFonts w:ascii="Calibri" w:hAnsi="Calibri"/>
+                <w:color w:val="425B72"/>
+                <w:sz w:val="19"/>
+              </w:rPr>
+              <w:t>An RSU vest can look automatic on a statement. Shares arrive, a portion is withheld, and the rest appears in the account. The harder part is what the statement does not decide: whether the withholding is enough, when the remaining shares can be sold, how much company exposure is reasonable, and what the proceeds are meant to fund.</w:t>
             </w:r>
           </w:p>
         </w:tc>
@@ -27590,46 +28306,7 @@
                 <w:color w:val="0F2038"/>
                 <w:sz w:val="21"/>
               </w:rPr>
-              <w:t>Why can withholding differ from the final tax?</w:t>
-            </w:r>
-          </w:p>
-          <w:p>
-            <w:pPr>
-              <w:spacing w:after="80"/>
-            </w:pPr>
-            <w:r>
-              <w:rPr>
-                <w:rFonts w:ascii="Calibri" w:hAnsi="Calibri"/>
-                <w:color w:val="425B72"/>
-                <w:sz w:val="19"/>
-              </w:rPr>
-              <w:t>Employer withholding is a prepayment, not a final calculation of the household tax return. Under the IRS supplemental wage rules, an employer may use a flat withholding method in certain situations. For 2026, the flat rate is 22 percent for separately identified supplemental wages up to the applicable threshold. Your marginal rate, deductions, other compensation, spouse income, and prior estimated payments can produce a different final result.</w:t>
-            </w:r>
-          </w:p>
-          <w:p>
-            <w:pPr>
-              <w:spacing w:after="80"/>
-            </w:pPr>
-            <w:r>
-              <w:rPr>
-                <w:rFonts w:ascii="Calibri" w:hAnsi="Calibri"/>
-                <w:color w:val="425B72"/>
-                <w:sz w:val="19"/>
-              </w:rPr>
-              <w:t>The useful question is not simply, “Were taxes withheld?” It is, “After all income is included, what liability is this vest expected to create, and where will the difference come from?” That estimate belongs with the CPA before the vest, not after the filing deadline.</w:t>
-            </w:r>
-          </w:p>
-          <w:p>
-            <w:pPr>
-              <w:spacing w:after="80"/>
-            </w:pPr>
-            <w:r>
-              <w:rPr>
-                <w:rFonts w:ascii="Calibri" w:hAnsi="Calibri"/>
-                <w:color w:val="425B72"/>
-                <w:sz w:val="19"/>
-              </w:rPr>
-              <w:t>Planning question: If the stock price falls after vesting but before you can sell, which cash account will cover any additional tax due?</w:t>
+              <w:t>Four decisions arrive with one vest</w:t>
             </w:r>
           </w:p>
         </w:tc>
@@ -27781,33 +28458,33 @@
                 <w:color w:val="0F2038"/>
                 <w:sz w:val="21"/>
               </w:rPr>
-              <w:t>The tax date and the liquidity date may be different</w:t>
-            </w:r>
-          </w:p>
-          <w:p>
-            <w:pPr>
-              <w:spacing w:after="80"/>
-            </w:pPr>
-            <w:r>
-              <w:rPr>
-                <w:rFonts w:ascii="Calibri" w:hAnsi="Calibri"/>
-                <w:color w:val="425B72"/>
-                <w:sz w:val="19"/>
-              </w:rPr>
-              <w:t>Executives and other insiders can face company trading windows, blackout periods, and preclearance requirements. A tax event can occur even when a discretionary sale is not available. That gap leaves the household exposed to price movement while a known cash obligation is forming.</w:t>
-            </w:r>
-          </w:p>
-          <w:p>
-            <w:pPr>
-              <w:spacing w:after="80"/>
-            </w:pPr>
-            <w:r>
-              <w:rPr>
-                <w:rFonts w:ascii="Calibri" w:hAnsi="Calibri"/>
-                <w:color w:val="425B72"/>
-                <w:sz w:val="19"/>
-              </w:rPr>
-              <w:t>This is especially important when salary, annual bonus, deferred compensation, retirement benefits, and equity all depend on the same company or industry. The position is not just an investment holding. It is part of a wider employment and balance-sheet exposure.</w:t>
+              <w:t>What usually happens when RSUs vest?</w:t>
+            </w:r>
+          </w:p>
+          <w:p>
+            <w:pPr>
+              <w:spacing w:after="80"/>
+            </w:pPr>
+            <w:r>
+              <w:rPr>
+                <w:rFonts w:ascii="Calibri" w:hAnsi="Calibri"/>
+                <w:color w:val="425B72"/>
+                <w:sz w:val="19"/>
+              </w:rPr>
+              <w:t>Restricted stock units are a promise to deliver shares or cash after specified conditions are met. For many public-company plans, ordinary compensation income is recognized when vested units settle and the shares are delivered. The amount is generally tied to the fair market value at that time and is commonly reported through payroll.</w:t>
+            </w:r>
+          </w:p>
+          <w:p>
+            <w:pPr>
+              <w:spacing w:after="80"/>
+            </w:pPr>
+            <w:r>
+              <w:rPr>
+                <w:rFonts w:ascii="Calibri" w:hAnsi="Calibri"/>
+                <w:color w:val="425B72"/>
+                <w:sz w:val="19"/>
+              </w:rPr>
+              <w:t>The grant document controls the actual mechanics. Settlement can occur on the vest date or later, and private-company plans can involve additional rules. That is why the first planning document should be the award agreement, not the brokerage statement.</w:t>
             </w:r>
           </w:p>
         </w:tc>
@@ -27959,59 +28636,46 @@
                 <w:color w:val="0F2038"/>
                 <w:sz w:val="21"/>
               </w:rPr>
-              <w:t>A better sequence before the next vest</w:t>
-            </w:r>
-          </w:p>
-          <w:p>
-            <w:pPr>
-              <w:spacing w:after="80"/>
-            </w:pPr>
-            <w:r>
-              <w:rPr>
-                <w:rFonts w:ascii="Calibri" w:hAnsi="Calibri"/>
-                <w:color w:val="425B72"/>
-                <w:sz w:val="19"/>
-              </w:rPr>
-              <w:t>Map the dates. Put every expected vest, settlement date, bonus, estimated-tax deadline, and trading window on one calendar.</w:t>
-            </w:r>
-          </w:p>
-          <w:p>
-            <w:pPr>
-              <w:spacing w:after="80"/>
-            </w:pPr>
-            <w:r>
-              <w:rPr>
-                <w:rFonts w:ascii="Calibri" w:hAnsi="Calibri"/>
-                <w:color w:val="425B72"/>
-                <w:sz w:val="19"/>
-              </w:rPr>
-              <w:t>Estimate the tax with the CPA. Model the vest in the context of total household income and payments already made.</w:t>
-            </w:r>
-          </w:p>
-          <w:p>
-            <w:pPr>
-              <w:spacing w:after="80"/>
-            </w:pPr>
-            <w:r>
-              <w:rPr>
-                <w:rFonts w:ascii="Calibri" w:hAnsi="Calibri"/>
-                <w:color w:val="425B72"/>
-                <w:sz w:val="19"/>
-              </w:rPr>
-              <w:t>Set the retention rule in advance. Decide how much company exposure fits the plan before the market price or an emotional attachment controls the answer.</w:t>
-            </w:r>
-          </w:p>
-          <w:p>
-            <w:pPr>
-              <w:spacing w:after="80"/>
-            </w:pPr>
-            <w:r>
-              <w:rPr>
-                <w:rFonts w:ascii="Calibri" w:hAnsi="Calibri"/>
-                <w:color w:val="425B72"/>
-                <w:sz w:val="19"/>
-              </w:rPr>
-              <w:t>Assign the proceeds. Connect any sale to cash reserves, diversification, debt, charitable giving, or another stated goal.</w:t>
+              <w:t>Why can withholding differ from the final tax?</w:t>
+            </w:r>
+          </w:p>
+          <w:p>
+            <w:pPr>
+              <w:spacing w:after="80"/>
+            </w:pPr>
+            <w:r>
+              <w:rPr>
+                <w:rFonts w:ascii="Calibri" w:hAnsi="Calibri"/>
+                <w:color w:val="425B72"/>
+                <w:sz w:val="19"/>
+              </w:rPr>
+              <w:t>Employer withholding is a prepayment, not a final calculation of the household tax return. Under the IRS supplemental wage rules, an employer may use a flat withholding method in certain situations. For 2026, the flat rate is 22 percent for separately identified supplemental wages up to the applicable threshold. Your marginal rate, deductions, other compensation, spouse income, and prior estimated payments can produce a different final result.</w:t>
+            </w:r>
+          </w:p>
+          <w:p>
+            <w:pPr>
+              <w:spacing w:after="80"/>
+            </w:pPr>
+            <w:r>
+              <w:rPr>
+                <w:rFonts w:ascii="Calibri" w:hAnsi="Calibri"/>
+                <w:color w:val="425B72"/>
+                <w:sz w:val="19"/>
+              </w:rPr>
+              <w:t>The useful question is not simply, “Were taxes withheld?” It is, “After all income is included, what liability is this vest expected to create, and where will the difference come from?” That estimate belongs with the CPA before the vest, not after the filing deadline.</w:t>
+            </w:r>
+          </w:p>
+          <w:p>
+            <w:pPr>
+              <w:spacing w:after="80"/>
+            </w:pPr>
+            <w:r>
+              <w:rPr>
+                <w:rFonts w:ascii="Calibri" w:hAnsi="Calibri"/>
+                <w:color w:val="425B72"/>
+                <w:sz w:val="19"/>
+              </w:rPr>
+              <w:t>Planning question: If the stock price falls after vesting but before you can sell, which cash account will cover any additional tax due?</w:t>
             </w:r>
           </w:p>
         </w:tc>
@@ -28163,7 +28827,33 @@
                 <w:color w:val="0F2038"/>
                 <w:sz w:val="21"/>
               </w:rPr>
-              <w:t>Questions worth answering early</w:t>
+              <w:t>The tax date and the liquidity date may be different</w:t>
+            </w:r>
+          </w:p>
+          <w:p>
+            <w:pPr>
+              <w:spacing w:after="80"/>
+            </w:pPr>
+            <w:r>
+              <w:rPr>
+                <w:rFonts w:ascii="Calibri" w:hAnsi="Calibri"/>
+                <w:color w:val="425B72"/>
+                <w:sz w:val="19"/>
+              </w:rPr>
+              <w:t>Executives and other insiders can face company trading windows, blackout periods, and preclearance requirements. A tax event can occur even when a discretionary sale is not available. That gap leaves the household exposed to price movement while a known cash obligation is forming.</w:t>
+            </w:r>
+          </w:p>
+          <w:p>
+            <w:pPr>
+              <w:spacing w:after="80"/>
+            </w:pPr>
+            <w:r>
+              <w:rPr>
+                <w:rFonts w:ascii="Calibri" w:hAnsi="Calibri"/>
+                <w:color w:val="425B72"/>
+                <w:sz w:val="19"/>
+              </w:rPr>
+              <w:t>This is especially important when salary, annual bonus, deferred compensation, retirement benefits, and equity all depend on the same company or industry. The position is not just an investment holding. It is part of a wider employment and balance-sheet exposure.</w:t>
             </w:r>
           </w:p>
         </w:tc>
@@ -28315,20 +29005,59 @@
                 <w:color w:val="0F2038"/>
                 <w:sz w:val="21"/>
               </w:rPr>
-              <w:t>How much of the household balance sheet depends on one company?</w:t>
-            </w:r>
-          </w:p>
-          <w:p>
-            <w:pPr>
-              <w:spacing w:after="80"/>
-            </w:pPr>
-            <w:r>
-              <w:rPr>
-                <w:rFonts w:ascii="Calibri" w:hAnsi="Calibri"/>
-                <w:color w:val="425B72"/>
-                <w:sz w:val="19"/>
-              </w:rPr>
-              <w:t>Count more than the shares in the brokerage account. Include unvested equity, salary, bonus, deferred compensation, retirement benefits, and any industry-sensitive assets.</w:t>
+              <w:t>A better sequence before the next vest</w:t>
+            </w:r>
+          </w:p>
+          <w:p>
+            <w:pPr>
+              <w:spacing w:after="80"/>
+            </w:pPr>
+            <w:r>
+              <w:rPr>
+                <w:rFonts w:ascii="Calibri" w:hAnsi="Calibri"/>
+                <w:color w:val="425B72"/>
+                <w:sz w:val="19"/>
+              </w:rPr>
+              <w:t>Map the dates. Put every expected vest, settlement date, bonus, estimated-tax deadline, and trading window on one calendar.</w:t>
+            </w:r>
+          </w:p>
+          <w:p>
+            <w:pPr>
+              <w:spacing w:after="80"/>
+            </w:pPr>
+            <w:r>
+              <w:rPr>
+                <w:rFonts w:ascii="Calibri" w:hAnsi="Calibri"/>
+                <w:color w:val="425B72"/>
+                <w:sz w:val="19"/>
+              </w:rPr>
+              <w:t>Estimate the tax with the CPA. Model the vest in the context of total household income and payments already made.</w:t>
+            </w:r>
+          </w:p>
+          <w:p>
+            <w:pPr>
+              <w:spacing w:after="80"/>
+            </w:pPr>
+            <w:r>
+              <w:rPr>
+                <w:rFonts w:ascii="Calibri" w:hAnsi="Calibri"/>
+                <w:color w:val="425B72"/>
+                <w:sz w:val="19"/>
+              </w:rPr>
+              <w:t>Set the retention rule in advance. Decide how much company exposure fits the plan before the market price or an emotional attachment controls the answer.</w:t>
+            </w:r>
+          </w:p>
+          <w:p>
+            <w:pPr>
+              <w:spacing w:after="80"/>
+            </w:pPr>
+            <w:r>
+              <w:rPr>
+                <w:rFonts w:ascii="Calibri" w:hAnsi="Calibri"/>
+                <w:color w:val="425B72"/>
+                <w:sz w:val="19"/>
+              </w:rPr>
+              <w:t>Assign the proceeds. Connect any sale to cash reserves, diversification, debt, charitable giving, or another stated goal.</w:t>
             </w:r>
           </w:p>
         </w:tc>
@@ -28480,20 +29209,85 @@
                 <w:color w:val="0F2038"/>
                 <w:sz w:val="21"/>
               </w:rPr>
-              <w:t>Which decision has the earliest hard deadline?</w:t>
-            </w:r>
-          </w:p>
-          <w:p>
-            <w:pPr>
-              <w:spacing w:after="80"/>
-            </w:pPr>
-            <w:r>
-              <w:rPr>
-                <w:rFonts w:ascii="Calibri" w:hAnsi="Calibri"/>
-                <w:color w:val="425B72"/>
-                <w:sz w:val="19"/>
-              </w:rPr>
-              <w:t>The first deadline may be a tax payment, a company election, a trading preclearance request, or an estate-planning action. Identify the owner of each task and the professional who needs to be involved.</w:t>
+              <w:t>What should you gather before the vest date?</w:t>
+            </w:r>
+          </w:p>
+          <w:p>
+            <w:pPr>
+              <w:spacing w:after="80"/>
+            </w:pPr>
+            <w:r>
+              <w:rPr>
+                <w:rFonts w:ascii="Calibri" w:hAnsi="Calibri"/>
+                <w:color w:val="425B72"/>
+                <w:sz w:val="19"/>
+              </w:rPr>
+              <w:t>The planning meeting moves faster when the advisor and CPA are working from the same source documents. Bring the items that control the transaction and the items that show its effect on the household.</w:t>
+            </w:r>
+          </w:p>
+          <w:p>
+            <w:pPr>
+              <w:spacing w:after="80"/>
+            </w:pPr>
+            <w:r>
+              <w:rPr>
+                <w:rFonts w:ascii="Calibri" w:hAnsi="Calibri"/>
+                <w:color w:val="425B72"/>
+                <w:sz w:val="19"/>
+              </w:rPr>
+              <w:t>Award agreement and current vesting scheduleThese control the grant conditions, settlement timing, and plan-specific mechanics.</w:t>
+            </w:r>
+          </w:p>
+          <w:p>
+            <w:pPr>
+              <w:spacing w:after="80"/>
+            </w:pPr>
+            <w:r>
+              <w:rPr>
+                <w:rFonts w:ascii="Calibri" w:hAnsi="Calibri"/>
+                <w:color w:val="425B72"/>
+                <w:sz w:val="19"/>
+              </w:rPr>
+              <w:t>Employer trading policyInclude blackout dates, preclearance requirements, and any Rule 10b5-1 plan already in place.</w:t>
+            </w:r>
+          </w:p>
+          <w:p>
+            <w:pPr>
+              <w:spacing w:after="80"/>
+            </w:pPr>
+            <w:r>
+              <w:rPr>
+                <w:rFonts w:ascii="Calibri" w:hAnsi="Calibri"/>
+                <w:color w:val="425B72"/>
+                <w:sz w:val="19"/>
+              </w:rPr>
+              <w:t>Recent pay statement and prior-year tax returnThese help the CPA place the vest inside total household income and withholding.</w:t>
+            </w:r>
+          </w:p>
+          <w:p>
+            <w:pPr>
+              <w:spacing w:after="80"/>
+            </w:pPr>
+            <w:r>
+              <w:rPr>
+                <w:rFonts w:ascii="Calibri" w:hAnsi="Calibri"/>
+                <w:color w:val="425B72"/>
+                <w:sz w:val="19"/>
+              </w:rPr>
+              <w:t>Current company-stock exposureCount vested shares, unvested awards, employee stock plans, and other holdings tied to the same employer or industry.</w:t>
+            </w:r>
+          </w:p>
+          <w:p>
+            <w:pPr>
+              <w:spacing w:after="80"/>
+            </w:pPr>
+            <w:r>
+              <w:rPr>
+                <w:rFonts w:ascii="Calibri" w:hAnsi="Calibri"/>
+                <w:color w:val="425B72"/>
+                <w:sz w:val="19"/>
+              </w:rPr>
+              <w:t>Near-term cash needs and planned usesName the tax reserve, major purchase, charitable gift, debt payment, or diversification goal before the shares settle.</w:t>
             </w:r>
           </w:p>
         </w:tc>
@@ -28547,7 +29341,7 @@
                 <w:color w:val="425B72"/>
                 <w:sz w:val="17"/>
               </w:rPr>
-              <w:t>Keep, edit, or replace this copy.</w:t>
+              <w:t>Keep the action or type the preferred CTA and next step.</w:t>
             </w:r>
           </w:p>
           <w:p>
@@ -28645,20 +29439,7 @@
                 <w:color w:val="0F2038"/>
                 <w:sz w:val="21"/>
               </w:rPr>
-              <w:t>What would change the planned sale?</w:t>
-            </w:r>
-          </w:p>
-          <w:p>
-            <w:pPr>
-              <w:spacing w:after="80"/>
-            </w:pPr>
-            <w:r>
-              <w:rPr>
-                <w:rFonts w:ascii="Calibri" w:hAnsi="Calibri"/>
-                <w:color w:val="425B72"/>
-                <w:sz w:val="19"/>
-              </w:rPr>
-              <w:t>A written retention and sale policy is more useful when it names the exceptions. Examples include a changed cash need, a material change in the company outlook, a new trading restriction, or a revised tax estimate.</w:t>
+              <w:t>Questions worth answering early</w:t>
             </w:r>
           </w:p>
         </w:tc>
@@ -28810,6 +29591,1313 @@
                 <w:color w:val="0F2038"/>
                 <w:sz w:val="21"/>
               </w:rPr>
+              <w:t>How much of the household balance sheet depends on one company?</w:t>
+            </w:r>
+          </w:p>
+          <w:p>
+            <w:pPr>
+              <w:spacing w:after="80"/>
+            </w:pPr>
+            <w:r>
+              <w:rPr>
+                <w:rFonts w:ascii="Calibri" w:hAnsi="Calibri"/>
+                <w:color w:val="425B72"/>
+                <w:sz w:val="19"/>
+              </w:rPr>
+              <w:t>Count more than the shares in the brokerage account. Include unvested equity, salary, bonus, deferred compensation, retirement benefits, and any industry-sensitive assets.</w:t>
+            </w:r>
+          </w:p>
+        </w:tc>
+        <w:tc>
+          <w:tcPr>
+            <w:tcW w:type="dxa" w:w="6986"/>
+            <w:shd w:fill="FFF9ED"/>
+          </w:tcPr>
+          <w:p>
+            <w:pPr>
+              <w:spacing w:after="60"/>
+            </w:pPr>
+            <w:r/>
+          </w:p>
+          <w:p>
+            <w:pPr>
+              <w:spacing w:before="0" w:after="80"/>
+            </w:pPr>
+            <w:r>
+              <w:rPr>
+                <w:rFonts w:ascii="Calibri" w:hAnsi="Calibri"/>
+                <w:b/>
+                <w:color w:val="2D5474"/>
+                <w:sz w:val="15"/>
+              </w:rPr>
+              <w:t>DECISION</w:t>
+            </w:r>
+          </w:p>
+          <w:p>
+            <w:pPr>
+              <w:spacing w:after="100"/>
+            </w:pPr>
+            <w:r>
+              <w:rPr>
+                <w:rFonts w:ascii="Calibri" w:hAnsi="Calibri"/>
+                <w:b/>
+                <w:color w:val="0F2038"/>
+                <w:sz w:val="19"/>
+              </w:rPr>
+              <w:t>Keep  /  Edit  /  Replace</w:t>
+            </w:r>
+          </w:p>
+          <w:p>
+            <w:pPr>
+              <w:spacing w:after="160"/>
+            </w:pPr>
+            <w:r>
+              <w:rPr>
+                <w:rFonts w:ascii="Calibri" w:hAnsi="Calibri"/>
+                <w:i/>
+                <w:color w:val="425B72"/>
+                <w:sz w:val="17"/>
+              </w:rPr>
+              <w:t>Keep, edit, or replace this copy.</w:t>
+            </w:r>
+          </w:p>
+          <w:p>
+            <w:pPr>
+              <w:spacing w:after="80"/>
+            </w:pPr>
+            <w:r>
+              <w:rPr>
+                <w:rFonts w:ascii="Calibri" w:hAnsi="Calibri"/>
+                <w:b/>
+                <w:color w:val="2D5474"/>
+                <w:sz w:val="17"/>
+              </w:rPr>
+              <w:t>Alex's replacement copy or notes:</w:t>
+            </w:r>
+          </w:p>
+          <w:p>
+            <w:pPr>
+              <w:spacing w:after="180"/>
+            </w:pPr>
+            <w:r>
+              <w:rPr>
+                <w:rFonts w:ascii="Calibri" w:hAnsi="Calibri"/>
+                <w:color w:val="425B72"/>
+                <w:sz w:val="19"/>
+              </w:rPr>
+              <w:t xml:space="preserve"> </w:t>
+            </w:r>
+          </w:p>
+          <w:p>
+            <w:pPr>
+              <w:spacing w:after="180"/>
+            </w:pPr>
+            <w:r>
+              <w:rPr>
+                <w:rFonts w:ascii="Calibri" w:hAnsi="Calibri"/>
+                <w:color w:val="425B72"/>
+                <w:sz w:val="19"/>
+              </w:rPr>
+              <w:t xml:space="preserve"> </w:t>
+            </w:r>
+          </w:p>
+          <w:p>
+            <w:pPr>
+              <w:spacing w:after="180"/>
+            </w:pPr>
+            <w:r>
+              <w:rPr>
+                <w:rFonts w:ascii="Calibri" w:hAnsi="Calibri"/>
+                <w:color w:val="425B72"/>
+                <w:sz w:val="19"/>
+              </w:rPr>
+              <w:t xml:space="preserve"> </w:t>
+            </w:r>
+          </w:p>
+        </w:tc>
+      </w:tr>
+      <w:tr>
+        <w:trPr>
+          <w:cantSplit w:val="true"/>
+        </w:trPr>
+        <w:tc>
+          <w:tcPr>
+            <w:tcW w:type="dxa" w:w="6986"/>
+            <w:shd w:fill="FFFFFF"/>
+          </w:tcPr>
+          <w:p>
+            <w:pPr>
+              <w:spacing w:after="60"/>
+            </w:pPr>
+            <w:r/>
+          </w:p>
+          <w:p>
+            <w:pPr>
+              <w:spacing w:before="0" w:after="80"/>
+            </w:pPr>
+            <w:r>
+              <w:rPr>
+                <w:rFonts w:ascii="Calibri" w:hAnsi="Calibri"/>
+                <w:b/>
+                <w:color w:val="B18F4D"/>
+                <w:sz w:val="15"/>
+              </w:rPr>
+              <w:t>SECTION / COPY BLOCK</w:t>
+            </w:r>
+          </w:p>
+          <w:p>
+            <w:pPr>
+              <w:spacing w:after="100"/>
+            </w:pPr>
+            <w:r>
+              <w:rPr>
+                <w:rFonts w:ascii="Calibri" w:hAnsi="Calibri"/>
+                <w:b/>
+                <w:color w:val="0F2038"/>
+                <w:sz w:val="21"/>
+              </w:rPr>
+              <w:t>Which decision has the earliest hard deadline?</w:t>
+            </w:r>
+          </w:p>
+          <w:p>
+            <w:pPr>
+              <w:spacing w:after="80"/>
+            </w:pPr>
+            <w:r>
+              <w:rPr>
+                <w:rFonts w:ascii="Calibri" w:hAnsi="Calibri"/>
+                <w:color w:val="425B72"/>
+                <w:sz w:val="19"/>
+              </w:rPr>
+              <w:t>The first deadline may be a tax payment, a company election, a trading preclearance request, or an estate-planning action. Identify the owner of each task and the professional who needs to be involved.</w:t>
+            </w:r>
+          </w:p>
+        </w:tc>
+        <w:tc>
+          <w:tcPr>
+            <w:tcW w:type="dxa" w:w="6986"/>
+            <w:shd w:fill="FFF9ED"/>
+          </w:tcPr>
+          <w:p>
+            <w:pPr>
+              <w:spacing w:after="60"/>
+            </w:pPr>
+            <w:r/>
+          </w:p>
+          <w:p>
+            <w:pPr>
+              <w:spacing w:before="0" w:after="80"/>
+            </w:pPr>
+            <w:r>
+              <w:rPr>
+                <w:rFonts w:ascii="Calibri" w:hAnsi="Calibri"/>
+                <w:b/>
+                <w:color w:val="2D5474"/>
+                <w:sz w:val="15"/>
+              </w:rPr>
+              <w:t>DECISION</w:t>
+            </w:r>
+          </w:p>
+          <w:p>
+            <w:pPr>
+              <w:spacing w:after="100"/>
+            </w:pPr>
+            <w:r>
+              <w:rPr>
+                <w:rFonts w:ascii="Calibri" w:hAnsi="Calibri"/>
+                <w:b/>
+                <w:color w:val="0F2038"/>
+                <w:sz w:val="19"/>
+              </w:rPr>
+              <w:t>Keep  /  Edit  /  Replace</w:t>
+            </w:r>
+          </w:p>
+          <w:p>
+            <w:pPr>
+              <w:spacing w:after="160"/>
+            </w:pPr>
+            <w:r>
+              <w:rPr>
+                <w:rFonts w:ascii="Calibri" w:hAnsi="Calibri"/>
+                <w:i/>
+                <w:color w:val="425B72"/>
+                <w:sz w:val="17"/>
+              </w:rPr>
+              <w:t>Keep, edit, or replace this copy.</w:t>
+            </w:r>
+          </w:p>
+          <w:p>
+            <w:pPr>
+              <w:spacing w:after="80"/>
+            </w:pPr>
+            <w:r>
+              <w:rPr>
+                <w:rFonts w:ascii="Calibri" w:hAnsi="Calibri"/>
+                <w:b/>
+                <w:color w:val="2D5474"/>
+                <w:sz w:val="17"/>
+              </w:rPr>
+              <w:t>Alex's replacement copy or notes:</w:t>
+            </w:r>
+          </w:p>
+          <w:p>
+            <w:pPr>
+              <w:spacing w:after="180"/>
+            </w:pPr>
+            <w:r>
+              <w:rPr>
+                <w:rFonts w:ascii="Calibri" w:hAnsi="Calibri"/>
+                <w:color w:val="425B72"/>
+                <w:sz w:val="19"/>
+              </w:rPr>
+              <w:t xml:space="preserve"> </w:t>
+            </w:r>
+          </w:p>
+          <w:p>
+            <w:pPr>
+              <w:spacing w:after="180"/>
+            </w:pPr>
+            <w:r>
+              <w:rPr>
+                <w:rFonts w:ascii="Calibri" w:hAnsi="Calibri"/>
+                <w:color w:val="425B72"/>
+                <w:sz w:val="19"/>
+              </w:rPr>
+              <w:t xml:space="preserve"> </w:t>
+            </w:r>
+          </w:p>
+          <w:p>
+            <w:pPr>
+              <w:spacing w:after="180"/>
+            </w:pPr>
+            <w:r>
+              <w:rPr>
+                <w:rFonts w:ascii="Calibri" w:hAnsi="Calibri"/>
+                <w:color w:val="425B72"/>
+                <w:sz w:val="19"/>
+              </w:rPr>
+              <w:t xml:space="preserve"> </w:t>
+            </w:r>
+          </w:p>
+        </w:tc>
+      </w:tr>
+      <w:tr>
+        <w:trPr>
+          <w:cantSplit w:val="true"/>
+        </w:trPr>
+        <w:tc>
+          <w:tcPr>
+            <w:tcW w:type="dxa" w:w="6986"/>
+            <w:shd w:fill="FFFFFF"/>
+          </w:tcPr>
+          <w:p>
+            <w:pPr>
+              <w:spacing w:after="60"/>
+            </w:pPr>
+            <w:r/>
+          </w:p>
+          <w:p>
+            <w:pPr>
+              <w:spacing w:before="0" w:after="80"/>
+            </w:pPr>
+            <w:r>
+              <w:rPr>
+                <w:rFonts w:ascii="Calibri" w:hAnsi="Calibri"/>
+                <w:b/>
+                <w:color w:val="B18F4D"/>
+                <w:sz w:val="15"/>
+              </w:rPr>
+              <w:t>SECTION / COPY BLOCK</w:t>
+            </w:r>
+          </w:p>
+          <w:p>
+            <w:pPr>
+              <w:spacing w:after="100"/>
+            </w:pPr>
+            <w:r>
+              <w:rPr>
+                <w:rFonts w:ascii="Calibri" w:hAnsi="Calibri"/>
+                <w:b/>
+                <w:color w:val="0F2038"/>
+                <w:sz w:val="21"/>
+              </w:rPr>
+              <w:t>What would change the planned sale?</w:t>
+            </w:r>
+          </w:p>
+          <w:p>
+            <w:pPr>
+              <w:spacing w:after="80"/>
+            </w:pPr>
+            <w:r>
+              <w:rPr>
+                <w:rFonts w:ascii="Calibri" w:hAnsi="Calibri"/>
+                <w:color w:val="425B72"/>
+                <w:sz w:val="19"/>
+              </w:rPr>
+              <w:t>A written retention and sale policy is more useful when it names the exceptions. Examples include a changed cash need, a material change in the company outlook, a new trading restriction, or a revised tax estimate.</w:t>
+            </w:r>
+          </w:p>
+        </w:tc>
+        <w:tc>
+          <w:tcPr>
+            <w:tcW w:type="dxa" w:w="6986"/>
+            <w:shd w:fill="FFF9ED"/>
+          </w:tcPr>
+          <w:p>
+            <w:pPr>
+              <w:spacing w:after="60"/>
+            </w:pPr>
+            <w:r/>
+          </w:p>
+          <w:p>
+            <w:pPr>
+              <w:spacing w:before="0" w:after="80"/>
+            </w:pPr>
+            <w:r>
+              <w:rPr>
+                <w:rFonts w:ascii="Calibri" w:hAnsi="Calibri"/>
+                <w:b/>
+                <w:color w:val="2D5474"/>
+                <w:sz w:val="15"/>
+              </w:rPr>
+              <w:t>DECISION</w:t>
+            </w:r>
+          </w:p>
+          <w:p>
+            <w:pPr>
+              <w:spacing w:after="100"/>
+            </w:pPr>
+            <w:r>
+              <w:rPr>
+                <w:rFonts w:ascii="Calibri" w:hAnsi="Calibri"/>
+                <w:b/>
+                <w:color w:val="0F2038"/>
+                <w:sz w:val="19"/>
+              </w:rPr>
+              <w:t>Keep  /  Edit  /  Replace</w:t>
+            </w:r>
+          </w:p>
+          <w:p>
+            <w:pPr>
+              <w:spacing w:after="160"/>
+            </w:pPr>
+            <w:r>
+              <w:rPr>
+                <w:rFonts w:ascii="Calibri" w:hAnsi="Calibri"/>
+                <w:i/>
+                <w:color w:val="425B72"/>
+                <w:sz w:val="17"/>
+              </w:rPr>
+              <w:t>Keep, edit, or replace this copy.</w:t>
+            </w:r>
+          </w:p>
+          <w:p>
+            <w:pPr>
+              <w:spacing w:after="80"/>
+            </w:pPr>
+            <w:r>
+              <w:rPr>
+                <w:rFonts w:ascii="Calibri" w:hAnsi="Calibri"/>
+                <w:b/>
+                <w:color w:val="2D5474"/>
+                <w:sz w:val="17"/>
+              </w:rPr>
+              <w:t>Alex's replacement copy or notes:</w:t>
+            </w:r>
+          </w:p>
+          <w:p>
+            <w:pPr>
+              <w:spacing w:after="180"/>
+            </w:pPr>
+            <w:r>
+              <w:rPr>
+                <w:rFonts w:ascii="Calibri" w:hAnsi="Calibri"/>
+                <w:color w:val="425B72"/>
+                <w:sz w:val="19"/>
+              </w:rPr>
+              <w:t xml:space="preserve"> </w:t>
+            </w:r>
+          </w:p>
+          <w:p>
+            <w:pPr>
+              <w:spacing w:after="180"/>
+            </w:pPr>
+            <w:r>
+              <w:rPr>
+                <w:rFonts w:ascii="Calibri" w:hAnsi="Calibri"/>
+                <w:color w:val="425B72"/>
+                <w:sz w:val="19"/>
+              </w:rPr>
+              <w:t xml:space="preserve"> </w:t>
+            </w:r>
+          </w:p>
+          <w:p>
+            <w:pPr>
+              <w:spacing w:after="180"/>
+            </w:pPr>
+            <w:r>
+              <w:rPr>
+                <w:rFonts w:ascii="Calibri" w:hAnsi="Calibri"/>
+                <w:color w:val="425B72"/>
+                <w:sz w:val="19"/>
+              </w:rPr>
+              <w:t xml:space="preserve"> </w:t>
+            </w:r>
+          </w:p>
+        </w:tc>
+      </w:tr>
+      <w:tr>
+        <w:trPr>
+          <w:cantSplit w:val="true"/>
+        </w:trPr>
+        <w:tc>
+          <w:tcPr>
+            <w:tcW w:type="dxa" w:w="6986"/>
+            <w:shd w:fill="FFFFFF"/>
+          </w:tcPr>
+          <w:p>
+            <w:pPr>
+              <w:spacing w:after="60"/>
+            </w:pPr>
+            <w:r/>
+          </w:p>
+          <w:p>
+            <w:pPr>
+              <w:spacing w:before="0" w:after="80"/>
+            </w:pPr>
+            <w:r>
+              <w:rPr>
+                <w:rFonts w:ascii="Calibri" w:hAnsi="Calibri"/>
+                <w:b/>
+                <w:color w:val="B18F4D"/>
+                <w:sz w:val="15"/>
+              </w:rPr>
+              <w:t>SECTION / COPY BLOCK</w:t>
+            </w:r>
+          </w:p>
+          <w:p>
+            <w:pPr>
+              <w:spacing w:after="100"/>
+            </w:pPr>
+            <w:r>
+              <w:rPr>
+                <w:rFonts w:ascii="Calibri" w:hAnsi="Calibri"/>
+                <w:b/>
+                <w:color w:val="0F2038"/>
+                <w:sz w:val="21"/>
+              </w:rPr>
+              <w:t>Common RSU tax-planning questions</w:t>
+            </w:r>
+          </w:p>
+        </w:tc>
+        <w:tc>
+          <w:tcPr>
+            <w:tcW w:type="dxa" w:w="6986"/>
+            <w:shd w:fill="FFF9ED"/>
+          </w:tcPr>
+          <w:p>
+            <w:pPr>
+              <w:spacing w:after="60"/>
+            </w:pPr>
+            <w:r/>
+          </w:p>
+          <w:p>
+            <w:pPr>
+              <w:spacing w:before="0" w:after="80"/>
+            </w:pPr>
+            <w:r>
+              <w:rPr>
+                <w:rFonts w:ascii="Calibri" w:hAnsi="Calibri"/>
+                <w:b/>
+                <w:color w:val="2D5474"/>
+                <w:sz w:val="15"/>
+              </w:rPr>
+              <w:t>DECISION</w:t>
+            </w:r>
+          </w:p>
+          <w:p>
+            <w:pPr>
+              <w:spacing w:after="100"/>
+            </w:pPr>
+            <w:r>
+              <w:rPr>
+                <w:rFonts w:ascii="Calibri" w:hAnsi="Calibri"/>
+                <w:b/>
+                <w:color w:val="0F2038"/>
+                <w:sz w:val="19"/>
+              </w:rPr>
+              <w:t>Keep  /  Edit  /  Replace</w:t>
+            </w:r>
+          </w:p>
+          <w:p>
+            <w:pPr>
+              <w:spacing w:after="160"/>
+            </w:pPr>
+            <w:r>
+              <w:rPr>
+                <w:rFonts w:ascii="Calibri" w:hAnsi="Calibri"/>
+                <w:i/>
+                <w:color w:val="425B72"/>
+                <w:sz w:val="17"/>
+              </w:rPr>
+              <w:t>Keep, edit, or replace this copy.</w:t>
+            </w:r>
+          </w:p>
+          <w:p>
+            <w:pPr>
+              <w:spacing w:after="80"/>
+            </w:pPr>
+            <w:r>
+              <w:rPr>
+                <w:rFonts w:ascii="Calibri" w:hAnsi="Calibri"/>
+                <w:b/>
+                <w:color w:val="2D5474"/>
+                <w:sz w:val="17"/>
+              </w:rPr>
+              <w:t>Alex's replacement copy or notes:</w:t>
+            </w:r>
+          </w:p>
+          <w:p>
+            <w:pPr>
+              <w:spacing w:after="180"/>
+            </w:pPr>
+            <w:r>
+              <w:rPr>
+                <w:rFonts w:ascii="Calibri" w:hAnsi="Calibri"/>
+                <w:color w:val="425B72"/>
+                <w:sz w:val="19"/>
+              </w:rPr>
+              <w:t xml:space="preserve"> </w:t>
+            </w:r>
+          </w:p>
+          <w:p>
+            <w:pPr>
+              <w:spacing w:after="180"/>
+            </w:pPr>
+            <w:r>
+              <w:rPr>
+                <w:rFonts w:ascii="Calibri" w:hAnsi="Calibri"/>
+                <w:color w:val="425B72"/>
+                <w:sz w:val="19"/>
+              </w:rPr>
+              <w:t xml:space="preserve"> </w:t>
+            </w:r>
+          </w:p>
+          <w:p>
+            <w:pPr>
+              <w:spacing w:after="180"/>
+            </w:pPr>
+            <w:r>
+              <w:rPr>
+                <w:rFonts w:ascii="Calibri" w:hAnsi="Calibri"/>
+                <w:color w:val="425B72"/>
+                <w:sz w:val="19"/>
+              </w:rPr>
+              <w:t xml:space="preserve"> </w:t>
+            </w:r>
+          </w:p>
+        </w:tc>
+      </w:tr>
+      <w:tr>
+        <w:trPr>
+          <w:cantSplit w:val="true"/>
+        </w:trPr>
+        <w:tc>
+          <w:tcPr>
+            <w:tcW w:type="dxa" w:w="6986"/>
+            <w:shd w:fill="FFFFFF"/>
+          </w:tcPr>
+          <w:p>
+            <w:pPr>
+              <w:spacing w:after="60"/>
+            </w:pPr>
+            <w:r/>
+          </w:p>
+          <w:p>
+            <w:pPr>
+              <w:spacing w:before="0" w:after="80"/>
+            </w:pPr>
+            <w:r>
+              <w:rPr>
+                <w:rFonts w:ascii="Calibri" w:hAnsi="Calibri"/>
+                <w:b/>
+                <w:color w:val="B18F4D"/>
+                <w:sz w:val="15"/>
+              </w:rPr>
+              <w:t>SECTION / COPY BLOCK</w:t>
+            </w:r>
+          </w:p>
+          <w:p>
+            <w:pPr>
+              <w:spacing w:after="100"/>
+            </w:pPr>
+            <w:r>
+              <w:rPr>
+                <w:rFonts w:ascii="Calibri" w:hAnsi="Calibri"/>
+                <w:b/>
+                <w:color w:val="0F2038"/>
+                <w:sz w:val="21"/>
+              </w:rPr>
+              <w:t>Are RSUs taxed twice?</w:t>
+            </w:r>
+          </w:p>
+          <w:p>
+            <w:pPr>
+              <w:spacing w:after="80"/>
+            </w:pPr>
+            <w:r>
+              <w:rPr>
+                <w:rFonts w:ascii="Calibri" w:hAnsi="Calibri"/>
+                <w:color w:val="425B72"/>
+                <w:sz w:val="19"/>
+              </w:rPr>
+              <w:t>Generally, no. RSUs typically create ordinary compensation income when the shares settle. That amount generally becomes the tax basis in the shares. If the shares are later sold for more or less than that basis, the difference can create a separate capital gain or loss. Accurate basis records matter because an incorrect brokerage record can make the same value appear taxable twice on a return.</w:t>
+            </w:r>
+          </w:p>
+        </w:tc>
+        <w:tc>
+          <w:tcPr>
+            <w:tcW w:type="dxa" w:w="6986"/>
+            <w:shd w:fill="FFF9ED"/>
+          </w:tcPr>
+          <w:p>
+            <w:pPr>
+              <w:spacing w:after="60"/>
+            </w:pPr>
+            <w:r/>
+          </w:p>
+          <w:p>
+            <w:pPr>
+              <w:spacing w:before="0" w:after="80"/>
+            </w:pPr>
+            <w:r>
+              <w:rPr>
+                <w:rFonts w:ascii="Calibri" w:hAnsi="Calibri"/>
+                <w:b/>
+                <w:color w:val="2D5474"/>
+                <w:sz w:val="15"/>
+              </w:rPr>
+              <w:t>DECISION</w:t>
+            </w:r>
+          </w:p>
+          <w:p>
+            <w:pPr>
+              <w:spacing w:after="100"/>
+            </w:pPr>
+            <w:r>
+              <w:rPr>
+                <w:rFonts w:ascii="Calibri" w:hAnsi="Calibri"/>
+                <w:b/>
+                <w:color w:val="0F2038"/>
+                <w:sz w:val="19"/>
+              </w:rPr>
+              <w:t>Keep  /  Edit  /  Replace</w:t>
+            </w:r>
+          </w:p>
+          <w:p>
+            <w:pPr>
+              <w:spacing w:after="160"/>
+            </w:pPr>
+            <w:r>
+              <w:rPr>
+                <w:rFonts w:ascii="Calibri" w:hAnsi="Calibri"/>
+                <w:i/>
+                <w:color w:val="425B72"/>
+                <w:sz w:val="17"/>
+              </w:rPr>
+              <w:t>Keep, edit, or replace this copy.</w:t>
+            </w:r>
+          </w:p>
+          <w:p>
+            <w:pPr>
+              <w:spacing w:after="80"/>
+            </w:pPr>
+            <w:r>
+              <w:rPr>
+                <w:rFonts w:ascii="Calibri" w:hAnsi="Calibri"/>
+                <w:b/>
+                <w:color w:val="2D5474"/>
+                <w:sz w:val="17"/>
+              </w:rPr>
+              <w:t>Alex's replacement copy or notes:</w:t>
+            </w:r>
+          </w:p>
+          <w:p>
+            <w:pPr>
+              <w:spacing w:after="180"/>
+            </w:pPr>
+            <w:r>
+              <w:rPr>
+                <w:rFonts w:ascii="Calibri" w:hAnsi="Calibri"/>
+                <w:color w:val="425B72"/>
+                <w:sz w:val="19"/>
+              </w:rPr>
+              <w:t xml:space="preserve"> </w:t>
+            </w:r>
+          </w:p>
+          <w:p>
+            <w:pPr>
+              <w:spacing w:after="180"/>
+            </w:pPr>
+            <w:r>
+              <w:rPr>
+                <w:rFonts w:ascii="Calibri" w:hAnsi="Calibri"/>
+                <w:color w:val="425B72"/>
+                <w:sz w:val="19"/>
+              </w:rPr>
+              <w:t xml:space="preserve"> </w:t>
+            </w:r>
+          </w:p>
+          <w:p>
+            <w:pPr>
+              <w:spacing w:after="180"/>
+            </w:pPr>
+            <w:r>
+              <w:rPr>
+                <w:rFonts w:ascii="Calibri" w:hAnsi="Calibri"/>
+                <w:color w:val="425B72"/>
+                <w:sz w:val="19"/>
+              </w:rPr>
+              <w:t xml:space="preserve"> </w:t>
+            </w:r>
+          </w:p>
+        </w:tc>
+      </w:tr>
+      <w:tr>
+        <w:trPr>
+          <w:cantSplit w:val="true"/>
+        </w:trPr>
+        <w:tc>
+          <w:tcPr>
+            <w:tcW w:type="dxa" w:w="6986"/>
+            <w:shd w:fill="FFFFFF"/>
+          </w:tcPr>
+          <w:p>
+            <w:pPr>
+              <w:spacing w:after="60"/>
+            </w:pPr>
+            <w:r/>
+          </w:p>
+          <w:p>
+            <w:pPr>
+              <w:spacing w:before="0" w:after="80"/>
+            </w:pPr>
+            <w:r>
+              <w:rPr>
+                <w:rFonts w:ascii="Calibri" w:hAnsi="Calibri"/>
+                <w:b/>
+                <w:color w:val="B18F4D"/>
+                <w:sz w:val="15"/>
+              </w:rPr>
+              <w:t>SECTION / COPY BLOCK</w:t>
+            </w:r>
+          </w:p>
+          <w:p>
+            <w:pPr>
+              <w:spacing w:after="100"/>
+            </w:pPr>
+            <w:r>
+              <w:rPr>
+                <w:rFonts w:ascii="Calibri" w:hAnsi="Calibri"/>
+                <w:b/>
+                <w:color w:val="0F2038"/>
+                <w:sz w:val="21"/>
+              </w:rPr>
+              <w:t>Does RSU withholding cover the final tax bill?</w:t>
+            </w:r>
+          </w:p>
+          <w:p>
+            <w:pPr>
+              <w:spacing w:after="80"/>
+            </w:pPr>
+            <w:r>
+              <w:rPr>
+                <w:rFonts w:ascii="Calibri" w:hAnsi="Calibri"/>
+                <w:color w:val="425B72"/>
+                <w:sz w:val="19"/>
+              </w:rPr>
+              <w:t>Not necessarily. Withholding is a prepayment. The IRS permits a 22 percent flat withholding method for certain separately identified supplemental wages up to $1 million in 2026, while amounts above that threshold are generally subject to a 37 percent rate. The household’s final liability can still differ because it reflects total income, filing status, deductions, other taxes, and payments already made.</w:t>
+            </w:r>
+          </w:p>
+        </w:tc>
+        <w:tc>
+          <w:tcPr>
+            <w:tcW w:type="dxa" w:w="6986"/>
+            <w:shd w:fill="FFF9ED"/>
+          </w:tcPr>
+          <w:p>
+            <w:pPr>
+              <w:spacing w:after="60"/>
+            </w:pPr>
+            <w:r/>
+          </w:p>
+          <w:p>
+            <w:pPr>
+              <w:spacing w:before="0" w:after="80"/>
+            </w:pPr>
+            <w:r>
+              <w:rPr>
+                <w:rFonts w:ascii="Calibri" w:hAnsi="Calibri"/>
+                <w:b/>
+                <w:color w:val="2D5474"/>
+                <w:sz w:val="15"/>
+              </w:rPr>
+              <w:t>DECISION</w:t>
+            </w:r>
+          </w:p>
+          <w:p>
+            <w:pPr>
+              <w:spacing w:after="100"/>
+            </w:pPr>
+            <w:r>
+              <w:rPr>
+                <w:rFonts w:ascii="Calibri" w:hAnsi="Calibri"/>
+                <w:b/>
+                <w:color w:val="0F2038"/>
+                <w:sz w:val="19"/>
+              </w:rPr>
+              <w:t>Keep  /  Edit  /  Replace</w:t>
+            </w:r>
+          </w:p>
+          <w:p>
+            <w:pPr>
+              <w:spacing w:after="160"/>
+            </w:pPr>
+            <w:r>
+              <w:rPr>
+                <w:rFonts w:ascii="Calibri" w:hAnsi="Calibri"/>
+                <w:i/>
+                <w:color w:val="425B72"/>
+                <w:sz w:val="17"/>
+              </w:rPr>
+              <w:t>Keep, edit, or replace this copy.</w:t>
+            </w:r>
+          </w:p>
+          <w:p>
+            <w:pPr>
+              <w:spacing w:after="80"/>
+            </w:pPr>
+            <w:r>
+              <w:rPr>
+                <w:rFonts w:ascii="Calibri" w:hAnsi="Calibri"/>
+                <w:b/>
+                <w:color w:val="2D5474"/>
+                <w:sz w:val="17"/>
+              </w:rPr>
+              <w:t>Alex's replacement copy or notes:</w:t>
+            </w:r>
+          </w:p>
+          <w:p>
+            <w:pPr>
+              <w:spacing w:after="180"/>
+            </w:pPr>
+            <w:r>
+              <w:rPr>
+                <w:rFonts w:ascii="Calibri" w:hAnsi="Calibri"/>
+                <w:color w:val="425B72"/>
+                <w:sz w:val="19"/>
+              </w:rPr>
+              <w:t xml:space="preserve"> </w:t>
+            </w:r>
+          </w:p>
+          <w:p>
+            <w:pPr>
+              <w:spacing w:after="180"/>
+            </w:pPr>
+            <w:r>
+              <w:rPr>
+                <w:rFonts w:ascii="Calibri" w:hAnsi="Calibri"/>
+                <w:color w:val="425B72"/>
+                <w:sz w:val="19"/>
+              </w:rPr>
+              <w:t xml:space="preserve"> </w:t>
+            </w:r>
+          </w:p>
+          <w:p>
+            <w:pPr>
+              <w:spacing w:after="180"/>
+            </w:pPr>
+            <w:r>
+              <w:rPr>
+                <w:rFonts w:ascii="Calibri" w:hAnsi="Calibri"/>
+                <w:color w:val="425B72"/>
+                <w:sz w:val="19"/>
+              </w:rPr>
+              <w:t xml:space="preserve"> </w:t>
+            </w:r>
+          </w:p>
+        </w:tc>
+      </w:tr>
+      <w:tr>
+        <w:trPr>
+          <w:cantSplit w:val="true"/>
+        </w:trPr>
+        <w:tc>
+          <w:tcPr>
+            <w:tcW w:type="dxa" w:w="6986"/>
+            <w:shd w:fill="FFFFFF"/>
+          </w:tcPr>
+          <w:p>
+            <w:pPr>
+              <w:spacing w:after="60"/>
+            </w:pPr>
+            <w:r/>
+          </w:p>
+          <w:p>
+            <w:pPr>
+              <w:spacing w:before="0" w:after="80"/>
+            </w:pPr>
+            <w:r>
+              <w:rPr>
+                <w:rFonts w:ascii="Calibri" w:hAnsi="Calibri"/>
+                <w:b/>
+                <w:color w:val="B18F4D"/>
+                <w:sz w:val="15"/>
+              </w:rPr>
+              <w:t>SECTION / COPY BLOCK</w:t>
+            </w:r>
+          </w:p>
+          <w:p>
+            <w:pPr>
+              <w:spacing w:after="100"/>
+            </w:pPr>
+            <w:r>
+              <w:rPr>
+                <w:rFonts w:ascii="Calibri" w:hAnsi="Calibri"/>
+                <w:b/>
+                <w:color w:val="0F2038"/>
+                <w:sz w:val="21"/>
+              </w:rPr>
+              <w:t>Can an executive sell the shares immediately after vesting?</w:t>
+            </w:r>
+          </w:p>
+          <w:p>
+            <w:pPr>
+              <w:spacing w:after="80"/>
+            </w:pPr>
+            <w:r>
+              <w:rPr>
+                <w:rFonts w:ascii="Calibri" w:hAnsi="Calibri"/>
+                <w:color w:val="425B72"/>
+                <w:sz w:val="19"/>
+              </w:rPr>
+              <w:t>It depends on the award terms and employer policy. Settlement may occur after the vest date, and company trading windows, blackout periods, preclearance requirements, or material nonpublic information can restrict a discretionary sale. The employer’s legal or compliance team controls those rules.</w:t>
+            </w:r>
+          </w:p>
+        </w:tc>
+        <w:tc>
+          <w:tcPr>
+            <w:tcW w:type="dxa" w:w="6986"/>
+            <w:shd w:fill="FFF9ED"/>
+          </w:tcPr>
+          <w:p>
+            <w:pPr>
+              <w:spacing w:after="60"/>
+            </w:pPr>
+            <w:r/>
+          </w:p>
+          <w:p>
+            <w:pPr>
+              <w:spacing w:before="0" w:after="80"/>
+            </w:pPr>
+            <w:r>
+              <w:rPr>
+                <w:rFonts w:ascii="Calibri" w:hAnsi="Calibri"/>
+                <w:b/>
+                <w:color w:val="2D5474"/>
+                <w:sz w:val="15"/>
+              </w:rPr>
+              <w:t>DECISION</w:t>
+            </w:r>
+          </w:p>
+          <w:p>
+            <w:pPr>
+              <w:spacing w:after="100"/>
+            </w:pPr>
+            <w:r>
+              <w:rPr>
+                <w:rFonts w:ascii="Calibri" w:hAnsi="Calibri"/>
+                <w:b/>
+                <w:color w:val="0F2038"/>
+                <w:sz w:val="19"/>
+              </w:rPr>
+              <w:t>Keep  /  Edit  /  Replace</w:t>
+            </w:r>
+          </w:p>
+          <w:p>
+            <w:pPr>
+              <w:spacing w:after="160"/>
+            </w:pPr>
+            <w:r>
+              <w:rPr>
+                <w:rFonts w:ascii="Calibri" w:hAnsi="Calibri"/>
+                <w:i/>
+                <w:color w:val="425B72"/>
+                <w:sz w:val="17"/>
+              </w:rPr>
+              <w:t>Keep, edit, or replace this copy.</w:t>
+            </w:r>
+          </w:p>
+          <w:p>
+            <w:pPr>
+              <w:spacing w:after="80"/>
+            </w:pPr>
+            <w:r>
+              <w:rPr>
+                <w:rFonts w:ascii="Calibri" w:hAnsi="Calibri"/>
+                <w:b/>
+                <w:color w:val="2D5474"/>
+                <w:sz w:val="17"/>
+              </w:rPr>
+              <w:t>Alex's replacement copy or notes:</w:t>
+            </w:r>
+          </w:p>
+          <w:p>
+            <w:pPr>
+              <w:spacing w:after="180"/>
+            </w:pPr>
+            <w:r>
+              <w:rPr>
+                <w:rFonts w:ascii="Calibri" w:hAnsi="Calibri"/>
+                <w:color w:val="425B72"/>
+                <w:sz w:val="19"/>
+              </w:rPr>
+              <w:t xml:space="preserve"> </w:t>
+            </w:r>
+          </w:p>
+          <w:p>
+            <w:pPr>
+              <w:spacing w:after="180"/>
+            </w:pPr>
+            <w:r>
+              <w:rPr>
+                <w:rFonts w:ascii="Calibri" w:hAnsi="Calibri"/>
+                <w:color w:val="425B72"/>
+                <w:sz w:val="19"/>
+              </w:rPr>
+              <w:t xml:space="preserve"> </w:t>
+            </w:r>
+          </w:p>
+          <w:p>
+            <w:pPr>
+              <w:spacing w:after="180"/>
+            </w:pPr>
+            <w:r>
+              <w:rPr>
+                <w:rFonts w:ascii="Calibri" w:hAnsi="Calibri"/>
+                <w:color w:val="425B72"/>
+                <w:sz w:val="19"/>
+              </w:rPr>
+              <w:t xml:space="preserve"> </w:t>
+            </w:r>
+          </w:p>
+        </w:tc>
+      </w:tr>
+      <w:tr>
+        <w:trPr>
+          <w:cantSplit w:val="true"/>
+        </w:trPr>
+        <w:tc>
+          <w:tcPr>
+            <w:tcW w:type="dxa" w:w="6986"/>
+            <w:shd w:fill="FFFFFF"/>
+          </w:tcPr>
+          <w:p>
+            <w:pPr>
+              <w:spacing w:after="60"/>
+            </w:pPr>
+            <w:r/>
+          </w:p>
+          <w:p>
+            <w:pPr>
+              <w:spacing w:before="0" w:after="80"/>
+            </w:pPr>
+            <w:r>
+              <w:rPr>
+                <w:rFonts w:ascii="Calibri" w:hAnsi="Calibri"/>
+                <w:b/>
+                <w:color w:val="B18F4D"/>
+                <w:sz w:val="15"/>
+              </w:rPr>
+              <w:t>SECTION / COPY BLOCK</w:t>
+            </w:r>
+          </w:p>
+          <w:p>
+            <w:pPr>
+              <w:spacing w:after="100"/>
+            </w:pPr>
+            <w:r>
+              <w:rPr>
+                <w:rFonts w:ascii="Calibri" w:hAnsi="Calibri"/>
+                <w:b/>
+                <w:color w:val="0F2038"/>
+                <w:sz w:val="21"/>
+              </w:rPr>
+              <w:t>What is the first planning decision?</w:t>
+            </w:r>
+          </w:p>
+          <w:p>
+            <w:pPr>
+              <w:spacing w:after="80"/>
+            </w:pPr>
+            <w:r>
+              <w:rPr>
+                <w:rFonts w:ascii="Calibri" w:hAnsi="Calibri"/>
+                <w:color w:val="425B72"/>
+                <w:sz w:val="19"/>
+              </w:rPr>
+              <w:t>Start by mapping the dates and estimating the tax. Once the household knows when income is expected, what may be withheld, and when a sale may be available, it can set a retention rule and assign any proceeds to a specific purpose.</w:t>
+            </w:r>
+          </w:p>
+        </w:tc>
+        <w:tc>
+          <w:tcPr>
+            <w:tcW w:type="dxa" w:w="6986"/>
+            <w:shd w:fill="FFF9ED"/>
+          </w:tcPr>
+          <w:p>
+            <w:pPr>
+              <w:spacing w:after="60"/>
+            </w:pPr>
+            <w:r/>
+          </w:p>
+          <w:p>
+            <w:pPr>
+              <w:spacing w:before="0" w:after="80"/>
+            </w:pPr>
+            <w:r>
+              <w:rPr>
+                <w:rFonts w:ascii="Calibri" w:hAnsi="Calibri"/>
+                <w:b/>
+                <w:color w:val="2D5474"/>
+                <w:sz w:val="15"/>
+              </w:rPr>
+              <w:t>DECISION</w:t>
+            </w:r>
+          </w:p>
+          <w:p>
+            <w:pPr>
+              <w:spacing w:after="100"/>
+            </w:pPr>
+            <w:r>
+              <w:rPr>
+                <w:rFonts w:ascii="Calibri" w:hAnsi="Calibri"/>
+                <w:b/>
+                <w:color w:val="0F2038"/>
+                <w:sz w:val="19"/>
+              </w:rPr>
+              <w:t>Keep  /  Edit  /  Replace</w:t>
+            </w:r>
+          </w:p>
+          <w:p>
+            <w:pPr>
+              <w:spacing w:after="160"/>
+            </w:pPr>
+            <w:r>
+              <w:rPr>
+                <w:rFonts w:ascii="Calibri" w:hAnsi="Calibri"/>
+                <w:i/>
+                <w:color w:val="425B72"/>
+                <w:sz w:val="17"/>
+              </w:rPr>
+              <w:t>Keep, edit, or replace this copy.</w:t>
+            </w:r>
+          </w:p>
+          <w:p>
+            <w:pPr>
+              <w:spacing w:after="80"/>
+            </w:pPr>
+            <w:r>
+              <w:rPr>
+                <w:rFonts w:ascii="Calibri" w:hAnsi="Calibri"/>
+                <w:b/>
+                <w:color w:val="2D5474"/>
+                <w:sz w:val="17"/>
+              </w:rPr>
+              <w:t>Alex's replacement copy or notes:</w:t>
+            </w:r>
+          </w:p>
+          <w:p>
+            <w:pPr>
+              <w:spacing w:after="180"/>
+            </w:pPr>
+            <w:r>
+              <w:rPr>
+                <w:rFonts w:ascii="Calibri" w:hAnsi="Calibri"/>
+                <w:color w:val="425B72"/>
+                <w:sz w:val="19"/>
+              </w:rPr>
+              <w:t xml:space="preserve"> </w:t>
+            </w:r>
+          </w:p>
+          <w:p>
+            <w:pPr>
+              <w:spacing w:after="180"/>
+            </w:pPr>
+            <w:r>
+              <w:rPr>
+                <w:rFonts w:ascii="Calibri" w:hAnsi="Calibri"/>
+                <w:color w:val="425B72"/>
+                <w:sz w:val="19"/>
+              </w:rPr>
+              <w:t xml:space="preserve"> </w:t>
+            </w:r>
+          </w:p>
+          <w:p>
+            <w:pPr>
+              <w:spacing w:after="180"/>
+            </w:pPr>
+            <w:r>
+              <w:rPr>
+                <w:rFonts w:ascii="Calibri" w:hAnsi="Calibri"/>
+                <w:color w:val="425B72"/>
+                <w:sz w:val="19"/>
+              </w:rPr>
+              <w:t xml:space="preserve"> </w:t>
+            </w:r>
+          </w:p>
+        </w:tc>
+      </w:tr>
+      <w:tr>
+        <w:trPr>
+          <w:cantSplit w:val="true"/>
+        </w:trPr>
+        <w:tc>
+          <w:tcPr>
+            <w:tcW w:type="dxa" w:w="6986"/>
+            <w:shd w:fill="FFFFFF"/>
+          </w:tcPr>
+          <w:p>
+            <w:pPr>
+              <w:spacing w:after="60"/>
+            </w:pPr>
+            <w:r/>
+          </w:p>
+          <w:p>
+            <w:pPr>
+              <w:spacing w:before="0" w:after="80"/>
+            </w:pPr>
+            <w:r>
+              <w:rPr>
+                <w:rFonts w:ascii="Calibri" w:hAnsi="Calibri"/>
+                <w:b/>
+                <w:color w:val="B18F4D"/>
+                <w:sz w:val="15"/>
+              </w:rPr>
+              <w:t>SECTION / COPY BLOCK</w:t>
+            </w:r>
+          </w:p>
+          <w:p>
+            <w:pPr>
+              <w:spacing w:after="100"/>
+            </w:pPr>
+            <w:r>
+              <w:rPr>
+                <w:rFonts w:ascii="Calibri" w:hAnsi="Calibri"/>
+                <w:b/>
+                <w:color w:val="0F2038"/>
+                <w:sz w:val="21"/>
+              </w:rPr>
               <w:t>Primary sources and further reading</w:t>
             </w:r>
           </w:p>
@@ -28889,6 +30977,32 @@
                 <w:sz w:val="19"/>
               </w:rPr>
               <w:t>CTA / LINK: IRS Publication 15-T, Federal Income Tax Withholding Methods</w:t>
+            </w:r>
+          </w:p>
+          <w:p>
+            <w:pPr>
+              <w:spacing w:after="80"/>
+            </w:pPr>
+            <w:r>
+              <w:rPr>
+                <w:rFonts w:ascii="Calibri" w:hAnsi="Calibri"/>
+                <w:color w:val="425B72"/>
+                <w:sz w:val="19"/>
+              </w:rPr>
+              <w:t>SEC guide to Rule 10b5-1 insider trading arrangements, including the conditions and cooling-off periods that apply to qualifying trading plans.</w:t>
+            </w:r>
+          </w:p>
+          <w:p>
+            <w:pPr>
+              <w:spacing w:after="80"/>
+            </w:pPr>
+            <w:r>
+              <w:rPr>
+                <w:rFonts w:ascii="Calibri" w:hAnsi="Calibri"/>
+                <w:color w:val="425B72"/>
+                <w:sz w:val="19"/>
+              </w:rPr>
+              <w:t>CTA / LINK: SEC guide to Rule 10b5-1 insider trading arrangements</w:t>
             </w:r>
           </w:p>
           <w:p>
@@ -29215,7 +31329,7 @@
                 <w:color w:val="425B72"/>
                 <w:sz w:val="17"/>
               </w:rPr>
-              <w:t>1. Confirm Alex as host and approve “The Planning Room” title.</w:t>
+              <w:t>1. Confirm Alex as host and approve “Anchor Wealth Podcast” as the series title.</w:t>
             </w:r>
           </w:p>
           <w:p>
@@ -29243,7 +31357,7 @@
                 <w:color w:val="425B72"/>
                 <w:sz w:val="17"/>
               </w:rPr>
-              <w:t>3. Approve the four-part conversation map and written briefing.</w:t>
+              <w:t>3. Approve the four-part conversation map, episode notes, and transcript structure.</w:t>
             </w:r>
           </w:p>
           <w:p>
@@ -29387,20 +31501,20 @@
                 <w:color w:val="425B72"/>
                 <w:sz w:val="19"/>
               </w:rPr>
-              <w:t>SEO TITLE: What Coordinated Planning Looks Like Before Year-End | The Planning Room</w:t>
-            </w:r>
-          </w:p>
-          <w:p>
-            <w:pPr>
-              <w:spacing w:after="80"/>
-            </w:pPr>
-            <w:r>
-              <w:rPr>
-                <w:rFonts w:ascii="Calibri" w:hAnsi="Calibri"/>
-                <w:color w:val="425B72"/>
-                <w:sz w:val="19"/>
-              </w:rPr>
-              <w:t>META DESCRIPTION: A Planning Room conversation about assigning financial decisions, deadlines, and ownership across the advisor, CPA, attorney, and client before year-end.</w:t>
+              <w:t>SEO TITLE: What Coordinated Planning Looks Like Before Year-End | Anchor Wealth Podcast</w:t>
+            </w:r>
+          </w:p>
+          <w:p>
+            <w:pPr>
+              <w:spacing w:after="80"/>
+            </w:pPr>
+            <w:r>
+              <w:rPr>
+                <w:rFonts w:ascii="Calibri" w:hAnsi="Calibri"/>
+                <w:color w:val="425B72"/>
+                <w:sz w:val="19"/>
+              </w:rPr>
+              <w:t>META DESCRIPTION: An Anchor Wealth Podcast conversation about assigning financial decisions, deadlines, and ownership across the advisor, CPA, attorney, and client before year-end.</w:t>
             </w:r>
           </w:p>
           <w:p>
@@ -29656,7 +31770,7 @@
                 <w:color w:val="425B72"/>
                 <w:sz w:val="19"/>
               </w:rPr>
-              <w:t>INTERFACE LABEL: The Planning Room podcast cover</w:t>
+              <w:t>INTERFACE LABEL: Anchor Wealth Podcast cover</w:t>
             </w:r>
           </w:p>
           <w:p>
@@ -29886,7 +32000,7 @@
                 <w:color w:val="425B72"/>
                 <w:sz w:val="19"/>
               </w:rPr>
-              <w:t>The Planning Room</w:t>
+              <w:t>Anchor Wealth Podcast</w:t>
             </w:r>
           </w:p>
           <w:p>
@@ -30077,7 +32191,7 @@
                 <w:color w:val="425B72"/>
                 <w:sz w:val="19"/>
               </w:rPr>
-              <w:t>Coordination series preview</w:t>
+              <w:t>Podcast preview</w:t>
             </w:r>
           </w:p>
           <w:p>
@@ -30103,20 +32217,20 @@
                 <w:color w:val="425B72"/>
                 <w:sz w:val="19"/>
               </w:rPr>
-              <w:t>Episode briefing included</w:t>
-            </w:r>
-          </w:p>
-          <w:p>
-            <w:pPr>
-              <w:spacing w:after="80"/>
-            </w:pPr>
-            <w:r>
-              <w:rPr>
-                <w:rFonts w:ascii="Calibri" w:hAnsi="Calibri"/>
-                <w:color w:val="425B72"/>
-                <w:sz w:val="19"/>
-              </w:rPr>
-              <w:t>CTA / LINK: Read the episode notes</w:t>
+              <w:t>Episode transcript included</w:t>
+            </w:r>
+          </w:p>
+          <w:p>
+            <w:pPr>
+              <w:spacing w:after="80"/>
+            </w:pPr>
+            <w:r>
+              <w:rPr>
+                <w:rFonts w:ascii="Calibri" w:hAnsi="Calibri"/>
+                <w:color w:val="425B72"/>
+                <w:sz w:val="19"/>
+              </w:rPr>
+              <w:t>CTA / LINK: Listen to the podcast</w:t>
             </w:r>
           </w:p>
           <w:p>
@@ -30294,7 +32408,7 @@
                 <w:color w:val="425B72"/>
                 <w:sz w:val="19"/>
               </w:rPr>
-              <w:t>Most complex planning problems do not begin with a lack of advice. They begin when good advice arrives from different professionals on different timelines. The planning room exists to put the decision, the owner, and the deadline in one place.</w:t>
+              <w:t>Most complex planning problems do not begin with a lack of advice. They begin when good advice arrives from different professionals on different timelines. The podcast puts the decision, the owner, and the deadline in one place.</w:t>
             </w:r>
           </w:p>
         </w:tc>
@@ -31362,20 +33476,20 @@
                 <w:color w:val="0F2038"/>
                 <w:sz w:val="21"/>
               </w:rPr>
-              <w:t>Read the episode briefing</w:t>
-            </w:r>
-          </w:p>
-          <w:p>
-            <w:pPr>
-              <w:spacing w:after="80"/>
-            </w:pPr>
-            <w:r>
-              <w:rPr>
-                <w:rFonts w:ascii="Calibri" w:hAnsi="Calibri"/>
-                <w:color w:val="425B72"/>
-                <w:sz w:val="19"/>
-              </w:rPr>
-              <w:t>EXPANDER LABEL: Open the written briefing</w:t>
+              <w:t>Episode transcript</w:t>
+            </w:r>
+          </w:p>
+          <w:p>
+            <w:pPr>
+              <w:spacing w:after="80"/>
+            </w:pPr>
+            <w:r>
+              <w:rPr>
+                <w:rFonts w:ascii="Calibri" w:hAnsi="Calibri"/>
+                <w:color w:val="425B72"/>
+                <w:sz w:val="19"/>
+              </w:rPr>
+              <w:t>EXPANDER LABEL: Read the transcript</w:t>
             </w:r>
           </w:p>
           <w:p>

</xml_diff>

<commit_message>
feat(anchor): deepen podcast resource path
</commit_message>
<xml_diff>
--- a/projects/awp/copy/Anchor_Copy_Review_Side_by_Side.docx
+++ b/projects/awp/copy/Anchor_Copy_Review_Side_by_Side.docx
@@ -23812,19 +23812,6 @@
               <w:t>CTA / LINK: Read the 6-minute briefing</w:t>
             </w:r>
           </w:p>
-          <w:p>
-            <w:pPr>
-              <w:spacing w:after="80"/>
-            </w:pPr>
-            <w:r>
-              <w:rPr>
-                <w:rFonts w:ascii="Calibri" w:hAnsi="Calibri"/>
-                <w:color w:val="425B72"/>
-                <w:sz w:val="19"/>
-              </w:rPr>
-              <w:t>Podcast</w:t>
-            </w:r>
-          </w:p>
         </w:tc>
         <w:tc>
           <w:tcPr>
@@ -23987,20 +23974,98 @@
                 <w:color w:val="425B72"/>
                 <w:sz w:val="19"/>
               </w:rPr>
-              <w:t>Direct conversations about the financial decisions that require your advisor, CPA, and attorney to work from the same plan.</w:t>
-            </w:r>
-          </w:p>
-          <w:p>
-            <w:pPr>
-              <w:spacing w:after="80"/>
-            </w:pPr>
-            <w:r>
-              <w:rPr>
-                <w:rFonts w:ascii="Calibri" w:hAnsi="Calibri"/>
-                <w:color w:val="425B72"/>
-                <w:sz w:val="19"/>
-              </w:rPr>
-              <w:t>CTA / LINK: Listen to the podcast</w:t>
+              <w:t>SECTION LABEL: Hosted by Alex Miller</w:t>
+            </w:r>
+          </w:p>
+          <w:p>
+            <w:pPr>
+              <w:spacing w:after="80"/>
+            </w:pPr>
+            <w:r>
+              <w:rPr>
+                <w:rFonts w:ascii="Calibri" w:hAnsi="Calibri"/>
+                <w:color w:val="425B72"/>
+                <w:sz w:val="19"/>
+              </w:rPr>
+              <w:t>Hear how Alex thinks through decisions that cross investments, taxes, estate planning, and business ownership.</w:t>
+            </w:r>
+          </w:p>
+          <w:p>
+            <w:pPr>
+              <w:spacing w:after="80"/>
+            </w:pPr>
+            <w:r>
+              <w:rPr>
+                <w:rFonts w:ascii="Calibri" w:hAnsi="Calibri"/>
+                <w:color w:val="425B72"/>
+                <w:sz w:val="19"/>
+              </w:rPr>
+              <w:t>Latest conversations</w:t>
+            </w:r>
+          </w:p>
+          <w:p>
+            <w:pPr>
+              <w:spacing w:after="80"/>
+            </w:pPr>
+            <w:r>
+              <w:rPr>
+                <w:rFonts w:ascii="Calibri" w:hAnsi="Calibri"/>
+                <w:color w:val="425B72"/>
+                <w:sz w:val="19"/>
+              </w:rPr>
+              <w:t>Episode 01 · Coordination What coordinated planning looks like before year-end Listen</w:t>
+            </w:r>
+          </w:p>
+          <w:p>
+            <w:pPr>
+              <w:spacing w:after="80"/>
+            </w:pPr>
+            <w:r>
+              <w:rPr>
+                <w:rFonts w:ascii="Calibri" w:hAnsi="Calibri"/>
+                <w:color w:val="425B72"/>
+                <w:sz w:val="19"/>
+              </w:rPr>
+              <w:t>Preview · Business transition Five questions to ask before responding to an offer Listen</w:t>
+            </w:r>
+          </w:p>
+          <w:p>
+            <w:pPr>
+              <w:spacing w:after="80"/>
+            </w:pPr>
+            <w:r>
+              <w:rPr>
+                <w:rFonts w:ascii="Calibri" w:hAnsi="Calibri"/>
+                <w:color w:val="425B72"/>
+                <w:sz w:val="19"/>
+              </w:rPr>
+              <w:t>Preview · Equity compensation The decisions hiding inside an RSU vest Listen</w:t>
+            </w:r>
+          </w:p>
+          <w:p>
+            <w:pPr>
+              <w:spacing w:after="80"/>
+            </w:pPr>
+            <w:r>
+              <w:rPr>
+                <w:rFonts w:ascii="Calibri" w:hAnsi="Calibri"/>
+                <w:color w:val="425B72"/>
+                <w:sz w:val="19"/>
+              </w:rPr>
+              <w:t>Does this sound like your situation? Take the four-question Fit Check. If there is a fit, the next step is a conversation with Alex.</w:t>
+            </w:r>
+          </w:p>
+          <w:p>
+            <w:pPr>
+              <w:spacing w:after="80"/>
+            </w:pPr>
+            <w:r>
+              <w:rPr>
+                <w:rFonts w:ascii="Calibri" w:hAnsi="Calibri"/>
+                <w:color w:val="425B72"/>
+                <w:sz w:val="19"/>
+              </w:rPr>
+              <w:t>CTA / LINK: Take the Fit Check →</w:t>
             </w:r>
           </w:p>
         </w:tc>
@@ -24054,7 +24119,7 @@
                 <w:color w:val="425B72"/>
                 <w:sz w:val="17"/>
               </w:rPr>
-              <w:t>Keep, edit, or replace this copy.</w:t>
+              <w:t>Keep the action or type the preferred CTA and next step.</w:t>
             </w:r>
           </w:p>
           <w:p>
@@ -25555,757 +25620,6 @@
                 <w:sz w:val="19"/>
               </w:rPr>
               <w:t>DETAIL LABEL: Podcast · Preview</w:t>
-            </w:r>
-          </w:p>
-          <w:p>
-            <w:pPr>
-              <w:spacing w:after="80"/>
-            </w:pPr>
-            <w:r>
-              <w:rPr>
-                <w:rFonts w:ascii="Calibri" w:hAnsi="Calibri"/>
-                <w:color w:val="425B72"/>
-                <w:sz w:val="19"/>
-              </w:rPr>
-              <w:t>Withholding is only one part of the decision. Concentration and cash flow still need a plan.</w:t>
-            </w:r>
-          </w:p>
-          <w:p>
-            <w:pPr>
-              <w:spacing w:after="80"/>
-            </w:pPr>
-            <w:r>
-              <w:rPr>
-                <w:rFonts w:ascii="Calibri" w:hAnsi="Calibri"/>
-                <w:color w:val="425B72"/>
-                <w:sz w:val="19"/>
-              </w:rPr>
-              <w:t>Listen to the podcast</w:t>
-            </w:r>
-          </w:p>
-        </w:tc>
-        <w:tc>
-          <w:tcPr>
-            <w:tcW w:type="dxa" w:w="6986"/>
-            <w:shd w:fill="FFF9ED"/>
-          </w:tcPr>
-          <w:p>
-            <w:pPr>
-              <w:spacing w:after="60"/>
-            </w:pPr>
-            <w:r/>
-          </w:p>
-          <w:p>
-            <w:pPr>
-              <w:spacing w:before="0" w:after="80"/>
-            </w:pPr>
-            <w:r>
-              <w:rPr>
-                <w:rFonts w:ascii="Calibri" w:hAnsi="Calibri"/>
-                <w:b/>
-                <w:color w:val="2D5474"/>
-                <w:sz w:val="15"/>
-              </w:rPr>
-              <w:t>DECISION</w:t>
-            </w:r>
-          </w:p>
-          <w:p>
-            <w:pPr>
-              <w:spacing w:after="100"/>
-            </w:pPr>
-            <w:r>
-              <w:rPr>
-                <w:rFonts w:ascii="Calibri" w:hAnsi="Calibri"/>
-                <w:b/>
-                <w:color w:val="0F2038"/>
-                <w:sz w:val="19"/>
-              </w:rPr>
-              <w:t>Keep  /  Edit  /  Replace</w:t>
-            </w:r>
-          </w:p>
-          <w:p>
-            <w:pPr>
-              <w:spacing w:after="160"/>
-            </w:pPr>
-            <w:r>
-              <w:rPr>
-                <w:rFonts w:ascii="Calibri" w:hAnsi="Calibri"/>
-                <w:i/>
-                <w:color w:val="425B72"/>
-                <w:sz w:val="17"/>
-              </w:rPr>
-              <w:t>Keep, edit, or replace this copy.</w:t>
-            </w:r>
-          </w:p>
-          <w:p>
-            <w:pPr>
-              <w:spacing w:after="80"/>
-            </w:pPr>
-            <w:r>
-              <w:rPr>
-                <w:rFonts w:ascii="Calibri" w:hAnsi="Calibri"/>
-                <w:b/>
-                <w:color w:val="2D5474"/>
-                <w:sz w:val="17"/>
-              </w:rPr>
-              <w:t>Alex's replacement copy or notes:</w:t>
-            </w:r>
-          </w:p>
-          <w:p>
-            <w:pPr>
-              <w:spacing w:after="180"/>
-            </w:pPr>
-            <w:r>
-              <w:rPr>
-                <w:rFonts w:ascii="Calibri" w:hAnsi="Calibri"/>
-                <w:color w:val="425B72"/>
-                <w:sz w:val="19"/>
-              </w:rPr>
-              <w:t xml:space="preserve"> </w:t>
-            </w:r>
-          </w:p>
-          <w:p>
-            <w:pPr>
-              <w:spacing w:after="180"/>
-            </w:pPr>
-            <w:r>
-              <w:rPr>
-                <w:rFonts w:ascii="Calibri" w:hAnsi="Calibri"/>
-                <w:color w:val="425B72"/>
-                <w:sz w:val="19"/>
-              </w:rPr>
-              <w:t xml:space="preserve"> </w:t>
-            </w:r>
-          </w:p>
-          <w:p>
-            <w:pPr>
-              <w:spacing w:after="180"/>
-            </w:pPr>
-            <w:r>
-              <w:rPr>
-                <w:rFonts w:ascii="Calibri" w:hAnsi="Calibri"/>
-                <w:color w:val="425B72"/>
-                <w:sz w:val="19"/>
-              </w:rPr>
-              <w:t xml:space="preserve"> </w:t>
-            </w:r>
-          </w:p>
-        </w:tc>
-      </w:tr>
-      <w:tr>
-        <w:trPr>
-          <w:cantSplit w:val="true"/>
-        </w:trPr>
-        <w:tc>
-          <w:tcPr>
-            <w:tcW w:type="dxa" w:w="6986"/>
-            <w:shd w:fill="FFFFFF"/>
-          </w:tcPr>
-          <w:p>
-            <w:pPr>
-              <w:spacing w:after="60"/>
-            </w:pPr>
-            <w:r/>
-          </w:p>
-          <w:p>
-            <w:pPr>
-              <w:spacing w:before="0" w:after="80"/>
-            </w:pPr>
-            <w:r>
-              <w:rPr>
-                <w:rFonts w:ascii="Calibri" w:hAnsi="Calibri"/>
-                <w:b/>
-                <w:color w:val="B18F4D"/>
-                <w:sz w:val="15"/>
-              </w:rPr>
-              <w:t>SECTION / COPY BLOCK</w:t>
-            </w:r>
-          </w:p>
-          <w:p>
-            <w:pPr>
-              <w:spacing w:after="100"/>
-            </w:pPr>
-            <w:r>
-              <w:rPr>
-                <w:rFonts w:ascii="Calibri" w:hAnsi="Calibri"/>
-                <w:b/>
-                <w:color w:val="0F2038"/>
-                <w:sz w:val="21"/>
-              </w:rPr>
-              <w:t>Listen to the Anchor Wealth Podcast.</w:t>
-            </w:r>
-          </w:p>
-          <w:p>
-            <w:pPr>
-              <w:spacing w:after="80"/>
-            </w:pPr>
-            <w:r>
-              <w:rPr>
-                <w:rFonts w:ascii="Calibri" w:hAnsi="Calibri"/>
-                <w:color w:val="425B72"/>
-                <w:sz w:val="19"/>
-              </w:rPr>
-              <w:t>SECTION LABEL: The podcast</w:t>
-            </w:r>
-          </w:p>
-          <w:p>
-            <w:pPr>
-              <w:spacing w:after="80"/>
-            </w:pPr>
-            <w:r>
-              <w:rPr>
-                <w:rFonts w:ascii="Calibri" w:hAnsi="Calibri"/>
-                <w:color w:val="425B72"/>
-                <w:sz w:val="19"/>
-              </w:rPr>
-              <w:t>Short, focused conversations. Every episode page includes written notes, a conversation map, and related reading.</w:t>
-            </w:r>
-          </w:p>
-        </w:tc>
-        <w:tc>
-          <w:tcPr>
-            <w:tcW w:type="dxa" w:w="6986"/>
-            <w:shd w:fill="FFF9ED"/>
-          </w:tcPr>
-          <w:p>
-            <w:pPr>
-              <w:spacing w:after="60"/>
-            </w:pPr>
-            <w:r/>
-          </w:p>
-          <w:p>
-            <w:pPr>
-              <w:spacing w:before="0" w:after="80"/>
-            </w:pPr>
-            <w:r>
-              <w:rPr>
-                <w:rFonts w:ascii="Calibri" w:hAnsi="Calibri"/>
-                <w:b/>
-                <w:color w:val="2D5474"/>
-                <w:sz w:val="15"/>
-              </w:rPr>
-              <w:t>DECISION</w:t>
-            </w:r>
-          </w:p>
-          <w:p>
-            <w:pPr>
-              <w:spacing w:after="100"/>
-            </w:pPr>
-            <w:r>
-              <w:rPr>
-                <w:rFonts w:ascii="Calibri" w:hAnsi="Calibri"/>
-                <w:b/>
-                <w:color w:val="0F2038"/>
-                <w:sz w:val="19"/>
-              </w:rPr>
-              <w:t>Keep  /  Edit  /  Replace</w:t>
-            </w:r>
-          </w:p>
-          <w:p>
-            <w:pPr>
-              <w:spacing w:after="160"/>
-            </w:pPr>
-            <w:r>
-              <w:rPr>
-                <w:rFonts w:ascii="Calibri" w:hAnsi="Calibri"/>
-                <w:i/>
-                <w:color w:val="425B72"/>
-                <w:sz w:val="17"/>
-              </w:rPr>
-              <w:t>Keep, edit, or replace this copy.</w:t>
-            </w:r>
-          </w:p>
-          <w:p>
-            <w:pPr>
-              <w:spacing w:after="80"/>
-            </w:pPr>
-            <w:r>
-              <w:rPr>
-                <w:rFonts w:ascii="Calibri" w:hAnsi="Calibri"/>
-                <w:b/>
-                <w:color w:val="2D5474"/>
-                <w:sz w:val="17"/>
-              </w:rPr>
-              <w:t>Alex's replacement copy or notes:</w:t>
-            </w:r>
-          </w:p>
-          <w:p>
-            <w:pPr>
-              <w:spacing w:after="180"/>
-            </w:pPr>
-            <w:r>
-              <w:rPr>
-                <w:rFonts w:ascii="Calibri" w:hAnsi="Calibri"/>
-                <w:color w:val="425B72"/>
-                <w:sz w:val="19"/>
-              </w:rPr>
-              <w:t xml:space="preserve"> </w:t>
-            </w:r>
-          </w:p>
-          <w:p>
-            <w:pPr>
-              <w:spacing w:after="180"/>
-            </w:pPr>
-            <w:r>
-              <w:rPr>
-                <w:rFonts w:ascii="Calibri" w:hAnsi="Calibri"/>
-                <w:color w:val="425B72"/>
-                <w:sz w:val="19"/>
-              </w:rPr>
-              <w:t xml:space="preserve"> </w:t>
-            </w:r>
-          </w:p>
-          <w:p>
-            <w:pPr>
-              <w:spacing w:after="180"/>
-            </w:pPr>
-            <w:r>
-              <w:rPr>
-                <w:rFonts w:ascii="Calibri" w:hAnsi="Calibri"/>
-                <w:color w:val="425B72"/>
-                <w:sz w:val="19"/>
-              </w:rPr>
-              <w:t xml:space="preserve"> </w:t>
-            </w:r>
-          </w:p>
-        </w:tc>
-      </w:tr>
-      <w:tr>
-        <w:trPr>
-          <w:cantSplit w:val="true"/>
-        </w:trPr>
-        <w:tc>
-          <w:tcPr>
-            <w:tcW w:type="dxa" w:w="6986"/>
-            <w:shd w:fill="FFFFFF"/>
-          </w:tcPr>
-          <w:p>
-            <w:pPr>
-              <w:spacing w:after="60"/>
-            </w:pPr>
-            <w:r/>
-          </w:p>
-          <w:p>
-            <w:pPr>
-              <w:spacing w:before="0" w:after="80"/>
-            </w:pPr>
-            <w:r>
-              <w:rPr>
-                <w:rFonts w:ascii="Calibri" w:hAnsi="Calibri"/>
-                <w:b/>
-                <w:color w:val="B18F4D"/>
-                <w:sz w:val="15"/>
-              </w:rPr>
-              <w:t>SECTION / COPY BLOCK</w:t>
-            </w:r>
-          </w:p>
-          <w:p>
-            <w:pPr>
-              <w:spacing w:after="100"/>
-            </w:pPr>
-            <w:r>
-              <w:rPr>
-                <w:rFonts w:ascii="Calibri" w:hAnsi="Calibri"/>
-                <w:b/>
-                <w:color w:val="0F2038"/>
-                <w:sz w:val="21"/>
-              </w:rPr>
-              <w:t>What coordinated planning looks like before year-end</w:t>
-            </w:r>
-          </w:p>
-          <w:p>
-            <w:pPr>
-              <w:spacing w:after="80"/>
-            </w:pPr>
-            <w:r>
-              <w:rPr>
-                <w:rFonts w:ascii="Calibri" w:hAnsi="Calibri"/>
-                <w:color w:val="425B72"/>
-                <w:sz w:val="19"/>
-              </w:rPr>
-              <w:t>DETAIL LABEL: Coordination series preview</w:t>
-            </w:r>
-          </w:p>
-          <w:p>
-            <w:pPr>
-              <w:spacing w:after="80"/>
-            </w:pPr>
-            <w:r>
-              <w:rPr>
-                <w:rFonts w:ascii="Calibri" w:hAnsi="Calibri"/>
-                <w:color w:val="425B72"/>
-                <w:sz w:val="19"/>
-              </w:rPr>
-              <w:t>Assign the decision, the owner, and the deadline before the calendar gets crowded.</w:t>
-            </w:r>
-          </w:p>
-          <w:p>
-            <w:pPr>
-              <w:spacing w:after="80"/>
-            </w:pPr>
-            <w:r>
-              <w:rPr>
-                <w:rFonts w:ascii="Calibri" w:hAnsi="Calibri"/>
-                <w:color w:val="425B72"/>
-                <w:sz w:val="19"/>
-              </w:rPr>
-              <w:t>Listen to the podcast</w:t>
-            </w:r>
-          </w:p>
-        </w:tc>
-        <w:tc>
-          <w:tcPr>
-            <w:tcW w:type="dxa" w:w="6986"/>
-            <w:shd w:fill="FFF9ED"/>
-          </w:tcPr>
-          <w:p>
-            <w:pPr>
-              <w:spacing w:after="60"/>
-            </w:pPr>
-            <w:r/>
-          </w:p>
-          <w:p>
-            <w:pPr>
-              <w:spacing w:before="0" w:after="80"/>
-            </w:pPr>
-            <w:r>
-              <w:rPr>
-                <w:rFonts w:ascii="Calibri" w:hAnsi="Calibri"/>
-                <w:b/>
-                <w:color w:val="2D5474"/>
-                <w:sz w:val="15"/>
-              </w:rPr>
-              <w:t>DECISION</w:t>
-            </w:r>
-          </w:p>
-          <w:p>
-            <w:pPr>
-              <w:spacing w:after="100"/>
-            </w:pPr>
-            <w:r>
-              <w:rPr>
-                <w:rFonts w:ascii="Calibri" w:hAnsi="Calibri"/>
-                <w:b/>
-                <w:color w:val="0F2038"/>
-                <w:sz w:val="19"/>
-              </w:rPr>
-              <w:t>Keep  /  Edit  /  Replace</w:t>
-            </w:r>
-          </w:p>
-          <w:p>
-            <w:pPr>
-              <w:spacing w:after="160"/>
-            </w:pPr>
-            <w:r>
-              <w:rPr>
-                <w:rFonts w:ascii="Calibri" w:hAnsi="Calibri"/>
-                <w:i/>
-                <w:color w:val="425B72"/>
-                <w:sz w:val="17"/>
-              </w:rPr>
-              <w:t>Keep, edit, or replace this copy.</w:t>
-            </w:r>
-          </w:p>
-          <w:p>
-            <w:pPr>
-              <w:spacing w:after="80"/>
-            </w:pPr>
-            <w:r>
-              <w:rPr>
-                <w:rFonts w:ascii="Calibri" w:hAnsi="Calibri"/>
-                <w:b/>
-                <w:color w:val="2D5474"/>
-                <w:sz w:val="17"/>
-              </w:rPr>
-              <w:t>Alex's replacement copy or notes:</w:t>
-            </w:r>
-          </w:p>
-          <w:p>
-            <w:pPr>
-              <w:spacing w:after="180"/>
-            </w:pPr>
-            <w:r>
-              <w:rPr>
-                <w:rFonts w:ascii="Calibri" w:hAnsi="Calibri"/>
-                <w:color w:val="425B72"/>
-                <w:sz w:val="19"/>
-              </w:rPr>
-              <w:t xml:space="preserve"> </w:t>
-            </w:r>
-          </w:p>
-          <w:p>
-            <w:pPr>
-              <w:spacing w:after="180"/>
-            </w:pPr>
-            <w:r>
-              <w:rPr>
-                <w:rFonts w:ascii="Calibri" w:hAnsi="Calibri"/>
-                <w:color w:val="425B72"/>
-                <w:sz w:val="19"/>
-              </w:rPr>
-              <w:t xml:space="preserve"> </w:t>
-            </w:r>
-          </w:p>
-          <w:p>
-            <w:pPr>
-              <w:spacing w:after="180"/>
-            </w:pPr>
-            <w:r>
-              <w:rPr>
-                <w:rFonts w:ascii="Calibri" w:hAnsi="Calibri"/>
-                <w:color w:val="425B72"/>
-                <w:sz w:val="19"/>
-              </w:rPr>
-              <w:t xml:space="preserve"> </w:t>
-            </w:r>
-          </w:p>
-        </w:tc>
-      </w:tr>
-      <w:tr>
-        <w:trPr>
-          <w:cantSplit w:val="true"/>
-        </w:trPr>
-        <w:tc>
-          <w:tcPr>
-            <w:tcW w:type="dxa" w:w="6986"/>
-            <w:shd w:fill="FFFFFF"/>
-          </w:tcPr>
-          <w:p>
-            <w:pPr>
-              <w:spacing w:after="60"/>
-            </w:pPr>
-            <w:r/>
-          </w:p>
-          <w:p>
-            <w:pPr>
-              <w:spacing w:before="0" w:after="80"/>
-            </w:pPr>
-            <w:r>
-              <w:rPr>
-                <w:rFonts w:ascii="Calibri" w:hAnsi="Calibri"/>
-                <w:b/>
-                <w:color w:val="B18F4D"/>
-                <w:sz w:val="15"/>
-              </w:rPr>
-              <w:t>SECTION / COPY BLOCK</w:t>
-            </w:r>
-          </w:p>
-          <w:p>
-            <w:pPr>
-              <w:spacing w:after="100"/>
-            </w:pPr>
-            <w:r>
-              <w:rPr>
-                <w:rFonts w:ascii="Calibri" w:hAnsi="Calibri"/>
-                <w:b/>
-                <w:color w:val="0F2038"/>
-                <w:sz w:val="21"/>
-              </w:rPr>
-              <w:t>Five questions to ask before responding to an offer</w:t>
-            </w:r>
-          </w:p>
-          <w:p>
-            <w:pPr>
-              <w:spacing w:after="80"/>
-            </w:pPr>
-            <w:r>
-              <w:rPr>
-                <w:rFonts w:ascii="Calibri" w:hAnsi="Calibri"/>
-                <w:color w:val="425B72"/>
-                <w:sz w:val="19"/>
-              </w:rPr>
-              <w:t>DETAIL LABEL: Business transition series preview</w:t>
-            </w:r>
-          </w:p>
-          <w:p>
-            <w:pPr>
-              <w:spacing w:after="80"/>
-            </w:pPr>
-            <w:r>
-              <w:rPr>
-                <w:rFonts w:ascii="Calibri" w:hAnsi="Calibri"/>
-                <w:color w:val="425B72"/>
-                <w:sz w:val="19"/>
-              </w:rPr>
-              <w:t>Separate valuation, taxes, family goals, and deal timing before momentum makes the choice.</w:t>
-            </w:r>
-          </w:p>
-          <w:p>
-            <w:pPr>
-              <w:spacing w:after="80"/>
-            </w:pPr>
-            <w:r>
-              <w:rPr>
-                <w:rFonts w:ascii="Calibri" w:hAnsi="Calibri"/>
-                <w:color w:val="425B72"/>
-                <w:sz w:val="19"/>
-              </w:rPr>
-              <w:t>Listen to the podcast</w:t>
-            </w:r>
-          </w:p>
-        </w:tc>
-        <w:tc>
-          <w:tcPr>
-            <w:tcW w:type="dxa" w:w="6986"/>
-            <w:shd w:fill="FFF9ED"/>
-          </w:tcPr>
-          <w:p>
-            <w:pPr>
-              <w:spacing w:after="60"/>
-            </w:pPr>
-            <w:r/>
-          </w:p>
-          <w:p>
-            <w:pPr>
-              <w:spacing w:before="0" w:after="80"/>
-            </w:pPr>
-            <w:r>
-              <w:rPr>
-                <w:rFonts w:ascii="Calibri" w:hAnsi="Calibri"/>
-                <w:b/>
-                <w:color w:val="2D5474"/>
-                <w:sz w:val="15"/>
-              </w:rPr>
-              <w:t>DECISION</w:t>
-            </w:r>
-          </w:p>
-          <w:p>
-            <w:pPr>
-              <w:spacing w:after="100"/>
-            </w:pPr>
-            <w:r>
-              <w:rPr>
-                <w:rFonts w:ascii="Calibri" w:hAnsi="Calibri"/>
-                <w:b/>
-                <w:color w:val="0F2038"/>
-                <w:sz w:val="19"/>
-              </w:rPr>
-              <w:t>Keep  /  Edit  /  Replace</w:t>
-            </w:r>
-          </w:p>
-          <w:p>
-            <w:pPr>
-              <w:spacing w:after="160"/>
-            </w:pPr>
-            <w:r>
-              <w:rPr>
-                <w:rFonts w:ascii="Calibri" w:hAnsi="Calibri"/>
-                <w:i/>
-                <w:color w:val="425B72"/>
-                <w:sz w:val="17"/>
-              </w:rPr>
-              <w:t>Keep, edit, or replace this copy.</w:t>
-            </w:r>
-          </w:p>
-          <w:p>
-            <w:pPr>
-              <w:spacing w:after="80"/>
-            </w:pPr>
-            <w:r>
-              <w:rPr>
-                <w:rFonts w:ascii="Calibri" w:hAnsi="Calibri"/>
-                <w:b/>
-                <w:color w:val="2D5474"/>
-                <w:sz w:val="17"/>
-              </w:rPr>
-              <w:t>Alex's replacement copy or notes:</w:t>
-            </w:r>
-          </w:p>
-          <w:p>
-            <w:pPr>
-              <w:spacing w:after="180"/>
-            </w:pPr>
-            <w:r>
-              <w:rPr>
-                <w:rFonts w:ascii="Calibri" w:hAnsi="Calibri"/>
-                <w:color w:val="425B72"/>
-                <w:sz w:val="19"/>
-              </w:rPr>
-              <w:t xml:space="preserve"> </w:t>
-            </w:r>
-          </w:p>
-          <w:p>
-            <w:pPr>
-              <w:spacing w:after="180"/>
-            </w:pPr>
-            <w:r>
-              <w:rPr>
-                <w:rFonts w:ascii="Calibri" w:hAnsi="Calibri"/>
-                <w:color w:val="425B72"/>
-                <w:sz w:val="19"/>
-              </w:rPr>
-              <w:t xml:space="preserve"> </w:t>
-            </w:r>
-          </w:p>
-          <w:p>
-            <w:pPr>
-              <w:spacing w:after="180"/>
-            </w:pPr>
-            <w:r>
-              <w:rPr>
-                <w:rFonts w:ascii="Calibri" w:hAnsi="Calibri"/>
-                <w:color w:val="425B72"/>
-                <w:sz w:val="19"/>
-              </w:rPr>
-              <w:t xml:space="preserve"> </w:t>
-            </w:r>
-          </w:p>
-        </w:tc>
-      </w:tr>
-      <w:tr>
-        <w:trPr>
-          <w:cantSplit w:val="true"/>
-        </w:trPr>
-        <w:tc>
-          <w:tcPr>
-            <w:tcW w:type="dxa" w:w="6986"/>
-            <w:shd w:fill="FFFFFF"/>
-          </w:tcPr>
-          <w:p>
-            <w:pPr>
-              <w:spacing w:after="60"/>
-            </w:pPr>
-            <w:r/>
-          </w:p>
-          <w:p>
-            <w:pPr>
-              <w:spacing w:before="0" w:after="80"/>
-            </w:pPr>
-            <w:r>
-              <w:rPr>
-                <w:rFonts w:ascii="Calibri" w:hAnsi="Calibri"/>
-                <w:b/>
-                <w:color w:val="B18F4D"/>
-                <w:sz w:val="15"/>
-              </w:rPr>
-              <w:t>SECTION / COPY BLOCK</w:t>
-            </w:r>
-          </w:p>
-          <w:p>
-            <w:pPr>
-              <w:spacing w:after="100"/>
-            </w:pPr>
-            <w:r>
-              <w:rPr>
-                <w:rFonts w:ascii="Calibri" w:hAnsi="Calibri"/>
-                <w:b/>
-                <w:color w:val="0F2038"/>
-                <w:sz w:val="21"/>
-              </w:rPr>
-              <w:t>The decisions hiding inside an RSU vest</w:t>
-            </w:r>
-          </w:p>
-          <w:p>
-            <w:pPr>
-              <w:spacing w:after="80"/>
-            </w:pPr>
-            <w:r>
-              <w:rPr>
-                <w:rFonts w:ascii="Calibri" w:hAnsi="Calibri"/>
-                <w:color w:val="425B72"/>
-                <w:sz w:val="19"/>
-              </w:rPr>
-              <w:t>DETAIL LABEL: Equity compensation series preview</w:t>
             </w:r>
           </w:p>
           <w:p>

</xml_diff>

<commit_message>
docs(anchor): refresh client copy handoff
</commit_message>
<xml_diff>
--- a/projects/awp/copy/Anchor_Copy_Review_Side_by_Side.docx
+++ b/projects/awp/copy/Anchor_Copy_Review_Side_by_Side.docx
@@ -13773,6 +13773,19 @@
                 <w:color w:val="425B72"/>
                 <w:sz w:val="19"/>
               </w:rPr>
+              <w:t>INTERFACE LABEL: Anchor Wealth Planning home</w:t>
+            </w:r>
+          </w:p>
+          <w:p>
+            <w:pPr>
+              <w:spacing w:after="80"/>
+            </w:pPr>
+            <w:r>
+              <w:rPr>
+                <w:rFonts w:ascii="Calibri" w:hAnsi="Calibri"/>
+                <w:color w:val="425B72"/>
+                <w:sz w:val="19"/>
+              </w:rPr>
               <w:t>INTERFACE LABEL: Toggle navigation</w:t>
             </w:r>
           </w:p>
@@ -16143,6 +16156,19 @@
                 <w:color w:val="425B72"/>
                 <w:sz w:val="19"/>
               </w:rPr>
+              <w:t>INTERFACE LABEL: Anchor Wealth Planning home</w:t>
+            </w:r>
+          </w:p>
+          <w:p>
+            <w:pPr>
+              <w:spacing w:after="80"/>
+            </w:pPr>
+            <w:r>
+              <w:rPr>
+                <w:rFonts w:ascii="Calibri" w:hAnsi="Calibri"/>
+                <w:color w:val="425B72"/>
+                <w:sz w:val="19"/>
+              </w:rPr>
               <w:t>INTERFACE LABEL: Toggle navigation</w:t>
             </w:r>
           </w:p>
@@ -17762,6 +17788,19 @@
                 <w:color w:val="425B72"/>
                 <w:sz w:val="19"/>
               </w:rPr>
+              <w:t>INTERFACE LABEL: Anchor Wealth Planning home</w:t>
+            </w:r>
+          </w:p>
+          <w:p>
+            <w:pPr>
+              <w:spacing w:after="80"/>
+            </w:pPr>
+            <w:r>
+              <w:rPr>
+                <w:rFonts w:ascii="Calibri" w:hAnsi="Calibri"/>
+                <w:color w:val="425B72"/>
+                <w:sz w:val="19"/>
+              </w:rPr>
               <w:t>INTERFACE LABEL: Toggle navigation</w:t>
             </w:r>
           </w:p>
@@ -19468,6 +19507,19 @@
                 <w:color w:val="425B72"/>
                 <w:sz w:val="19"/>
               </w:rPr>
+              <w:t>INTERFACE LABEL: Anchor Wealth Planning home</w:t>
+            </w:r>
+          </w:p>
+          <w:p>
+            <w:pPr>
+              <w:spacing w:after="80"/>
+            </w:pPr>
+            <w:r>
+              <w:rPr>
+                <w:rFonts w:ascii="Calibri" w:hAnsi="Calibri"/>
+                <w:color w:val="425B72"/>
+                <w:sz w:val="19"/>
+              </w:rPr>
               <w:t>INTERFACE LABEL: Toggle navigation</w:t>
             </w:r>
           </w:p>
@@ -21162,6 +21214,19 @@
                 <w:sz w:val="21"/>
               </w:rPr>
               <w:t>Accessibility and interface text</w:t>
+            </w:r>
+          </w:p>
+          <w:p>
+            <w:pPr>
+              <w:spacing w:after="80"/>
+            </w:pPr>
+            <w:r>
+              <w:rPr>
+                <w:rFonts w:ascii="Calibri" w:hAnsi="Calibri"/>
+                <w:color w:val="425B72"/>
+                <w:sz w:val="19"/>
+              </w:rPr>
+              <w:t>INTERFACE LABEL: Anchor Wealth Planning home</w:t>
             </w:r>
           </w:p>
           <w:p>

</xml_diff>

<commit_message>
feat(anchor): apply Alex copy revisions
</commit_message>
<xml_diff>
--- a/projects/awp/copy/Anchor_Copy_Review_Side_by_Side.docx
+++ b/projects/awp/copy/Anchor_Copy_Review_Side_by_Side.docx
@@ -521,7 +521,7 @@
                 <w:color w:val="425B72"/>
                 <w:sz w:val="19"/>
               </w:rPr>
-              <w:t>CURRENT POSITIONING: Houston-based fiduciary wealth management for oil &amp; gas executives, business owners, and high-net-worth families.</w:t>
+              <w:t>CURRENT POSITIONING: Houston-based fiduciary wealth management for high-net-worth families, oil &amp; gas executives, and business owners.</w:t>
             </w:r>
           </w:p>
           <w:p>
@@ -712,7 +712,7 @@
                 <w:color w:val="425B72"/>
                 <w:sz w:val="19"/>
               </w:rPr>
-              <w:t>CURRENT TITLE PLACEHOLDER: Alex Miller</w:t>
+              <w:t>CURRENT TITLE: Alex Miller, Financial Advisor and Managing Partner (client supplied; compliance review pending).</w:t>
             </w:r>
           </w:p>
           <w:p>
@@ -738,7 +738,7 @@
                 <w:color w:val="425B72"/>
                 <w:sz w:val="19"/>
               </w:rPr>
-              <w:t>CURRENT PLACEHOLDER: Alex’s approved biography, credentials, prior-firm history, community involvement, and personal details will be inserted after client and compliance review.</w:t>
+              <w:t>CURRENT BIOGRAPHY: Alex brings 19 years of experience helping individuals and families pursue their financial goals through comprehensive planning and investment management. His work emphasizes family legacy, estate and wealth planning, and retirement strategies.</w:t>
             </w:r>
           </w:p>
         </w:tc>
@@ -903,7 +903,7 @@
                 <w:color w:val="425B72"/>
                 <w:sz w:val="19"/>
               </w:rPr>
-              <w:t>[XX]+ years in the industry — Experience across institutional wealth management and independent advice.</w:t>
+              <w:t>19 years in the industry (client supplied; compliance review pending).</w:t>
             </w:r>
           </w:p>
           <w:p>
@@ -916,7 +916,7 @@
                 <w:color w:val="425B72"/>
                 <w:sz w:val="19"/>
               </w:rPr>
-              <w:t>[Credential 01] — Approved professional designation and issuing organization go here.</w:t>
+              <w:t>APMA® — Accredited Portfolio Management Advisor, College for Financial Planning (client supplied; compliance review pending).</w:t>
             </w:r>
           </w:p>
           <w:p>
@@ -929,7 +929,7 @@
                 <w:color w:val="425B72"/>
                 <w:sz w:val="19"/>
               </w:rPr>
-              <w:t>[Credential 02] — Approved license, certification, or specialist training goes here.</w:t>
+              <w:t>CRPC® — Chartered Retirement Planning Counselor, College for Financial Planning (client supplied; compliance review pending).</w:t>
             </w:r>
           </w:p>
           <w:p>
@@ -942,7 +942,7 @@
                 <w:color w:val="425B72"/>
                 <w:sz w:val="19"/>
               </w:rPr>
-              <w:t>[Accolade 01] — Approved recognition, year, source, and selection criteria go here.</w:t>
+              <w:t>No accolade supplied; the placeholder has been removed.</w:t>
             </w:r>
           </w:p>
         </w:tc>
@@ -1107,7 +1107,7 @@
                 <w:color w:val="425B72"/>
                 <w:sz w:val="19"/>
               </w:rPr>
-              <w:t>CURRENT TEAM PROMISE: People who own the next step. A coordinated plan works only when responsibility is clear.</w:t>
+              <w:t>CURRENT TEAM PROMISE: Dedicated people who own the next step. A coordinated plan works only when responsibility is clear and accountability is paramount.</w:t>
             </w:r>
           </w:p>
           <w:p>
@@ -1120,7 +1120,33 @@
                 <w:color w:val="425B72"/>
                 <w:sz w:val="19"/>
               </w:rPr>
-              <w:t>CURRENT PLACEHOLDERS: Two additional [Name &amp; Role] profiles for an advisor, client service lead, operations partner, or other approved team member.</w:t>
+              <w:t>Haley Johnson — Director of Operations.</w:t>
+            </w:r>
+          </w:p>
+          <w:p>
+            <w:pPr>
+              <w:spacing w:after="80"/>
+            </w:pPr>
+            <w:r>
+              <w:rPr>
+                <w:rFonts w:ascii="Calibri" w:hAnsi="Calibri"/>
+                <w:color w:val="425B72"/>
+                <w:sz w:val="19"/>
+              </w:rPr>
+              <w:t>Dawn Cooper — Team Operations Leader, Advisor Services — Axiom.</w:t>
+            </w:r>
+          </w:p>
+          <w:p>
+            <w:pPr>
+              <w:spacing w:after="80"/>
+            </w:pPr>
+            <w:r>
+              <w:rPr>
+                <w:rFonts w:ascii="Calibri" w:hAnsi="Calibri"/>
+                <w:color w:val="425B72"/>
+                <w:sz w:val="19"/>
+              </w:rPr>
+              <w:t>Derek Morris — Director of Insurance Strategies — Axiom.</w:t>
             </w:r>
           </w:p>
         </w:tc>
@@ -1528,7 +1554,7 @@
                 <w:color w:val="425B72"/>
                 <w:sz w:val="19"/>
               </w:rPr>
-              <w:t>SITUATION OPTIONS: Oil and gas executive with equity compensation · Business owner considering a transition · High-net-worth family with estate and legacy complexity · Other / not sure.</w:t>
+              <w:t>SITUATION OPTIONS: High-net-worth family with estate and legacy complexity · Executive with equity compensation · Business owner considering a transition.</w:t>
             </w:r>
           </w:p>
           <w:p>
@@ -1719,7 +1745,7 @@
                 <w:color w:val="0F2038"/>
                 <w:sz w:val="21"/>
               </w:rPr>
-              <w:t>Homepage hero — Oil &amp; Gas</w:t>
+              <w:t>Homepage hero — High-Net-Worth Families</w:t>
             </w:r>
           </w:p>
           <w:p>
@@ -1732,7 +1758,7 @@
                 <w:color w:val="425B72"/>
                 <w:sz w:val="19"/>
               </w:rPr>
-              <w:t>When your equity vests, who sees the whole picture?</w:t>
+              <w:t>Your wealth grew. Did your plan keep up?</w:t>
             </w:r>
           </w:p>
           <w:p>
@@ -1745,7 +1771,7 @@
                 <w:color w:val="425B72"/>
                 <w:sz w:val="19"/>
               </w:rPr>
-              <w:t>RSUs, deferred comp, blackout periods, commodity cycles. Anchor coordinates your investments, taxes, and estate plan with your CPA and attorney—so every vest, bonus, and decision happens in context.</w:t>
+              <w:t>Trust funding, beneficiary reviews, multi-generational coordination. Anchor keeps your CPA, attorney, and advisor reading from the same page—so your estate matches your actual net worth.</w:t>
             </w:r>
           </w:p>
         </w:tc>
@@ -1799,7 +1825,7 @@
                 <w:color w:val="425B72"/>
                 <w:sz w:val="17"/>
               </w:rPr>
-              <w:t>Approve, edit, or replace this headline and description. Confirm this should be the lead hero audience.</w:t>
+              <w:t>Alex selected this as the lead hero. Approve, edit, or replace the headline and description.</w:t>
             </w:r>
           </w:p>
           <w:p>
@@ -1884,7 +1910,7 @@
                 <w:color w:val="0F2038"/>
                 <w:sz w:val="21"/>
               </w:rPr>
-              <w:t>Homepage hero — Business Owners</w:t>
+              <w:t>Homepage hero — Oil &amp; Gas</w:t>
             </w:r>
           </w:p>
           <w:p>
@@ -1897,7 +1923,7 @@
                 <w:color w:val="425B72"/>
                 <w:sz w:val="19"/>
               </w:rPr>
-              <w:t>Your business is your largest asset. What’s the plan for it?</w:t>
+              <w:t>When your equity vests, who sees the whole picture?</w:t>
             </w:r>
           </w:p>
           <w:p>
@@ -1910,7 +1936,7 @@
                 <w:color w:val="425B72"/>
                 <w:sz w:val="19"/>
               </w:rPr>
-              <w:t>Entity structure, exit timing, liquidity events, and the line between business value and personal wealth. Anchor starts the planning conversation years before the LOI arrives.</w:t>
+              <w:t>RSUs, deferred comp, blackout periods, commodity cycles. Anchor coordinates your investments, taxes, and estate plan with your CPA and attorney—so every vest, bonus, and decision happens in context.</w:t>
             </w:r>
           </w:p>
         </w:tc>
@@ -1964,7 +1990,7 @@
                 <w:color w:val="425B72"/>
                 <w:sz w:val="17"/>
               </w:rPr>
-              <w:t>Approve or replace this headline and description. Confirm the ‘before the LOI’ framing matches Alex’s process.</w:t>
+              <w:t>Approve or replace this headline and description.</w:t>
             </w:r>
           </w:p>
           <w:p>
@@ -2049,7 +2075,7 @@
                 <w:color w:val="0F2038"/>
                 <w:sz w:val="21"/>
               </w:rPr>
-              <w:t>Homepage hero — High-Net-Worth Families</w:t>
+              <w:t>Homepage hero — Business Owners</w:t>
             </w:r>
           </w:p>
           <w:p>
@@ -2062,7 +2088,7 @@
                 <w:color w:val="425B72"/>
                 <w:sz w:val="19"/>
               </w:rPr>
-              <w:t>Your wealth grew. Did your plan keep up?</w:t>
+              <w:t>Your business is your largest asset. What’s the plan for it?</w:t>
             </w:r>
           </w:p>
           <w:p>
@@ -2075,7 +2101,7 @@
                 <w:color w:val="425B72"/>
                 <w:sz w:val="19"/>
               </w:rPr>
-              <w:t>Trust funding, beneficiary reviews, multi-generational coordination. Anchor keeps your CPA, attorney, and advisor reading from the same page—so your estate matches your actual net worth.</w:t>
+              <w:t>Entity structure, exit timing, liquidity events, and the line between business value and personal wealth. Anchor starts the planning conversation years before the LOI arrives.</w:t>
             </w:r>
           </w:p>
         </w:tc>
@@ -2129,7 +2155,7 @@
                 <w:color w:val="425B72"/>
                 <w:sz w:val="17"/>
               </w:rPr>
-              <w:t>Approve or replace this headline and description. Confirm the preferred public audience label.</w:t>
+              <w:t>Approve or replace this headline and description. Confirm the ‘before the LOI’ framing matches Alex’s process.</w:t>
             </w:r>
           </w:p>
           <w:p>
@@ -2227,7 +2253,7 @@
                 <w:color w:val="425B72"/>
                 <w:sz w:val="19"/>
               </w:rPr>
-              <w:t>One advisor who sees the whole picture.</w:t>
+              <w:t>A dedicated advisor who sees the whole picture.</w:t>
             </w:r>
           </w:p>
           <w:p>
@@ -2253,7 +2279,7 @@
                 <w:color w:val="425B72"/>
                 <w:sz w:val="19"/>
               </w:rPr>
-              <w:t>Coordinated, not siloed · One accountable lead · Built for complexity · Houston fluency.</w:t>
+              <w:t>Coordinated, not siloed · One accountable lead · Built for complexity.</w:t>
             </w:r>
           </w:p>
         </w:tc>
@@ -2405,7 +2431,7 @@
                 <w:color w:val="425B72"/>
                 <w:sz w:val="19"/>
               </w:rPr>
-              <w:t>Oil &amp; Gas Executives — RSUs, NQDC elections, blackout periods, and commodity-cycle exposure.</w:t>
+              <w:t>High-Net-Worth Families — Trust funding, current beneficiaries, and a plan the next generation can understand.</w:t>
             </w:r>
           </w:p>
           <w:p>
@@ -2418,7 +2444,7 @@
                 <w:color w:val="425B72"/>
                 <w:sz w:val="19"/>
               </w:rPr>
-              <w:t>Business Owners — Exit readiness, entity structure, and the line between business value and personal wealth.</w:t>
+              <w:t>Oil &amp; Gas Executives — RSUs, NQDC elections, blackout periods, and commodity-cycle exposure.</w:t>
             </w:r>
           </w:p>
           <w:p>
@@ -2431,7 +2457,7 @@
                 <w:color w:val="425B72"/>
                 <w:sz w:val="19"/>
               </w:rPr>
-              <w:t>High-Net-Worth Families — Trust funding, current beneficiaries, and a plan the next generation can understand.</w:t>
+              <w:t>Business Owners — Exit readiness, entity structure, and the line between business value and personal wealth.</w:t>
             </w:r>
           </w:p>
           <w:p>
@@ -2444,7 +2470,7 @@
                 <w:color w:val="425B72"/>
                 <w:sz w:val="19"/>
               </w:rPr>
-              <w:t>CURRENT FRAMING: If you don’t see yourself below, we may not be the right fit—and we’ll tell you that honestly.</w:t>
+              <w:t>CURRENT FRAMING: If you do not see your situation below, let’s have a quick introduction. Anchor will offer an honest opinion about whether the relationship is a fit.</w:t>
             </w:r>
           </w:p>
         </w:tc>
@@ -4055,6 +4081,409 @@
         <w:pStyle w:val="Heading1"/>
       </w:pPr>
       <w:r>
+        <w:t>High-Net-Worth Families</w:t>
+      </w:r>
+    </w:p>
+    <w:p>
+      <w:pPr>
+        <w:keepNext/>
+        <w:spacing w:after="160"/>
+      </w:pPr>
+      <w:r>
+        <w:rPr>
+          <w:rFonts w:ascii="Calibri" w:hAnsi="Calibri"/>
+          <w:color w:val="2D5474"/>
+          <w:sz w:val="16"/>
+        </w:rPr>
+        <w:t>https://caebaby.github.io/anchor-review/high-net-worth-families.html</w:t>
+      </w:r>
+    </w:p>
+    <w:tbl>
+      <w:tblPr>
+        <w:tblW w:type="dxa" w:w="13972"/>
+        <w:tblLayout w:type="fixed"/>
+        <w:tblLook w:firstColumn="1" w:firstRow="1" w:lastColumn="0" w:lastRow="0" w:noHBand="0" w:noVBand="1" w:val="04A0"/>
+        <w:tblInd w:w="140" w:type="dxa"/>
+        <w:tblBorders>
+          <w:top w:val="single" w:sz="6" w:space="0" w:color="D5DDE5"/>
+          <w:left w:val="single" w:sz="6" w:space="0" w:color="D5DDE5"/>
+          <w:bottom w:val="single" w:sz="6" w:space="0" w:color="D5DDE5"/>
+          <w:right w:val="single" w:sz="6" w:space="0" w:color="D5DDE5"/>
+          <w:insideH w:val="single" w:sz="6" w:space="0" w:color="D5DDE5"/>
+          <w:insideV w:val="single" w:sz="6" w:space="0" w:color="D5DDE5"/>
+        </w:tblBorders>
+      </w:tblPr>
+      <w:tblGrid>
+        <w:gridCol w:w="6986"/>
+        <w:gridCol w:w="6986"/>
+      </w:tblGrid>
+      <w:tr>
+        <w:trPr>
+          <w:tblHeader w:val="true"/>
+        </w:trPr>
+        <w:tc>
+          <w:tcPr>
+            <w:tcW w:type="dxa" w:w="6986"/>
+            <w:tcMar>
+              <w:top w:w="100" w:type="dxa"/>
+              <w:bottom w:w="100" w:type="dxa"/>
+              <w:start w:w="140" w:type="dxa"/>
+              <w:end w:w="140" w:type="dxa"/>
+            </w:tcMar>
+            <w:vAlign w:val="top"/>
+            <w:shd w:fill="0F2038"/>
+          </w:tcPr>
+          <w:p>
+            <w:pPr>
+              <w:spacing w:after="60"/>
+              <w:jc w:val="left"/>
+            </w:pPr>
+            <w:r/>
+            <w:r>
+              <w:rPr>
+                <w:rFonts w:ascii="Calibri" w:hAnsi="Calibri"/>
+                <w:b/>
+                <w:color w:val="FFFFFF"/>
+                <w:sz w:val="18"/>
+              </w:rPr>
+              <w:t>CURRENT WEBSITE COPY</w:t>
+            </w:r>
+          </w:p>
+        </w:tc>
+        <w:tc>
+          <w:tcPr>
+            <w:tcW w:type="dxa" w:w="6986"/>
+            <w:tcMar>
+              <w:top w:w="100" w:type="dxa"/>
+              <w:bottom w:w="100" w:type="dxa"/>
+              <w:start w:w="140" w:type="dxa"/>
+              <w:end w:w="140" w:type="dxa"/>
+            </w:tcMar>
+            <w:vAlign w:val="top"/>
+            <w:shd w:fill="0F2038"/>
+          </w:tcPr>
+          <w:p>
+            <w:pPr>
+              <w:spacing w:after="60"/>
+              <w:jc w:val="left"/>
+            </w:pPr>
+            <w:r/>
+            <w:r>
+              <w:rPr>
+                <w:rFonts w:ascii="Calibri" w:hAnsi="Calibri"/>
+                <w:b/>
+                <w:color w:val="FFFFFF"/>
+                <w:sz w:val="18"/>
+              </w:rPr>
+              <w:t>ALEX'S VERSION / CHANGES</w:t>
+            </w:r>
+          </w:p>
+        </w:tc>
+      </w:tr>
+      <w:tr>
+        <w:trPr>
+          <w:cantSplit w:val="true"/>
+        </w:trPr>
+        <w:tc>
+          <w:tcPr>
+            <w:tcW w:type="dxa" w:w="6986"/>
+            <w:shd w:fill="FFFFFF"/>
+          </w:tcPr>
+          <w:p>
+            <w:pPr>
+              <w:spacing w:after="60"/>
+            </w:pPr>
+            <w:r/>
+          </w:p>
+          <w:p>
+            <w:pPr>
+              <w:spacing w:before="0" w:after="80"/>
+            </w:pPr>
+            <w:r>
+              <w:rPr>
+                <w:rFonts w:ascii="Calibri" w:hAnsi="Calibri"/>
+                <w:b/>
+                <w:color w:val="B18F4D"/>
+                <w:sz w:val="15"/>
+              </w:rPr>
+              <w:t>SECONDARY COPY</w:t>
+            </w:r>
+          </w:p>
+          <w:p>
+            <w:pPr>
+              <w:spacing w:after="100"/>
+            </w:pPr>
+            <w:r>
+              <w:rPr>
+                <w:rFonts w:ascii="Calibri" w:hAnsi="Calibri"/>
+                <w:b/>
+                <w:color w:val="0F2038"/>
+                <w:sz w:val="21"/>
+              </w:rPr>
+              <w:t>Family page supporting message</w:t>
+            </w:r>
+          </w:p>
+          <w:p>
+            <w:pPr>
+              <w:spacing w:after="80"/>
+            </w:pPr>
+            <w:r>
+              <w:rPr>
+                <w:rFonts w:ascii="Calibri" w:hAnsi="Calibri"/>
+                <w:color w:val="425B72"/>
+                <w:sz w:val="19"/>
+              </w:rPr>
+              <w:t>Keep the plan current across generations.</w:t>
+            </w:r>
+          </w:p>
+          <w:p>
+            <w:pPr>
+              <w:spacing w:after="80"/>
+            </w:pPr>
+            <w:r>
+              <w:rPr>
+                <w:rFonts w:ascii="Calibri" w:hAnsi="Calibri"/>
+                <w:color w:val="425B72"/>
+                <w:sz w:val="19"/>
+              </w:rPr>
+              <w:t>Investments, trusts, beneficiaries, taxes, and family communication should tell the same story.</w:t>
+            </w:r>
+          </w:p>
+          <w:p>
+            <w:pPr>
+              <w:spacing w:after="80"/>
+            </w:pPr>
+            <w:r>
+              <w:rPr>
+                <w:rFonts w:ascii="Calibri" w:hAnsi="Calibri"/>
+                <w:color w:val="425B72"/>
+                <w:sz w:val="19"/>
+              </w:rPr>
+              <w:t>Your wealth changed. Did the plan?</w:t>
+            </w:r>
+          </w:p>
+          <w:p>
+            <w:pPr>
+              <w:spacing w:after="80"/>
+            </w:pPr>
+            <w:r>
+              <w:rPr>
+                <w:rFonts w:ascii="Calibri" w:hAnsi="Calibri"/>
+                <w:color w:val="425B72"/>
+                <w:sz w:val="19"/>
+              </w:rPr>
+              <w:t>Estate documents can remain untouched while assets, businesses, relationships, tax rules, and family priorities change around them. A signed document is not the same as an implemented plan.</w:t>
+            </w:r>
+          </w:p>
+          <w:p>
+            <w:pPr>
+              <w:spacing w:after="80"/>
+            </w:pPr>
+            <w:r>
+              <w:rPr>
+                <w:rFonts w:ascii="Calibri" w:hAnsi="Calibri"/>
+                <w:color w:val="425B72"/>
+                <w:sz w:val="19"/>
+              </w:rPr>
+              <w:t>Anchor keeps the estate attorney, CPA, investment plan, account ownership, and beneficiary choices connected—and helps the family understand what the structure is designed to accomplish.</w:t>
+            </w:r>
+          </w:p>
+          <w:p>
+            <w:pPr>
+              <w:spacing w:after="80"/>
+            </w:pPr>
+            <w:r>
+              <w:rPr>
+                <w:rFonts w:ascii="Calibri" w:hAnsi="Calibri"/>
+                <w:color w:val="425B72"/>
+                <w:sz w:val="19"/>
+              </w:rPr>
+              <w:t>Review what exists</w:t>
+            </w:r>
+          </w:p>
+          <w:p>
+            <w:pPr>
+              <w:spacing w:after="80"/>
+            </w:pPr>
+            <w:r>
+              <w:rPr>
+                <w:rFonts w:ascii="Calibri" w:hAnsi="Calibri"/>
+                <w:color w:val="425B72"/>
+                <w:sz w:val="19"/>
+              </w:rPr>
+              <w:t>Compare current documents and beneficiaries with the family’s actual assets and intentions.</w:t>
+            </w:r>
+          </w:p>
+          <w:p>
+            <w:pPr>
+              <w:spacing w:after="80"/>
+            </w:pPr>
+            <w:r>
+              <w:rPr>
+                <w:rFonts w:ascii="Calibri" w:hAnsi="Calibri"/>
+                <w:color w:val="425B72"/>
+                <w:sz w:val="19"/>
+              </w:rPr>
+              <w:t>Close implementation gaps</w:t>
+            </w:r>
+          </w:p>
+          <w:p>
+            <w:pPr>
+              <w:spacing w:after="80"/>
+            </w:pPr>
+            <w:r>
+              <w:rPr>
+                <w:rFonts w:ascii="Calibri" w:hAnsi="Calibri"/>
+                <w:color w:val="425B72"/>
+                <w:sz w:val="19"/>
+              </w:rPr>
+              <w:t>Coordinate account ownership, trust funding, investment policy, and professional follow-through.</w:t>
+            </w:r>
+          </w:p>
+          <w:p>
+            <w:pPr>
+              <w:spacing w:after="80"/>
+            </w:pPr>
+            <w:r>
+              <w:rPr>
+                <w:rFonts w:ascii="Calibri" w:hAnsi="Calibri"/>
+                <w:color w:val="425B72"/>
+                <w:sz w:val="19"/>
+              </w:rPr>
+              <w:t>Prepare the family</w:t>
+            </w:r>
+          </w:p>
+          <w:p>
+            <w:pPr>
+              <w:spacing w:after="80"/>
+            </w:pPr>
+            <w:r>
+              <w:rPr>
+                <w:rFonts w:ascii="Calibri" w:hAnsi="Calibri"/>
+                <w:color w:val="425B72"/>
+                <w:sz w:val="19"/>
+              </w:rPr>
+              <w:t>Create an understandable plan and a thoughtful communication rhythm for the next generation.</w:t>
+            </w:r>
+          </w:p>
+        </w:tc>
+        <w:tc>
+          <w:tcPr>
+            <w:tcW w:type="dxa" w:w="6986"/>
+            <w:shd w:fill="FFF9ED"/>
+          </w:tcPr>
+          <w:p>
+            <w:pPr>
+              <w:spacing w:after="60"/>
+            </w:pPr>
+            <w:r/>
+          </w:p>
+          <w:p>
+            <w:pPr>
+              <w:spacing w:before="0" w:after="80"/>
+            </w:pPr>
+            <w:r>
+              <w:rPr>
+                <w:rFonts w:ascii="Calibri" w:hAnsi="Calibri"/>
+                <w:b/>
+                <w:color w:val="2D5474"/>
+                <w:sz w:val="15"/>
+              </w:rPr>
+              <w:t>DECISION</w:t>
+            </w:r>
+          </w:p>
+          <w:p>
+            <w:pPr>
+              <w:spacing w:after="100"/>
+            </w:pPr>
+            <w:r>
+              <w:rPr>
+                <w:rFonts w:ascii="Calibri" w:hAnsi="Calibri"/>
+                <w:b/>
+                <w:color w:val="0F2038"/>
+                <w:sz w:val="19"/>
+              </w:rPr>
+              <w:t>Keep  /  Edit  /  Replace</w:t>
+            </w:r>
+          </w:p>
+          <w:p>
+            <w:pPr>
+              <w:spacing w:after="160"/>
+            </w:pPr>
+            <w:r>
+              <w:rPr>
+                <w:rFonts w:ascii="Calibri" w:hAnsi="Calibri"/>
+                <w:i/>
+                <w:color w:val="425B72"/>
+                <w:sz w:val="17"/>
+              </w:rPr>
+              <w:t>Keep, edit, or replace this copy.</w:t>
+            </w:r>
+          </w:p>
+          <w:p>
+            <w:pPr>
+              <w:spacing w:after="80"/>
+            </w:pPr>
+            <w:r>
+              <w:rPr>
+                <w:rFonts w:ascii="Calibri" w:hAnsi="Calibri"/>
+                <w:b/>
+                <w:color w:val="2D5474"/>
+                <w:sz w:val="17"/>
+              </w:rPr>
+              <w:t>Alex's replacement copy or notes:</w:t>
+            </w:r>
+          </w:p>
+          <w:p>
+            <w:pPr>
+              <w:spacing w:after="180"/>
+            </w:pPr>
+            <w:r>
+              <w:rPr>
+                <w:rFonts w:ascii="Calibri" w:hAnsi="Calibri"/>
+                <w:color w:val="425B72"/>
+                <w:sz w:val="19"/>
+              </w:rPr>
+              <w:t xml:space="preserve"> </w:t>
+            </w:r>
+          </w:p>
+          <w:p>
+            <w:pPr>
+              <w:spacing w:after="180"/>
+            </w:pPr>
+            <w:r>
+              <w:rPr>
+                <w:rFonts w:ascii="Calibri" w:hAnsi="Calibri"/>
+                <w:color w:val="425B72"/>
+                <w:sz w:val="19"/>
+              </w:rPr>
+              <w:t xml:space="preserve"> </w:t>
+            </w:r>
+          </w:p>
+        </w:tc>
+      </w:tr>
+    </w:tbl>
+    <w:p>
+      <w:pPr>
+        <w:keepNext/>
+        <w:pageBreakBefore/>
+        <w:spacing w:before="0" w:after="40"/>
+      </w:pPr>
+      <w:r>
+        <w:rPr>
+          <w:rFonts w:ascii="Calibri" w:hAnsi="Calibri"/>
+          <w:b/>
+          <w:color w:val="B18F4D"/>
+          <w:sz w:val="16"/>
+        </w:rPr>
+        <w:t>SECONDARY PAGE REVIEW</w:t>
+      </w:r>
+    </w:p>
+    <w:p>
+      <w:pPr>
+        <w:pStyle w:val="Heading1"/>
+      </w:pPr>
+      <w:r>
         <w:t>Oil &amp; Gas Executives</w:t>
       </w:r>
     </w:p>
@@ -4741,409 +5170,6 @@
                 <w:sz w:val="19"/>
               </w:rPr>
               <w:t>Define the cash flow, investment, family, and legacy decisions after liquidity.</w:t>
-            </w:r>
-          </w:p>
-        </w:tc>
-        <w:tc>
-          <w:tcPr>
-            <w:tcW w:type="dxa" w:w="6986"/>
-            <w:shd w:fill="FFF9ED"/>
-          </w:tcPr>
-          <w:p>
-            <w:pPr>
-              <w:spacing w:after="60"/>
-            </w:pPr>
-            <w:r/>
-          </w:p>
-          <w:p>
-            <w:pPr>
-              <w:spacing w:before="0" w:after="80"/>
-            </w:pPr>
-            <w:r>
-              <w:rPr>
-                <w:rFonts w:ascii="Calibri" w:hAnsi="Calibri"/>
-                <w:b/>
-                <w:color w:val="2D5474"/>
-                <w:sz w:val="15"/>
-              </w:rPr>
-              <w:t>DECISION</w:t>
-            </w:r>
-          </w:p>
-          <w:p>
-            <w:pPr>
-              <w:spacing w:after="100"/>
-            </w:pPr>
-            <w:r>
-              <w:rPr>
-                <w:rFonts w:ascii="Calibri" w:hAnsi="Calibri"/>
-                <w:b/>
-                <w:color w:val="0F2038"/>
-                <w:sz w:val="19"/>
-              </w:rPr>
-              <w:t>Keep  /  Edit  /  Replace</w:t>
-            </w:r>
-          </w:p>
-          <w:p>
-            <w:pPr>
-              <w:spacing w:after="160"/>
-            </w:pPr>
-            <w:r>
-              <w:rPr>
-                <w:rFonts w:ascii="Calibri" w:hAnsi="Calibri"/>
-                <w:i/>
-                <w:color w:val="425B72"/>
-                <w:sz w:val="17"/>
-              </w:rPr>
-              <w:t>Keep, edit, or replace this copy.</w:t>
-            </w:r>
-          </w:p>
-          <w:p>
-            <w:pPr>
-              <w:spacing w:after="80"/>
-            </w:pPr>
-            <w:r>
-              <w:rPr>
-                <w:rFonts w:ascii="Calibri" w:hAnsi="Calibri"/>
-                <w:b/>
-                <w:color w:val="2D5474"/>
-                <w:sz w:val="17"/>
-              </w:rPr>
-              <w:t>Alex's replacement copy or notes:</w:t>
-            </w:r>
-          </w:p>
-          <w:p>
-            <w:pPr>
-              <w:spacing w:after="180"/>
-            </w:pPr>
-            <w:r>
-              <w:rPr>
-                <w:rFonts w:ascii="Calibri" w:hAnsi="Calibri"/>
-                <w:color w:val="425B72"/>
-                <w:sz w:val="19"/>
-              </w:rPr>
-              <w:t xml:space="preserve"> </w:t>
-            </w:r>
-          </w:p>
-          <w:p>
-            <w:pPr>
-              <w:spacing w:after="180"/>
-            </w:pPr>
-            <w:r>
-              <w:rPr>
-                <w:rFonts w:ascii="Calibri" w:hAnsi="Calibri"/>
-                <w:color w:val="425B72"/>
-                <w:sz w:val="19"/>
-              </w:rPr>
-              <w:t xml:space="preserve"> </w:t>
-            </w:r>
-          </w:p>
-        </w:tc>
-      </w:tr>
-    </w:tbl>
-    <w:p>
-      <w:pPr>
-        <w:keepNext/>
-        <w:pageBreakBefore/>
-        <w:spacing w:before="0" w:after="40"/>
-      </w:pPr>
-      <w:r>
-        <w:rPr>
-          <w:rFonts w:ascii="Calibri" w:hAnsi="Calibri"/>
-          <w:b/>
-          <w:color w:val="B18F4D"/>
-          <w:sz w:val="16"/>
-        </w:rPr>
-        <w:t>SECONDARY PAGE REVIEW</w:t>
-      </w:r>
-    </w:p>
-    <w:p>
-      <w:pPr>
-        <w:pStyle w:val="Heading1"/>
-      </w:pPr>
-      <w:r>
-        <w:t>High-Net-Worth Families</w:t>
-      </w:r>
-    </w:p>
-    <w:p>
-      <w:pPr>
-        <w:keepNext/>
-        <w:spacing w:after="160"/>
-      </w:pPr>
-      <w:r>
-        <w:rPr>
-          <w:rFonts w:ascii="Calibri" w:hAnsi="Calibri"/>
-          <w:color w:val="2D5474"/>
-          <w:sz w:val="16"/>
-        </w:rPr>
-        <w:t>https://caebaby.github.io/anchor-review/high-net-worth-families.html</w:t>
-      </w:r>
-    </w:p>
-    <w:tbl>
-      <w:tblPr>
-        <w:tblW w:type="dxa" w:w="13972"/>
-        <w:tblLayout w:type="fixed"/>
-        <w:tblLook w:firstColumn="1" w:firstRow="1" w:lastColumn="0" w:lastRow="0" w:noHBand="0" w:noVBand="1" w:val="04A0"/>
-        <w:tblInd w:w="140" w:type="dxa"/>
-        <w:tblBorders>
-          <w:top w:val="single" w:sz="6" w:space="0" w:color="D5DDE5"/>
-          <w:left w:val="single" w:sz="6" w:space="0" w:color="D5DDE5"/>
-          <w:bottom w:val="single" w:sz="6" w:space="0" w:color="D5DDE5"/>
-          <w:right w:val="single" w:sz="6" w:space="0" w:color="D5DDE5"/>
-          <w:insideH w:val="single" w:sz="6" w:space="0" w:color="D5DDE5"/>
-          <w:insideV w:val="single" w:sz="6" w:space="0" w:color="D5DDE5"/>
-        </w:tblBorders>
-      </w:tblPr>
-      <w:tblGrid>
-        <w:gridCol w:w="6986"/>
-        <w:gridCol w:w="6986"/>
-      </w:tblGrid>
-      <w:tr>
-        <w:trPr>
-          <w:tblHeader w:val="true"/>
-        </w:trPr>
-        <w:tc>
-          <w:tcPr>
-            <w:tcW w:type="dxa" w:w="6986"/>
-            <w:tcMar>
-              <w:top w:w="100" w:type="dxa"/>
-              <w:bottom w:w="100" w:type="dxa"/>
-              <w:start w:w="140" w:type="dxa"/>
-              <w:end w:w="140" w:type="dxa"/>
-            </w:tcMar>
-            <w:vAlign w:val="top"/>
-            <w:shd w:fill="0F2038"/>
-          </w:tcPr>
-          <w:p>
-            <w:pPr>
-              <w:spacing w:after="60"/>
-              <w:jc w:val="left"/>
-            </w:pPr>
-            <w:r/>
-            <w:r>
-              <w:rPr>
-                <w:rFonts w:ascii="Calibri" w:hAnsi="Calibri"/>
-                <w:b/>
-                <w:color w:val="FFFFFF"/>
-                <w:sz w:val="18"/>
-              </w:rPr>
-              <w:t>CURRENT WEBSITE COPY</w:t>
-            </w:r>
-          </w:p>
-        </w:tc>
-        <w:tc>
-          <w:tcPr>
-            <w:tcW w:type="dxa" w:w="6986"/>
-            <w:tcMar>
-              <w:top w:w="100" w:type="dxa"/>
-              <w:bottom w:w="100" w:type="dxa"/>
-              <w:start w:w="140" w:type="dxa"/>
-              <w:end w:w="140" w:type="dxa"/>
-            </w:tcMar>
-            <w:vAlign w:val="top"/>
-            <w:shd w:fill="0F2038"/>
-          </w:tcPr>
-          <w:p>
-            <w:pPr>
-              <w:spacing w:after="60"/>
-              <w:jc w:val="left"/>
-            </w:pPr>
-            <w:r/>
-            <w:r>
-              <w:rPr>
-                <w:rFonts w:ascii="Calibri" w:hAnsi="Calibri"/>
-                <w:b/>
-                <w:color w:val="FFFFFF"/>
-                <w:sz w:val="18"/>
-              </w:rPr>
-              <w:t>ALEX'S VERSION / CHANGES</w:t>
-            </w:r>
-          </w:p>
-        </w:tc>
-      </w:tr>
-      <w:tr>
-        <w:trPr>
-          <w:cantSplit w:val="true"/>
-        </w:trPr>
-        <w:tc>
-          <w:tcPr>
-            <w:tcW w:type="dxa" w:w="6986"/>
-            <w:shd w:fill="FFFFFF"/>
-          </w:tcPr>
-          <w:p>
-            <w:pPr>
-              <w:spacing w:after="60"/>
-            </w:pPr>
-            <w:r/>
-          </w:p>
-          <w:p>
-            <w:pPr>
-              <w:spacing w:before="0" w:after="80"/>
-            </w:pPr>
-            <w:r>
-              <w:rPr>
-                <w:rFonts w:ascii="Calibri" w:hAnsi="Calibri"/>
-                <w:b/>
-                <w:color w:val="B18F4D"/>
-                <w:sz w:val="15"/>
-              </w:rPr>
-              <w:t>SECONDARY COPY</w:t>
-            </w:r>
-          </w:p>
-          <w:p>
-            <w:pPr>
-              <w:spacing w:after="100"/>
-            </w:pPr>
-            <w:r>
-              <w:rPr>
-                <w:rFonts w:ascii="Calibri" w:hAnsi="Calibri"/>
-                <w:b/>
-                <w:color w:val="0F2038"/>
-                <w:sz w:val="21"/>
-              </w:rPr>
-              <w:t>Family page supporting message</w:t>
-            </w:r>
-          </w:p>
-          <w:p>
-            <w:pPr>
-              <w:spacing w:after="80"/>
-            </w:pPr>
-            <w:r>
-              <w:rPr>
-                <w:rFonts w:ascii="Calibri" w:hAnsi="Calibri"/>
-                <w:color w:val="425B72"/>
-                <w:sz w:val="19"/>
-              </w:rPr>
-              <w:t>Keep the plan current across generations.</w:t>
-            </w:r>
-          </w:p>
-          <w:p>
-            <w:pPr>
-              <w:spacing w:after="80"/>
-            </w:pPr>
-            <w:r>
-              <w:rPr>
-                <w:rFonts w:ascii="Calibri" w:hAnsi="Calibri"/>
-                <w:color w:val="425B72"/>
-                <w:sz w:val="19"/>
-              </w:rPr>
-              <w:t>Investments, trusts, beneficiaries, taxes, and family communication should tell the same story.</w:t>
-            </w:r>
-          </w:p>
-          <w:p>
-            <w:pPr>
-              <w:spacing w:after="80"/>
-            </w:pPr>
-            <w:r>
-              <w:rPr>
-                <w:rFonts w:ascii="Calibri" w:hAnsi="Calibri"/>
-                <w:color w:val="425B72"/>
-                <w:sz w:val="19"/>
-              </w:rPr>
-              <w:t>Your wealth changed. Did the plan?</w:t>
-            </w:r>
-          </w:p>
-          <w:p>
-            <w:pPr>
-              <w:spacing w:after="80"/>
-            </w:pPr>
-            <w:r>
-              <w:rPr>
-                <w:rFonts w:ascii="Calibri" w:hAnsi="Calibri"/>
-                <w:color w:val="425B72"/>
-                <w:sz w:val="19"/>
-              </w:rPr>
-              <w:t>Estate documents can remain untouched while assets, businesses, relationships, tax rules, and family priorities change around them. A signed document is not the same as an implemented plan.</w:t>
-            </w:r>
-          </w:p>
-          <w:p>
-            <w:pPr>
-              <w:spacing w:after="80"/>
-            </w:pPr>
-            <w:r>
-              <w:rPr>
-                <w:rFonts w:ascii="Calibri" w:hAnsi="Calibri"/>
-                <w:color w:val="425B72"/>
-                <w:sz w:val="19"/>
-              </w:rPr>
-              <w:t>Anchor keeps the estate attorney, CPA, investment plan, account ownership, and beneficiary choices connected—and helps the family understand what the structure is designed to accomplish.</w:t>
-            </w:r>
-          </w:p>
-          <w:p>
-            <w:pPr>
-              <w:spacing w:after="80"/>
-            </w:pPr>
-            <w:r>
-              <w:rPr>
-                <w:rFonts w:ascii="Calibri" w:hAnsi="Calibri"/>
-                <w:color w:val="425B72"/>
-                <w:sz w:val="19"/>
-              </w:rPr>
-              <w:t>Review what exists</w:t>
-            </w:r>
-          </w:p>
-          <w:p>
-            <w:pPr>
-              <w:spacing w:after="80"/>
-            </w:pPr>
-            <w:r>
-              <w:rPr>
-                <w:rFonts w:ascii="Calibri" w:hAnsi="Calibri"/>
-                <w:color w:val="425B72"/>
-                <w:sz w:val="19"/>
-              </w:rPr>
-              <w:t>Compare current documents and beneficiaries with the family’s actual assets and intentions.</w:t>
-            </w:r>
-          </w:p>
-          <w:p>
-            <w:pPr>
-              <w:spacing w:after="80"/>
-            </w:pPr>
-            <w:r>
-              <w:rPr>
-                <w:rFonts w:ascii="Calibri" w:hAnsi="Calibri"/>
-                <w:color w:val="425B72"/>
-                <w:sz w:val="19"/>
-              </w:rPr>
-              <w:t>Close implementation gaps</w:t>
-            </w:r>
-          </w:p>
-          <w:p>
-            <w:pPr>
-              <w:spacing w:after="80"/>
-            </w:pPr>
-            <w:r>
-              <w:rPr>
-                <w:rFonts w:ascii="Calibri" w:hAnsi="Calibri"/>
-                <w:color w:val="425B72"/>
-                <w:sz w:val="19"/>
-              </w:rPr>
-              <w:t>Coordinate account ownership, trust funding, investment policy, and professional follow-through.</w:t>
-            </w:r>
-          </w:p>
-          <w:p>
-            <w:pPr>
-              <w:spacing w:after="80"/>
-            </w:pPr>
-            <w:r>
-              <w:rPr>
-                <w:rFonts w:ascii="Calibri" w:hAnsi="Calibri"/>
-                <w:color w:val="425B72"/>
-                <w:sz w:val="19"/>
-              </w:rPr>
-              <w:t>Prepare the family</w:t>
-            </w:r>
-          </w:p>
-          <w:p>
-            <w:pPr>
-              <w:spacing w:after="80"/>
-            </w:pPr>
-            <w:r>
-              <w:rPr>
-                <w:rFonts w:ascii="Calibri" w:hAnsi="Calibri"/>
-                <w:color w:val="425B72"/>
-                <w:sz w:val="19"/>
-              </w:rPr>
-              <w:t>Create an understandable plan and a thoughtful communication rhythm for the next generation.</w:t>
             </w:r>
           </w:p>
         </w:tc>

</xml_diff>